<commit_message>
Adding the spring boot notes about transactions and delete records
</commit_message>
<xml_diff>
--- a/Spring-Boot/Part-01/Spring-Boot-Notes-03.docx
+++ b/Spring-Boot/Part-01/Spring-Boot-Notes-03.docx
@@ -325,6 +325,7 @@
         </w:rPr>
         <w:t>    @</w:t>
       </w:r>
+      <w:proofErr w:type="gramStart"/>
       <w:r>
         <w:rPr>
           <w:rFonts w:ascii="Consolas" w:eastAsia="Times New Roman" w:hAnsi="Consolas" w:cs="Times New Roman"/>
@@ -347,6 +348,7 @@
         </w:rPr>
         <w:t>(</w:t>
       </w:r>
+      <w:proofErr w:type="gramEnd"/>
       <w:r>
         <w:rPr>
           <w:rFonts w:ascii="Consolas" w:eastAsia="Times New Roman" w:hAnsi="Consolas" w:cs="Times New Roman"/>
@@ -460,6 +462,7 @@
         </w:rPr>
         <w:t>    @</w:t>
       </w:r>
+      <w:proofErr w:type="gramStart"/>
       <w:r>
         <w:rPr>
           <w:rFonts w:ascii="Consolas" w:eastAsia="Times New Roman" w:hAnsi="Consolas" w:cs="Times New Roman"/>
@@ -482,6 +485,7 @@
         </w:rPr>
         <w:t>(</w:t>
       </w:r>
+      <w:proofErr w:type="gramEnd"/>
       <w:r>
         <w:rPr>
           <w:rFonts w:ascii="Consolas" w:eastAsia="Times New Roman" w:hAnsi="Consolas" w:cs="Times New Roman"/>
@@ -661,6 +665,7 @@
         </w:rPr>
         <w:t xml:space="preserve"> </w:t>
       </w:r>
+      <w:proofErr w:type="gramStart"/>
       <w:r>
         <w:rPr>
           <w:rFonts w:ascii="Consolas" w:eastAsia="Times New Roman" w:hAnsi="Consolas" w:cs="Times New Roman"/>
@@ -672,6 +677,7 @@
         </w:rPr>
         <w:t>Long</w:t>
       </w:r>
+      <w:proofErr w:type="gramEnd"/>
       <w:r>
         <w:rPr>
           <w:rFonts w:ascii="Consolas" w:eastAsia="Times New Roman" w:hAnsi="Consolas" w:cs="Times New Roman"/>
@@ -730,6 +736,7 @@
         </w:rPr>
         <w:t>    @</w:t>
       </w:r>
+      <w:proofErr w:type="gramStart"/>
       <w:r>
         <w:rPr>
           <w:rFonts w:ascii="Consolas" w:eastAsia="Times New Roman" w:hAnsi="Consolas" w:cs="Times New Roman"/>
@@ -752,6 +759,7 @@
         </w:rPr>
         <w:t>(</w:t>
       </w:r>
+      <w:proofErr w:type="gramEnd"/>
       <w:r>
         <w:rPr>
           <w:rFonts w:ascii="Consolas" w:eastAsia="Times New Roman" w:hAnsi="Consolas" w:cs="Times New Roman"/>
@@ -1000,6 +1008,7 @@
         </w:rPr>
         <w:t>    @</w:t>
       </w:r>
+      <w:proofErr w:type="gramStart"/>
       <w:r>
         <w:rPr>
           <w:rFonts w:ascii="Consolas" w:eastAsia="Times New Roman" w:hAnsi="Consolas" w:cs="Times New Roman"/>
@@ -1022,6 +1031,7 @@
         </w:rPr>
         <w:t>(</w:t>
       </w:r>
+      <w:proofErr w:type="gramEnd"/>
       <w:r>
         <w:rPr>
           <w:rFonts w:ascii="Consolas" w:eastAsia="Times New Roman" w:hAnsi="Consolas" w:cs="Times New Roman"/>
@@ -1270,6 +1280,7 @@
         </w:rPr>
         <w:t>    @</w:t>
       </w:r>
+      <w:proofErr w:type="gramStart"/>
       <w:r>
         <w:rPr>
           <w:rFonts w:ascii="Consolas" w:eastAsia="Times New Roman" w:hAnsi="Consolas" w:cs="Times New Roman"/>
@@ -1292,6 +1303,7 @@
         </w:rPr>
         <w:t>(</w:t>
       </w:r>
+      <w:proofErr w:type="gramEnd"/>
       <w:r>
         <w:rPr>
           <w:rFonts w:ascii="Consolas" w:eastAsia="Times New Roman" w:hAnsi="Consolas" w:cs="Times New Roman"/>
@@ -1540,6 +1552,7 @@
         </w:rPr>
         <w:t>    @</w:t>
       </w:r>
+      <w:proofErr w:type="gramStart"/>
       <w:r>
         <w:rPr>
           <w:rFonts w:ascii="Consolas" w:eastAsia="Times New Roman" w:hAnsi="Consolas" w:cs="Times New Roman"/>
@@ -1562,6 +1575,7 @@
         </w:rPr>
         <w:t>(</w:t>
       </w:r>
+      <w:proofErr w:type="gramEnd"/>
       <w:r>
         <w:rPr>
           <w:rFonts w:ascii="Consolas" w:eastAsia="Times New Roman" w:hAnsi="Consolas" w:cs="Times New Roman"/>
@@ -1868,6 +1882,7 @@
         </w:rPr>
         <w:t>    @</w:t>
       </w:r>
+      <w:proofErr w:type="gramStart"/>
       <w:r>
         <w:rPr>
           <w:rFonts w:ascii="Consolas" w:eastAsia="Times New Roman" w:hAnsi="Consolas" w:cs="Times New Roman"/>
@@ -1890,6 +1905,7 @@
         </w:rPr>
         <w:t>(</w:t>
       </w:r>
+      <w:proofErr w:type="gramEnd"/>
       <w:r>
         <w:rPr>
           <w:rFonts w:ascii="Consolas" w:eastAsia="Times New Roman" w:hAnsi="Consolas" w:cs="Times New Roman"/>
@@ -2003,6 +2019,7 @@
         </w:rPr>
         <w:t>    @</w:t>
       </w:r>
+      <w:proofErr w:type="gramStart"/>
       <w:r>
         <w:rPr>
           <w:rFonts w:ascii="Consolas" w:eastAsia="Times New Roman" w:hAnsi="Consolas" w:cs="Times New Roman"/>
@@ -2025,6 +2042,7 @@
         </w:rPr>
         <w:t>(</w:t>
       </w:r>
+      <w:proofErr w:type="gramEnd"/>
       <w:r>
         <w:rPr>
           <w:rFonts w:ascii="Consolas" w:eastAsia="Times New Roman" w:hAnsi="Consolas" w:cs="Times New Roman"/>
@@ -2254,6 +2272,7 @@
         </w:rPr>
         <w:t xml:space="preserve"> </w:t>
       </w:r>
+      <w:proofErr w:type="spellStart"/>
       <w:r>
         <w:rPr>
           <w:rFonts w:ascii="Consolas" w:eastAsia="Times New Roman" w:hAnsi="Consolas" w:cs="Times New Roman"/>
@@ -2265,6 +2284,7 @@
         </w:rPr>
         <w:t>user</w:t>
       </w:r>
+      <w:proofErr w:type="spellEnd"/>
       <w:r>
         <w:rPr>
           <w:rFonts w:ascii="Consolas" w:eastAsia="Times New Roman" w:hAnsi="Consolas" w:cs="Times New Roman"/>
@@ -2612,6 +2632,7 @@
         </w:rPr>
         <w:t>@</w:t>
       </w:r>
+      <w:proofErr w:type="gramStart"/>
       <w:r>
         <w:rPr>
           <w:rFonts w:ascii="Consolas" w:eastAsia="Times New Roman" w:hAnsi="Consolas" w:cs="Times New Roman"/>
@@ -2634,6 +2655,7 @@
         </w:rPr>
         <w:t>(</w:t>
       </w:r>
+      <w:proofErr w:type="gramEnd"/>
       <w:r>
         <w:rPr>
           <w:rFonts w:ascii="Consolas" w:eastAsia="Times New Roman" w:hAnsi="Consolas" w:cs="Times New Roman"/>
@@ -2894,7 +2916,31 @@
           <w:szCs w:val="21"/>
           <w14:ligatures w14:val="none"/>
         </w:rPr>
-        <w:t>// private final List&lt;Address&gt; addresses = new ArrayList&lt;&gt;();</w:t>
+        <w:t>// private final List&lt;Address&gt; addresses = new ArrayList&lt;</w:t>
+      </w:r>
+      <w:proofErr w:type="gramStart"/>
+      <w:r>
+        <w:rPr>
+          <w:rFonts w:ascii="Consolas" w:eastAsia="Times New Roman" w:hAnsi="Consolas" w:cs="Times New Roman"/>
+          <w:color w:val="008000"/>
+          <w:kern w:val="0"/>
+          <w:sz w:val="21"/>
+          <w:szCs w:val="21"/>
+          <w14:ligatures w14:val="none"/>
+        </w:rPr>
+        <w:t>&gt;(</w:t>
+      </w:r>
+      <w:proofErr w:type="gramEnd"/>
+      <w:r>
+        <w:rPr>
+          <w:rFonts w:ascii="Consolas" w:eastAsia="Times New Roman" w:hAnsi="Consolas" w:cs="Times New Roman"/>
+          <w:color w:val="008000"/>
+          <w:kern w:val="0"/>
+          <w:sz w:val="21"/>
+          <w:szCs w:val="21"/>
+          <w14:ligatures w14:val="none"/>
+        </w:rPr>
+        <w:t>);</w:t>
       </w:r>
     </w:p>
     <w:p>
@@ -3062,7 +3108,31 @@
           <w:szCs w:val="21"/>
           <w14:ligatures w14:val="none"/>
         </w:rPr>
-        <w:t>&lt;&gt;();</w:t>
+        <w:t>&lt;</w:t>
+      </w:r>
+      <w:proofErr w:type="gramStart"/>
+      <w:r>
+        <w:rPr>
+          <w:rFonts w:ascii="Consolas" w:eastAsia="Times New Roman" w:hAnsi="Consolas" w:cs="Times New Roman"/>
+          <w:color w:val="3B3B3B"/>
+          <w:kern w:val="0"/>
+          <w:sz w:val="21"/>
+          <w:szCs w:val="21"/>
+          <w14:ligatures w14:val="none"/>
+        </w:rPr>
+        <w:t>&gt;(</w:t>
+      </w:r>
+      <w:proofErr w:type="gramEnd"/>
+      <w:r>
+        <w:rPr>
+          <w:rFonts w:ascii="Consolas" w:eastAsia="Times New Roman" w:hAnsi="Consolas" w:cs="Times New Roman"/>
+          <w:color w:val="3B3B3B"/>
+          <w:kern w:val="0"/>
+          <w:sz w:val="21"/>
+          <w:szCs w:val="21"/>
+          <w14:ligatures w14:val="none"/>
+        </w:rPr>
+        <w:t>);</w:t>
       </w:r>
     </w:p>
     <w:p>
@@ -3081,6 +3151,2343 @@
           <w:szCs w:val="28"/>
         </w:rPr>
       </w:pPr>
+      <w:r>
+        <w:rPr>
+          <w:rFonts w:ascii="Sakkal Majalla" w:hAnsi="Sakkal Majalla" w:cs="Sakkal Majalla"/>
+          <w:sz w:val="28"/>
+          <w:szCs w:val="28"/>
+        </w:rPr>
+        <w:t>When trying to save, delete, or update the related entities, we should consider using cascade into account:</w:t>
+      </w:r>
+    </w:p>
+    <w:p>
+      <w:pPr>
+        <w:rPr>
+          <w:rFonts w:ascii="Sakkal Majalla" w:hAnsi="Sakkal Majalla" w:cs="Sakkal Majalla"/>
+          <w:sz w:val="28"/>
+          <w:szCs w:val="28"/>
+        </w:rPr>
+      </w:pPr>
+      <w:r>
+        <w:rPr>
+          <w:rFonts w:ascii="Sakkal Majalla" w:hAnsi="Sakkal Majalla" w:cs="Sakkal Majalla"/>
+          <w:sz w:val="28"/>
+          <w:szCs w:val="28"/>
+        </w:rPr>
+        <w:t xml:space="preserve">Note: also, we have </w:t>
+      </w:r>
+      <w:r>
+        <w:rPr>
+          <w:rFonts w:ascii="Sakkal Majalla" w:hAnsi="Sakkal Majalla" w:cs="Sakkal Majalla"/>
+          <w:sz w:val="28"/>
+          <w:szCs w:val="28"/>
+        </w:rPr>
+        <w:t>other options</w:t>
+      </w:r>
+      <w:r>
+        <w:rPr>
+          <w:rFonts w:ascii="Sakkal Majalla" w:hAnsi="Sakkal Majalla" w:cs="Sakkal Majalla"/>
+          <w:sz w:val="28"/>
+          <w:szCs w:val="28"/>
+        </w:rPr>
+        <w:t xml:space="preserve"> for </w:t>
+      </w:r>
+      <w:r>
+        <w:rPr>
+          <w:rFonts w:ascii="Sakkal Majalla" w:hAnsi="Sakkal Majalla" w:cs="Sakkal Majalla"/>
+          <w:b/>
+          <w:bCs/>
+          <w:color w:val="C00000"/>
+          <w:sz w:val="28"/>
+          <w:szCs w:val="28"/>
+        </w:rPr>
+        <w:t>cascade</w:t>
+      </w:r>
+      <w:r>
+        <w:rPr>
+          <w:rFonts w:ascii="Sakkal Majalla" w:hAnsi="Sakkal Majalla" w:cs="Sakkal Majalla"/>
+          <w:sz w:val="28"/>
+          <w:szCs w:val="28"/>
+        </w:rPr>
+        <w:t>.</w:t>
+      </w:r>
+    </w:p>
+    <w:p>
+      <w:pPr>
+        <w:shd w:val="clear" w:color="auto" w:fill="FFFFFF"/>
+        <w:spacing w:after="0" w:line="285" w:lineRule="atLeast"/>
+        <w:rPr>
+          <w:rFonts w:ascii="Consolas" w:eastAsia="Times New Roman" w:hAnsi="Consolas" w:cs="Times New Roman"/>
+          <w:color w:val="3B3B3B"/>
+          <w:kern w:val="0"/>
+          <w:sz w:val="21"/>
+          <w:szCs w:val="21"/>
+          <w14:ligatures w14:val="none"/>
+        </w:rPr>
+      </w:pPr>
+      <w:r>
+        <w:rPr>
+          <w:rFonts w:ascii="Consolas" w:eastAsia="Times New Roman" w:hAnsi="Consolas" w:cs="Times New Roman"/>
+          <w:color w:val="3B3B3B"/>
+          <w:kern w:val="0"/>
+          <w:sz w:val="21"/>
+          <w:szCs w:val="21"/>
+          <w14:ligatures w14:val="none"/>
+        </w:rPr>
+        <w:t>@</w:t>
+      </w:r>
+      <w:proofErr w:type="gramStart"/>
+      <w:r>
+        <w:rPr>
+          <w:rFonts w:ascii="Consolas" w:eastAsia="Times New Roman" w:hAnsi="Consolas" w:cs="Times New Roman"/>
+          <w:color w:val="267F99"/>
+          <w:kern w:val="0"/>
+          <w:sz w:val="21"/>
+          <w:szCs w:val="21"/>
+          <w14:ligatures w14:val="none"/>
+        </w:rPr>
+        <w:t>ManyToMany</w:t>
+      </w:r>
+      <w:r>
+        <w:rPr>
+          <w:rFonts w:ascii="Consolas" w:eastAsia="Times New Roman" w:hAnsi="Consolas" w:cs="Times New Roman"/>
+          <w:color w:val="3B3B3B"/>
+          <w:kern w:val="0"/>
+          <w:sz w:val="21"/>
+          <w:szCs w:val="21"/>
+          <w14:ligatures w14:val="none"/>
+        </w:rPr>
+        <w:t>(</w:t>
+      </w:r>
+      <w:proofErr w:type="gramEnd"/>
+      <w:r>
+        <w:rPr>
+          <w:rFonts w:ascii="Consolas" w:eastAsia="Times New Roman" w:hAnsi="Consolas" w:cs="Times New Roman"/>
+          <w:color w:val="795E26"/>
+          <w:kern w:val="0"/>
+          <w:sz w:val="21"/>
+          <w:szCs w:val="21"/>
+          <w14:ligatures w14:val="none"/>
+        </w:rPr>
+        <w:t>cascade</w:t>
+      </w:r>
+      <w:r>
+        <w:rPr>
+          <w:rFonts w:ascii="Consolas" w:eastAsia="Times New Roman" w:hAnsi="Consolas" w:cs="Times New Roman"/>
+          <w:color w:val="3B3B3B"/>
+          <w:kern w:val="0"/>
+          <w:sz w:val="21"/>
+          <w:szCs w:val="21"/>
+          <w14:ligatures w14:val="none"/>
+        </w:rPr>
+        <w:t xml:space="preserve"> </w:t>
+      </w:r>
+      <w:r>
+        <w:rPr>
+          <w:rFonts w:ascii="Consolas" w:eastAsia="Times New Roman" w:hAnsi="Consolas" w:cs="Times New Roman"/>
+          <w:color w:val="000000"/>
+          <w:kern w:val="0"/>
+          <w:sz w:val="21"/>
+          <w:szCs w:val="21"/>
+          <w14:ligatures w14:val="none"/>
+        </w:rPr>
+        <w:t>=</w:t>
+      </w:r>
+      <w:r>
+        <w:rPr>
+          <w:rFonts w:ascii="Consolas" w:eastAsia="Times New Roman" w:hAnsi="Consolas" w:cs="Times New Roman"/>
+          <w:color w:val="3B3B3B"/>
+          <w:kern w:val="0"/>
+          <w:sz w:val="21"/>
+          <w:szCs w:val="21"/>
+          <w14:ligatures w14:val="none"/>
+        </w:rPr>
+        <w:t xml:space="preserve"> {</w:t>
+      </w:r>
+      <w:r>
+        <w:rPr>
+          <w:rFonts w:ascii="Consolas" w:eastAsia="Times New Roman" w:hAnsi="Consolas" w:cs="Times New Roman"/>
+          <w:color w:val="267F99"/>
+          <w:kern w:val="0"/>
+          <w:sz w:val="21"/>
+          <w:szCs w:val="21"/>
+          <w14:ligatures w14:val="none"/>
+        </w:rPr>
+        <w:t>CascadeType</w:t>
+      </w:r>
+      <w:r>
+        <w:rPr>
+          <w:rFonts w:ascii="Consolas" w:eastAsia="Times New Roman" w:hAnsi="Consolas" w:cs="Times New Roman"/>
+          <w:color w:val="3B3B3B"/>
+          <w:kern w:val="0"/>
+          <w:sz w:val="21"/>
+          <w:szCs w:val="21"/>
+          <w14:ligatures w14:val="none"/>
+        </w:rPr>
+        <w:t>.</w:t>
+      </w:r>
+      <w:r>
+        <w:rPr>
+          <w:rFonts w:ascii="Consolas" w:eastAsia="Times New Roman" w:hAnsi="Consolas" w:cs="Times New Roman"/>
+          <w:color w:val="0070C1"/>
+          <w:kern w:val="0"/>
+          <w:sz w:val="21"/>
+          <w:szCs w:val="21"/>
+          <w14:ligatures w14:val="none"/>
+        </w:rPr>
+        <w:t>PERSIST</w:t>
+      </w:r>
+      <w:r>
+        <w:rPr>
+          <w:rFonts w:ascii="Consolas" w:eastAsia="Times New Roman" w:hAnsi="Consolas" w:cs="Times New Roman"/>
+          <w:color w:val="3B3B3B"/>
+          <w:kern w:val="0"/>
+          <w:sz w:val="21"/>
+          <w:szCs w:val="21"/>
+          <w14:ligatures w14:val="none"/>
+        </w:rPr>
+        <w:t xml:space="preserve">, </w:t>
+      </w:r>
+      <w:r>
+        <w:rPr>
+          <w:rFonts w:ascii="Consolas" w:eastAsia="Times New Roman" w:hAnsi="Consolas" w:cs="Times New Roman"/>
+          <w:color w:val="267F99"/>
+          <w:kern w:val="0"/>
+          <w:sz w:val="21"/>
+          <w:szCs w:val="21"/>
+          <w14:ligatures w14:val="none"/>
+        </w:rPr>
+        <w:t>CascadeType</w:t>
+      </w:r>
+      <w:r>
+        <w:rPr>
+          <w:rFonts w:ascii="Consolas" w:eastAsia="Times New Roman" w:hAnsi="Consolas" w:cs="Times New Roman"/>
+          <w:color w:val="3B3B3B"/>
+          <w:kern w:val="0"/>
+          <w:sz w:val="21"/>
+          <w:szCs w:val="21"/>
+          <w14:ligatures w14:val="none"/>
+        </w:rPr>
+        <w:t>.</w:t>
+      </w:r>
+      <w:r>
+        <w:rPr>
+          <w:rFonts w:ascii="Consolas" w:eastAsia="Times New Roman" w:hAnsi="Consolas" w:cs="Times New Roman"/>
+          <w:color w:val="0070C1"/>
+          <w:kern w:val="0"/>
+          <w:sz w:val="21"/>
+          <w:szCs w:val="21"/>
+          <w14:ligatures w14:val="none"/>
+        </w:rPr>
+        <w:t>MERGE</w:t>
+      </w:r>
+      <w:r>
+        <w:rPr>
+          <w:rFonts w:ascii="Consolas" w:eastAsia="Times New Roman" w:hAnsi="Consolas" w:cs="Times New Roman"/>
+          <w:color w:val="3B3B3B"/>
+          <w:kern w:val="0"/>
+          <w:sz w:val="21"/>
+          <w:szCs w:val="21"/>
+          <w14:ligatures w14:val="none"/>
+        </w:rPr>
+        <w:t>})</w:t>
+      </w:r>
+    </w:p>
+    <w:p>
+      <w:pPr>
+        <w:shd w:val="clear" w:color="auto" w:fill="FFFFFF"/>
+        <w:spacing w:after="0" w:line="285" w:lineRule="atLeast"/>
+        <w:rPr>
+          <w:rFonts w:ascii="Consolas" w:eastAsia="Times New Roman" w:hAnsi="Consolas" w:cs="Times New Roman"/>
+          <w:color w:val="3B3B3B"/>
+          <w:kern w:val="0"/>
+          <w:sz w:val="21"/>
+          <w:szCs w:val="21"/>
+          <w14:ligatures w14:val="none"/>
+        </w:rPr>
+      </w:pPr>
+      <w:r>
+        <w:rPr>
+          <w:rFonts w:ascii="Consolas" w:eastAsia="Times New Roman" w:hAnsi="Consolas" w:cs="Times New Roman"/>
+          <w:color w:val="3B3B3B"/>
+          <w:kern w:val="0"/>
+          <w:sz w:val="21"/>
+          <w:szCs w:val="21"/>
+          <w14:ligatures w14:val="none"/>
+        </w:rPr>
+        <w:t>    @</w:t>
+      </w:r>
+      <w:proofErr w:type="gramStart"/>
+      <w:r>
+        <w:rPr>
+          <w:rFonts w:ascii="Consolas" w:eastAsia="Times New Roman" w:hAnsi="Consolas" w:cs="Times New Roman"/>
+          <w:color w:val="267F99"/>
+          <w:kern w:val="0"/>
+          <w:sz w:val="21"/>
+          <w:szCs w:val="21"/>
+          <w14:ligatures w14:val="none"/>
+        </w:rPr>
+        <w:t>JoinTable</w:t>
+      </w:r>
+      <w:r>
+        <w:rPr>
+          <w:rFonts w:ascii="Consolas" w:eastAsia="Times New Roman" w:hAnsi="Consolas" w:cs="Times New Roman"/>
+          <w:color w:val="3B3B3B"/>
+          <w:kern w:val="0"/>
+          <w:sz w:val="21"/>
+          <w:szCs w:val="21"/>
+          <w14:ligatures w14:val="none"/>
+        </w:rPr>
+        <w:t>(</w:t>
+      </w:r>
+      <w:proofErr w:type="gramEnd"/>
+    </w:p>
+    <w:p>
+      <w:pPr>
+        <w:shd w:val="clear" w:color="auto" w:fill="FFFFFF"/>
+        <w:spacing w:after="0" w:line="285" w:lineRule="atLeast"/>
+        <w:rPr>
+          <w:rFonts w:ascii="Consolas" w:eastAsia="Times New Roman" w:hAnsi="Consolas" w:cs="Times New Roman"/>
+          <w:color w:val="3B3B3B"/>
+          <w:kern w:val="0"/>
+          <w:sz w:val="21"/>
+          <w:szCs w:val="21"/>
+          <w14:ligatures w14:val="none"/>
+        </w:rPr>
+      </w:pPr>
+      <w:r>
+        <w:rPr>
+          <w:rFonts w:ascii="Consolas" w:eastAsia="Times New Roman" w:hAnsi="Consolas" w:cs="Times New Roman"/>
+          <w:color w:val="3B3B3B"/>
+          <w:kern w:val="0"/>
+          <w:sz w:val="21"/>
+          <w:szCs w:val="21"/>
+          <w14:ligatures w14:val="none"/>
+        </w:rPr>
+        <w:t xml:space="preserve">        </w:t>
+      </w:r>
+      <w:r>
+        <w:rPr>
+          <w:rFonts w:ascii="Consolas" w:eastAsia="Times New Roman" w:hAnsi="Consolas" w:cs="Times New Roman"/>
+          <w:color w:val="795E26"/>
+          <w:kern w:val="0"/>
+          <w:sz w:val="21"/>
+          <w:szCs w:val="21"/>
+          <w14:ligatures w14:val="none"/>
+        </w:rPr>
+        <w:t>name</w:t>
+      </w:r>
+      <w:r>
+        <w:rPr>
+          <w:rFonts w:ascii="Consolas" w:eastAsia="Times New Roman" w:hAnsi="Consolas" w:cs="Times New Roman"/>
+          <w:color w:val="3B3B3B"/>
+          <w:kern w:val="0"/>
+          <w:sz w:val="21"/>
+          <w:szCs w:val="21"/>
+          <w14:ligatures w14:val="none"/>
+        </w:rPr>
+        <w:t xml:space="preserve"> </w:t>
+      </w:r>
+      <w:r>
+        <w:rPr>
+          <w:rFonts w:ascii="Consolas" w:eastAsia="Times New Roman" w:hAnsi="Consolas" w:cs="Times New Roman"/>
+          <w:color w:val="000000"/>
+          <w:kern w:val="0"/>
+          <w:sz w:val="21"/>
+          <w:szCs w:val="21"/>
+          <w14:ligatures w14:val="none"/>
+        </w:rPr>
+        <w:t>=</w:t>
+      </w:r>
+      <w:r>
+        <w:rPr>
+          <w:rFonts w:ascii="Consolas" w:eastAsia="Times New Roman" w:hAnsi="Consolas" w:cs="Times New Roman"/>
+          <w:color w:val="3B3B3B"/>
+          <w:kern w:val="0"/>
+          <w:sz w:val="21"/>
+          <w:szCs w:val="21"/>
+          <w14:ligatures w14:val="none"/>
+        </w:rPr>
+        <w:t xml:space="preserve"> </w:t>
+      </w:r>
+      <w:r>
+        <w:rPr>
+          <w:rFonts w:ascii="Consolas" w:eastAsia="Times New Roman" w:hAnsi="Consolas" w:cs="Times New Roman"/>
+          <w:color w:val="A31515"/>
+          <w:kern w:val="0"/>
+          <w:sz w:val="21"/>
+          <w:szCs w:val="21"/>
+          <w14:ligatures w14:val="none"/>
+        </w:rPr>
+        <w:t>"wishlist"</w:t>
+      </w:r>
+      <w:r>
+        <w:rPr>
+          <w:rFonts w:ascii="Consolas" w:eastAsia="Times New Roman" w:hAnsi="Consolas" w:cs="Times New Roman"/>
+          <w:color w:val="3B3B3B"/>
+          <w:kern w:val="0"/>
+          <w:sz w:val="21"/>
+          <w:szCs w:val="21"/>
+          <w14:ligatures w14:val="none"/>
+        </w:rPr>
+        <w:t>,</w:t>
+      </w:r>
+    </w:p>
+    <w:p>
+      <w:pPr>
+        <w:shd w:val="clear" w:color="auto" w:fill="FFFFFF"/>
+        <w:spacing w:after="0" w:line="285" w:lineRule="atLeast"/>
+        <w:rPr>
+          <w:rFonts w:ascii="Consolas" w:eastAsia="Times New Roman" w:hAnsi="Consolas" w:cs="Times New Roman"/>
+          <w:color w:val="3B3B3B"/>
+          <w:kern w:val="0"/>
+          <w:sz w:val="21"/>
+          <w:szCs w:val="21"/>
+          <w14:ligatures w14:val="none"/>
+        </w:rPr>
+      </w:pPr>
+      <w:r>
+        <w:rPr>
+          <w:rFonts w:ascii="Consolas" w:eastAsia="Times New Roman" w:hAnsi="Consolas" w:cs="Times New Roman"/>
+          <w:color w:val="3B3B3B"/>
+          <w:kern w:val="0"/>
+          <w:sz w:val="21"/>
+          <w:szCs w:val="21"/>
+          <w14:ligatures w14:val="none"/>
+        </w:rPr>
+        <w:t xml:space="preserve">        </w:t>
+      </w:r>
+      <w:r>
+        <w:rPr>
+          <w:rFonts w:ascii="Consolas" w:eastAsia="Times New Roman" w:hAnsi="Consolas" w:cs="Times New Roman"/>
+          <w:color w:val="795E26"/>
+          <w:kern w:val="0"/>
+          <w:sz w:val="21"/>
+          <w:szCs w:val="21"/>
+          <w14:ligatures w14:val="none"/>
+        </w:rPr>
+        <w:t>joinColumns</w:t>
+      </w:r>
+      <w:r>
+        <w:rPr>
+          <w:rFonts w:ascii="Consolas" w:eastAsia="Times New Roman" w:hAnsi="Consolas" w:cs="Times New Roman"/>
+          <w:color w:val="3B3B3B"/>
+          <w:kern w:val="0"/>
+          <w:sz w:val="21"/>
+          <w:szCs w:val="21"/>
+          <w14:ligatures w14:val="none"/>
+        </w:rPr>
+        <w:t xml:space="preserve"> </w:t>
+      </w:r>
+      <w:r>
+        <w:rPr>
+          <w:rFonts w:ascii="Consolas" w:eastAsia="Times New Roman" w:hAnsi="Consolas" w:cs="Times New Roman"/>
+          <w:color w:val="000000"/>
+          <w:kern w:val="0"/>
+          <w:sz w:val="21"/>
+          <w:szCs w:val="21"/>
+          <w14:ligatures w14:val="none"/>
+        </w:rPr>
+        <w:t>=</w:t>
+      </w:r>
+      <w:r>
+        <w:rPr>
+          <w:rFonts w:ascii="Consolas" w:eastAsia="Times New Roman" w:hAnsi="Consolas" w:cs="Times New Roman"/>
+          <w:color w:val="3B3B3B"/>
+          <w:kern w:val="0"/>
+          <w:sz w:val="21"/>
+          <w:szCs w:val="21"/>
+          <w14:ligatures w14:val="none"/>
+        </w:rPr>
+        <w:t xml:space="preserve"> @</w:t>
+      </w:r>
+      <w:proofErr w:type="gramStart"/>
+      <w:r>
+        <w:rPr>
+          <w:rFonts w:ascii="Consolas" w:eastAsia="Times New Roman" w:hAnsi="Consolas" w:cs="Times New Roman"/>
+          <w:color w:val="267F99"/>
+          <w:kern w:val="0"/>
+          <w:sz w:val="21"/>
+          <w:szCs w:val="21"/>
+          <w14:ligatures w14:val="none"/>
+        </w:rPr>
+        <w:t>JoinColumn</w:t>
+      </w:r>
+      <w:r>
+        <w:rPr>
+          <w:rFonts w:ascii="Consolas" w:eastAsia="Times New Roman" w:hAnsi="Consolas" w:cs="Times New Roman"/>
+          <w:color w:val="3B3B3B"/>
+          <w:kern w:val="0"/>
+          <w:sz w:val="21"/>
+          <w:szCs w:val="21"/>
+          <w14:ligatures w14:val="none"/>
+        </w:rPr>
+        <w:t>(</w:t>
+      </w:r>
+      <w:proofErr w:type="gramEnd"/>
+      <w:r>
+        <w:rPr>
+          <w:rFonts w:ascii="Consolas" w:eastAsia="Times New Roman" w:hAnsi="Consolas" w:cs="Times New Roman"/>
+          <w:color w:val="795E26"/>
+          <w:kern w:val="0"/>
+          <w:sz w:val="21"/>
+          <w:szCs w:val="21"/>
+          <w14:ligatures w14:val="none"/>
+        </w:rPr>
+        <w:t>name</w:t>
+      </w:r>
+      <w:r>
+        <w:rPr>
+          <w:rFonts w:ascii="Consolas" w:eastAsia="Times New Roman" w:hAnsi="Consolas" w:cs="Times New Roman"/>
+          <w:color w:val="3B3B3B"/>
+          <w:kern w:val="0"/>
+          <w:sz w:val="21"/>
+          <w:szCs w:val="21"/>
+          <w14:ligatures w14:val="none"/>
+        </w:rPr>
+        <w:t xml:space="preserve"> </w:t>
+      </w:r>
+      <w:r>
+        <w:rPr>
+          <w:rFonts w:ascii="Consolas" w:eastAsia="Times New Roman" w:hAnsi="Consolas" w:cs="Times New Roman"/>
+          <w:color w:val="000000"/>
+          <w:kern w:val="0"/>
+          <w:sz w:val="21"/>
+          <w:szCs w:val="21"/>
+          <w14:ligatures w14:val="none"/>
+        </w:rPr>
+        <w:t>=</w:t>
+      </w:r>
+      <w:r>
+        <w:rPr>
+          <w:rFonts w:ascii="Consolas" w:eastAsia="Times New Roman" w:hAnsi="Consolas" w:cs="Times New Roman"/>
+          <w:color w:val="3B3B3B"/>
+          <w:kern w:val="0"/>
+          <w:sz w:val="21"/>
+          <w:szCs w:val="21"/>
+          <w14:ligatures w14:val="none"/>
+        </w:rPr>
+        <w:t xml:space="preserve"> </w:t>
+      </w:r>
+      <w:r>
+        <w:rPr>
+          <w:rFonts w:ascii="Consolas" w:eastAsia="Times New Roman" w:hAnsi="Consolas" w:cs="Times New Roman"/>
+          <w:color w:val="A31515"/>
+          <w:kern w:val="0"/>
+          <w:sz w:val="21"/>
+          <w:szCs w:val="21"/>
+          <w14:ligatures w14:val="none"/>
+        </w:rPr>
+        <w:t>"user_id"</w:t>
+      </w:r>
+      <w:r>
+        <w:rPr>
+          <w:rFonts w:ascii="Consolas" w:eastAsia="Times New Roman" w:hAnsi="Consolas" w:cs="Times New Roman"/>
+          <w:color w:val="3B3B3B"/>
+          <w:kern w:val="0"/>
+          <w:sz w:val="21"/>
+          <w:szCs w:val="21"/>
+          <w14:ligatures w14:val="none"/>
+        </w:rPr>
+        <w:t>),</w:t>
+      </w:r>
+    </w:p>
+    <w:p>
+      <w:pPr>
+        <w:shd w:val="clear" w:color="auto" w:fill="FFFFFF"/>
+        <w:spacing w:after="0" w:line="285" w:lineRule="atLeast"/>
+        <w:rPr>
+          <w:rFonts w:ascii="Consolas" w:eastAsia="Times New Roman" w:hAnsi="Consolas" w:cs="Times New Roman"/>
+          <w:color w:val="3B3B3B"/>
+          <w:kern w:val="0"/>
+          <w:sz w:val="21"/>
+          <w:szCs w:val="21"/>
+          <w14:ligatures w14:val="none"/>
+        </w:rPr>
+      </w:pPr>
+      <w:r>
+        <w:rPr>
+          <w:rFonts w:ascii="Consolas" w:eastAsia="Times New Roman" w:hAnsi="Consolas" w:cs="Times New Roman"/>
+          <w:color w:val="3B3B3B"/>
+          <w:kern w:val="0"/>
+          <w:sz w:val="21"/>
+          <w:szCs w:val="21"/>
+          <w14:ligatures w14:val="none"/>
+        </w:rPr>
+        <w:t xml:space="preserve">        </w:t>
+      </w:r>
+      <w:r>
+        <w:rPr>
+          <w:rFonts w:ascii="Consolas" w:eastAsia="Times New Roman" w:hAnsi="Consolas" w:cs="Times New Roman"/>
+          <w:color w:val="795E26"/>
+          <w:kern w:val="0"/>
+          <w:sz w:val="21"/>
+          <w:szCs w:val="21"/>
+          <w14:ligatures w14:val="none"/>
+        </w:rPr>
+        <w:t>inverseJoinColumns</w:t>
+      </w:r>
+      <w:r>
+        <w:rPr>
+          <w:rFonts w:ascii="Consolas" w:eastAsia="Times New Roman" w:hAnsi="Consolas" w:cs="Times New Roman"/>
+          <w:color w:val="3B3B3B"/>
+          <w:kern w:val="0"/>
+          <w:sz w:val="21"/>
+          <w:szCs w:val="21"/>
+          <w14:ligatures w14:val="none"/>
+        </w:rPr>
+        <w:t xml:space="preserve"> </w:t>
+      </w:r>
+      <w:r>
+        <w:rPr>
+          <w:rFonts w:ascii="Consolas" w:eastAsia="Times New Roman" w:hAnsi="Consolas" w:cs="Times New Roman"/>
+          <w:color w:val="000000"/>
+          <w:kern w:val="0"/>
+          <w:sz w:val="21"/>
+          <w:szCs w:val="21"/>
+          <w14:ligatures w14:val="none"/>
+        </w:rPr>
+        <w:t>=</w:t>
+      </w:r>
+      <w:r>
+        <w:rPr>
+          <w:rFonts w:ascii="Consolas" w:eastAsia="Times New Roman" w:hAnsi="Consolas" w:cs="Times New Roman"/>
+          <w:color w:val="3B3B3B"/>
+          <w:kern w:val="0"/>
+          <w:sz w:val="21"/>
+          <w:szCs w:val="21"/>
+          <w14:ligatures w14:val="none"/>
+        </w:rPr>
+        <w:t xml:space="preserve"> @</w:t>
+      </w:r>
+      <w:proofErr w:type="gramStart"/>
+      <w:r>
+        <w:rPr>
+          <w:rFonts w:ascii="Consolas" w:eastAsia="Times New Roman" w:hAnsi="Consolas" w:cs="Times New Roman"/>
+          <w:color w:val="267F99"/>
+          <w:kern w:val="0"/>
+          <w:sz w:val="21"/>
+          <w:szCs w:val="21"/>
+          <w14:ligatures w14:val="none"/>
+        </w:rPr>
+        <w:t>JoinColumn</w:t>
+      </w:r>
+      <w:r>
+        <w:rPr>
+          <w:rFonts w:ascii="Consolas" w:eastAsia="Times New Roman" w:hAnsi="Consolas" w:cs="Times New Roman"/>
+          <w:color w:val="3B3B3B"/>
+          <w:kern w:val="0"/>
+          <w:sz w:val="21"/>
+          <w:szCs w:val="21"/>
+          <w14:ligatures w14:val="none"/>
+        </w:rPr>
+        <w:t>(</w:t>
+      </w:r>
+      <w:proofErr w:type="gramEnd"/>
+      <w:r>
+        <w:rPr>
+          <w:rFonts w:ascii="Consolas" w:eastAsia="Times New Roman" w:hAnsi="Consolas" w:cs="Times New Roman"/>
+          <w:color w:val="795E26"/>
+          <w:kern w:val="0"/>
+          <w:sz w:val="21"/>
+          <w:szCs w:val="21"/>
+          <w14:ligatures w14:val="none"/>
+        </w:rPr>
+        <w:t>name</w:t>
+      </w:r>
+      <w:r>
+        <w:rPr>
+          <w:rFonts w:ascii="Consolas" w:eastAsia="Times New Roman" w:hAnsi="Consolas" w:cs="Times New Roman"/>
+          <w:color w:val="3B3B3B"/>
+          <w:kern w:val="0"/>
+          <w:sz w:val="21"/>
+          <w:szCs w:val="21"/>
+          <w14:ligatures w14:val="none"/>
+        </w:rPr>
+        <w:t xml:space="preserve"> </w:t>
+      </w:r>
+      <w:r>
+        <w:rPr>
+          <w:rFonts w:ascii="Consolas" w:eastAsia="Times New Roman" w:hAnsi="Consolas" w:cs="Times New Roman"/>
+          <w:color w:val="000000"/>
+          <w:kern w:val="0"/>
+          <w:sz w:val="21"/>
+          <w:szCs w:val="21"/>
+          <w14:ligatures w14:val="none"/>
+        </w:rPr>
+        <w:t>=</w:t>
+      </w:r>
+      <w:r>
+        <w:rPr>
+          <w:rFonts w:ascii="Consolas" w:eastAsia="Times New Roman" w:hAnsi="Consolas" w:cs="Times New Roman"/>
+          <w:color w:val="3B3B3B"/>
+          <w:kern w:val="0"/>
+          <w:sz w:val="21"/>
+          <w:szCs w:val="21"/>
+          <w14:ligatures w14:val="none"/>
+        </w:rPr>
+        <w:t xml:space="preserve"> </w:t>
+      </w:r>
+      <w:r>
+        <w:rPr>
+          <w:rFonts w:ascii="Consolas" w:eastAsia="Times New Roman" w:hAnsi="Consolas" w:cs="Times New Roman"/>
+          <w:color w:val="A31515"/>
+          <w:kern w:val="0"/>
+          <w:sz w:val="21"/>
+          <w:szCs w:val="21"/>
+          <w14:ligatures w14:val="none"/>
+        </w:rPr>
+        <w:t>"product_id"</w:t>
+      </w:r>
+      <w:r>
+        <w:rPr>
+          <w:rFonts w:ascii="Consolas" w:eastAsia="Times New Roman" w:hAnsi="Consolas" w:cs="Times New Roman"/>
+          <w:color w:val="3B3B3B"/>
+          <w:kern w:val="0"/>
+          <w:sz w:val="21"/>
+          <w:szCs w:val="21"/>
+          <w14:ligatures w14:val="none"/>
+        </w:rPr>
+        <w:t>)</w:t>
+      </w:r>
+    </w:p>
+    <w:p>
+      <w:pPr>
+        <w:shd w:val="clear" w:color="auto" w:fill="FFFFFF"/>
+        <w:spacing w:after="0" w:line="285" w:lineRule="atLeast"/>
+        <w:rPr>
+          <w:rFonts w:ascii="Consolas" w:eastAsia="Times New Roman" w:hAnsi="Consolas" w:cs="Times New Roman"/>
+          <w:color w:val="3B3B3B"/>
+          <w:kern w:val="0"/>
+          <w:sz w:val="21"/>
+          <w:szCs w:val="21"/>
+          <w14:ligatures w14:val="none"/>
+        </w:rPr>
+      </w:pPr>
+      <w:r>
+        <w:rPr>
+          <w:rFonts w:ascii="Consolas" w:eastAsia="Times New Roman" w:hAnsi="Consolas" w:cs="Times New Roman"/>
+          <w:color w:val="3B3B3B"/>
+          <w:kern w:val="0"/>
+          <w:sz w:val="21"/>
+          <w:szCs w:val="21"/>
+          <w14:ligatures w14:val="none"/>
+        </w:rPr>
+        <w:t>    )</w:t>
+      </w:r>
+    </w:p>
+    <w:p>
+      <w:pPr>
+        <w:shd w:val="clear" w:color="auto" w:fill="FFFFFF"/>
+        <w:spacing w:after="0" w:line="285" w:lineRule="atLeast"/>
+        <w:rPr>
+          <w:rFonts w:ascii="Consolas" w:eastAsia="Times New Roman" w:hAnsi="Consolas" w:cs="Times New Roman"/>
+          <w:color w:val="3B3B3B"/>
+          <w:kern w:val="0"/>
+          <w:sz w:val="21"/>
+          <w:szCs w:val="21"/>
+          <w14:ligatures w14:val="none"/>
+        </w:rPr>
+      </w:pPr>
+      <w:r>
+        <w:rPr>
+          <w:rFonts w:ascii="Consolas" w:eastAsia="Times New Roman" w:hAnsi="Consolas" w:cs="Times New Roman"/>
+          <w:color w:val="3B3B3B"/>
+          <w:kern w:val="0"/>
+          <w:sz w:val="21"/>
+          <w:szCs w:val="21"/>
+          <w14:ligatures w14:val="none"/>
+        </w:rPr>
+        <w:t>    @</w:t>
+      </w:r>
+      <w:r>
+        <w:rPr>
+          <w:rFonts w:ascii="Consolas" w:eastAsia="Times New Roman" w:hAnsi="Consolas" w:cs="Times New Roman"/>
+          <w:color w:val="267F99"/>
+          <w:kern w:val="0"/>
+          <w:sz w:val="21"/>
+          <w:szCs w:val="21"/>
+          <w14:ligatures w14:val="none"/>
+        </w:rPr>
+        <w:t>Builder</w:t>
+      </w:r>
+      <w:r>
+        <w:rPr>
+          <w:rFonts w:ascii="Consolas" w:eastAsia="Times New Roman" w:hAnsi="Consolas" w:cs="Times New Roman"/>
+          <w:color w:val="3B3B3B"/>
+          <w:kern w:val="0"/>
+          <w:sz w:val="21"/>
+          <w:szCs w:val="21"/>
+          <w14:ligatures w14:val="none"/>
+        </w:rPr>
+        <w:t>.</w:t>
+      </w:r>
+      <w:r>
+        <w:rPr>
+          <w:rFonts w:ascii="Consolas" w:eastAsia="Times New Roman" w:hAnsi="Consolas" w:cs="Times New Roman"/>
+          <w:color w:val="267F99"/>
+          <w:kern w:val="0"/>
+          <w:sz w:val="21"/>
+          <w:szCs w:val="21"/>
+          <w14:ligatures w14:val="none"/>
+        </w:rPr>
+        <w:t>Default</w:t>
+      </w:r>
+    </w:p>
+    <w:p>
+      <w:pPr>
+        <w:shd w:val="clear" w:color="auto" w:fill="FFFFFF"/>
+        <w:spacing w:after="0" w:line="285" w:lineRule="atLeast"/>
+        <w:rPr>
+          <w:rFonts w:ascii="Consolas" w:eastAsia="Times New Roman" w:hAnsi="Consolas" w:cs="Times New Roman"/>
+          <w:color w:val="3B3B3B"/>
+          <w:kern w:val="0"/>
+          <w:sz w:val="21"/>
+          <w:szCs w:val="21"/>
+          <w14:ligatures w14:val="none"/>
+        </w:rPr>
+      </w:pPr>
+      <w:r>
+        <w:rPr>
+          <w:rFonts w:ascii="Consolas" w:eastAsia="Times New Roman" w:hAnsi="Consolas" w:cs="Times New Roman"/>
+          <w:color w:val="3B3B3B"/>
+          <w:kern w:val="0"/>
+          <w:sz w:val="21"/>
+          <w:szCs w:val="21"/>
+          <w14:ligatures w14:val="none"/>
+        </w:rPr>
+        <w:t xml:space="preserve">    </w:t>
+      </w:r>
+      <w:r>
+        <w:rPr>
+          <w:rFonts w:ascii="Consolas" w:eastAsia="Times New Roman" w:hAnsi="Consolas" w:cs="Times New Roman"/>
+          <w:color w:val="0000FF"/>
+          <w:kern w:val="0"/>
+          <w:sz w:val="21"/>
+          <w:szCs w:val="21"/>
+          <w14:ligatures w14:val="none"/>
+        </w:rPr>
+        <w:t>private</w:t>
+      </w:r>
+      <w:r>
+        <w:rPr>
+          <w:rFonts w:ascii="Consolas" w:eastAsia="Times New Roman" w:hAnsi="Consolas" w:cs="Times New Roman"/>
+          <w:color w:val="3B3B3B"/>
+          <w:kern w:val="0"/>
+          <w:sz w:val="21"/>
+          <w:szCs w:val="21"/>
+          <w14:ligatures w14:val="none"/>
+        </w:rPr>
+        <w:t xml:space="preserve"> </w:t>
+      </w:r>
+      <w:r>
+        <w:rPr>
+          <w:rFonts w:ascii="Consolas" w:eastAsia="Times New Roman" w:hAnsi="Consolas" w:cs="Times New Roman"/>
+          <w:color w:val="267F99"/>
+          <w:kern w:val="0"/>
+          <w:sz w:val="21"/>
+          <w:szCs w:val="21"/>
+          <w14:ligatures w14:val="none"/>
+        </w:rPr>
+        <w:t>Set</w:t>
+      </w:r>
+      <w:r>
+        <w:rPr>
+          <w:rFonts w:ascii="Consolas" w:eastAsia="Times New Roman" w:hAnsi="Consolas" w:cs="Times New Roman"/>
+          <w:color w:val="3B3B3B"/>
+          <w:kern w:val="0"/>
+          <w:sz w:val="21"/>
+          <w:szCs w:val="21"/>
+          <w14:ligatures w14:val="none"/>
+        </w:rPr>
+        <w:t>&lt;</w:t>
+      </w:r>
+      <w:r>
+        <w:rPr>
+          <w:rFonts w:ascii="Consolas" w:eastAsia="Times New Roman" w:hAnsi="Consolas" w:cs="Times New Roman"/>
+          <w:color w:val="267F99"/>
+          <w:kern w:val="0"/>
+          <w:sz w:val="21"/>
+          <w:szCs w:val="21"/>
+          <w14:ligatures w14:val="none"/>
+        </w:rPr>
+        <w:t>Product</w:t>
+      </w:r>
+      <w:r>
+        <w:rPr>
+          <w:rFonts w:ascii="Consolas" w:eastAsia="Times New Roman" w:hAnsi="Consolas" w:cs="Times New Roman"/>
+          <w:color w:val="3B3B3B"/>
+          <w:kern w:val="0"/>
+          <w:sz w:val="21"/>
+          <w:szCs w:val="21"/>
+          <w14:ligatures w14:val="none"/>
+        </w:rPr>
+        <w:t xml:space="preserve">&gt; </w:t>
+      </w:r>
+      <w:r>
+        <w:rPr>
+          <w:rFonts w:ascii="Consolas" w:eastAsia="Times New Roman" w:hAnsi="Consolas" w:cs="Times New Roman"/>
+          <w:color w:val="001080"/>
+          <w:kern w:val="0"/>
+          <w:sz w:val="21"/>
+          <w:szCs w:val="21"/>
+          <w14:ligatures w14:val="none"/>
+        </w:rPr>
+        <w:t>products</w:t>
+      </w:r>
+      <w:r>
+        <w:rPr>
+          <w:rFonts w:ascii="Consolas" w:eastAsia="Times New Roman" w:hAnsi="Consolas" w:cs="Times New Roman"/>
+          <w:color w:val="3B3B3B"/>
+          <w:kern w:val="0"/>
+          <w:sz w:val="21"/>
+          <w:szCs w:val="21"/>
+          <w14:ligatures w14:val="none"/>
+        </w:rPr>
+        <w:t xml:space="preserve"> </w:t>
+      </w:r>
+      <w:r>
+        <w:rPr>
+          <w:rFonts w:ascii="Consolas" w:eastAsia="Times New Roman" w:hAnsi="Consolas" w:cs="Times New Roman"/>
+          <w:color w:val="000000"/>
+          <w:kern w:val="0"/>
+          <w:sz w:val="21"/>
+          <w:szCs w:val="21"/>
+          <w14:ligatures w14:val="none"/>
+        </w:rPr>
+        <w:t>=</w:t>
+      </w:r>
+      <w:r>
+        <w:rPr>
+          <w:rFonts w:ascii="Consolas" w:eastAsia="Times New Roman" w:hAnsi="Consolas" w:cs="Times New Roman"/>
+          <w:color w:val="3B3B3B"/>
+          <w:kern w:val="0"/>
+          <w:sz w:val="21"/>
+          <w:szCs w:val="21"/>
+          <w14:ligatures w14:val="none"/>
+        </w:rPr>
+        <w:t xml:space="preserve"> </w:t>
+      </w:r>
+      <w:r>
+        <w:rPr>
+          <w:rFonts w:ascii="Consolas" w:eastAsia="Times New Roman" w:hAnsi="Consolas" w:cs="Times New Roman"/>
+          <w:color w:val="AF00DB"/>
+          <w:kern w:val="0"/>
+          <w:sz w:val="21"/>
+          <w:szCs w:val="21"/>
+          <w14:ligatures w14:val="none"/>
+        </w:rPr>
+        <w:t>new</w:t>
+      </w:r>
+      <w:r>
+        <w:rPr>
+          <w:rFonts w:ascii="Consolas" w:eastAsia="Times New Roman" w:hAnsi="Consolas" w:cs="Times New Roman"/>
+          <w:color w:val="3B3B3B"/>
+          <w:kern w:val="0"/>
+          <w:sz w:val="21"/>
+          <w:szCs w:val="21"/>
+          <w14:ligatures w14:val="none"/>
+        </w:rPr>
+        <w:t xml:space="preserve"> </w:t>
+      </w:r>
+      <w:r>
+        <w:rPr>
+          <w:rFonts w:ascii="Consolas" w:eastAsia="Times New Roman" w:hAnsi="Consolas" w:cs="Times New Roman"/>
+          <w:color w:val="795E26"/>
+          <w:kern w:val="0"/>
+          <w:sz w:val="21"/>
+          <w:szCs w:val="21"/>
+          <w14:ligatures w14:val="none"/>
+        </w:rPr>
+        <w:t>HashSet</w:t>
+      </w:r>
+      <w:r>
+        <w:rPr>
+          <w:rFonts w:ascii="Consolas" w:eastAsia="Times New Roman" w:hAnsi="Consolas" w:cs="Times New Roman"/>
+          <w:color w:val="3B3B3B"/>
+          <w:kern w:val="0"/>
+          <w:sz w:val="21"/>
+          <w:szCs w:val="21"/>
+          <w14:ligatures w14:val="none"/>
+        </w:rPr>
+        <w:t>&lt;</w:t>
+      </w:r>
+      <w:proofErr w:type="gramStart"/>
+      <w:r>
+        <w:rPr>
+          <w:rFonts w:ascii="Consolas" w:eastAsia="Times New Roman" w:hAnsi="Consolas" w:cs="Times New Roman"/>
+          <w:color w:val="3B3B3B"/>
+          <w:kern w:val="0"/>
+          <w:sz w:val="21"/>
+          <w:szCs w:val="21"/>
+          <w14:ligatures w14:val="none"/>
+        </w:rPr>
+        <w:t>&gt;(</w:t>
+      </w:r>
+      <w:proofErr w:type="gramEnd"/>
+      <w:r>
+        <w:rPr>
+          <w:rFonts w:ascii="Consolas" w:eastAsia="Times New Roman" w:hAnsi="Consolas" w:cs="Times New Roman"/>
+          <w:color w:val="3B3B3B"/>
+          <w:kern w:val="0"/>
+          <w:sz w:val="21"/>
+          <w:szCs w:val="21"/>
+          <w14:ligatures w14:val="none"/>
+        </w:rPr>
+        <w:t>);</w:t>
+      </w:r>
+    </w:p>
+    <w:p>
+      <w:pPr>
+        <w:rPr>
+          <w:rFonts w:ascii="Sakkal Majalla" w:hAnsi="Sakkal Majalla" w:cs="Sakkal Majalla"/>
+          <w:sz w:val="28"/>
+          <w:szCs w:val="28"/>
+        </w:rPr>
+      </w:pPr>
+      <w:r>
+        <w:rPr>
+          <w:rFonts w:ascii="Sakkal Majalla" w:hAnsi="Sakkal Majalla" w:cs="Sakkal Majalla"/>
+          <w:sz w:val="28"/>
+          <w:szCs w:val="28"/>
+        </w:rPr>
+        <w:tab/>
+      </w:r>
+      <w:r>
+        <w:rPr>
+          <w:rFonts w:ascii="Sakkal Majalla" w:hAnsi="Sakkal Majalla" w:cs="Sakkal Majalla"/>
+          <w:sz w:val="28"/>
+          <w:szCs w:val="28"/>
+        </w:rPr>
+        <w:tab/>
+        <w:t>---------------------------------------------------------------------------------------</w:t>
+      </w:r>
+    </w:p>
+    <w:p>
+      <w:pPr>
+        <w:shd w:val="clear" w:color="auto" w:fill="FFFFFF"/>
+        <w:spacing w:after="0" w:line="285" w:lineRule="atLeast"/>
+        <w:rPr>
+          <w:rFonts w:ascii="Consolas" w:eastAsia="Times New Roman" w:hAnsi="Consolas" w:cs="Times New Roman"/>
+          <w:color w:val="3B3B3B"/>
+          <w:kern w:val="0"/>
+          <w:sz w:val="21"/>
+          <w:szCs w:val="21"/>
+          <w14:ligatures w14:val="none"/>
+        </w:rPr>
+      </w:pPr>
+      <w:r>
+        <w:rPr>
+          <w:rFonts w:ascii="Consolas" w:eastAsia="Times New Roman" w:hAnsi="Consolas" w:cs="Times New Roman"/>
+          <w:color w:val="3B3B3B"/>
+          <w:kern w:val="0"/>
+          <w:sz w:val="21"/>
+          <w:szCs w:val="21"/>
+          <w14:ligatures w14:val="none"/>
+        </w:rPr>
+        <w:t>@</w:t>
+      </w:r>
+      <w:proofErr w:type="gramStart"/>
+      <w:r>
+        <w:rPr>
+          <w:rFonts w:ascii="Consolas" w:eastAsia="Times New Roman" w:hAnsi="Consolas" w:cs="Times New Roman"/>
+          <w:color w:val="267F99"/>
+          <w:kern w:val="0"/>
+          <w:sz w:val="21"/>
+          <w:szCs w:val="21"/>
+          <w14:ligatures w14:val="none"/>
+        </w:rPr>
+        <w:t>OneToMany</w:t>
+      </w:r>
+      <w:r>
+        <w:rPr>
+          <w:rFonts w:ascii="Consolas" w:eastAsia="Times New Roman" w:hAnsi="Consolas" w:cs="Times New Roman"/>
+          <w:color w:val="3B3B3B"/>
+          <w:kern w:val="0"/>
+          <w:sz w:val="21"/>
+          <w:szCs w:val="21"/>
+          <w14:ligatures w14:val="none"/>
+        </w:rPr>
+        <w:t>(</w:t>
+      </w:r>
+      <w:proofErr w:type="gramEnd"/>
+      <w:r>
+        <w:rPr>
+          <w:rFonts w:ascii="Consolas" w:eastAsia="Times New Roman" w:hAnsi="Consolas" w:cs="Times New Roman"/>
+          <w:color w:val="795E26"/>
+          <w:kern w:val="0"/>
+          <w:sz w:val="21"/>
+          <w:szCs w:val="21"/>
+          <w14:ligatures w14:val="none"/>
+        </w:rPr>
+        <w:t>mappedBy</w:t>
+      </w:r>
+      <w:r>
+        <w:rPr>
+          <w:rFonts w:ascii="Consolas" w:eastAsia="Times New Roman" w:hAnsi="Consolas" w:cs="Times New Roman"/>
+          <w:color w:val="3B3B3B"/>
+          <w:kern w:val="0"/>
+          <w:sz w:val="21"/>
+          <w:szCs w:val="21"/>
+          <w14:ligatures w14:val="none"/>
+        </w:rPr>
+        <w:t xml:space="preserve"> </w:t>
+      </w:r>
+      <w:r>
+        <w:rPr>
+          <w:rFonts w:ascii="Consolas" w:eastAsia="Times New Roman" w:hAnsi="Consolas" w:cs="Times New Roman"/>
+          <w:color w:val="000000"/>
+          <w:kern w:val="0"/>
+          <w:sz w:val="21"/>
+          <w:szCs w:val="21"/>
+          <w14:ligatures w14:val="none"/>
+        </w:rPr>
+        <w:t>=</w:t>
+      </w:r>
+      <w:r>
+        <w:rPr>
+          <w:rFonts w:ascii="Consolas" w:eastAsia="Times New Roman" w:hAnsi="Consolas" w:cs="Times New Roman"/>
+          <w:color w:val="3B3B3B"/>
+          <w:kern w:val="0"/>
+          <w:sz w:val="21"/>
+          <w:szCs w:val="21"/>
+          <w14:ligatures w14:val="none"/>
+        </w:rPr>
+        <w:t xml:space="preserve"> </w:t>
+      </w:r>
+      <w:r>
+        <w:rPr>
+          <w:rFonts w:ascii="Consolas" w:eastAsia="Times New Roman" w:hAnsi="Consolas" w:cs="Times New Roman"/>
+          <w:color w:val="A31515"/>
+          <w:kern w:val="0"/>
+          <w:sz w:val="21"/>
+          <w:szCs w:val="21"/>
+          <w14:ligatures w14:val="none"/>
+        </w:rPr>
+        <w:t>"user"</w:t>
+      </w:r>
+      <w:r>
+        <w:rPr>
+          <w:rFonts w:ascii="Consolas" w:eastAsia="Times New Roman" w:hAnsi="Consolas" w:cs="Times New Roman"/>
+          <w:color w:val="3B3B3B"/>
+          <w:kern w:val="0"/>
+          <w:sz w:val="21"/>
+          <w:szCs w:val="21"/>
+          <w14:ligatures w14:val="none"/>
+        </w:rPr>
+        <w:t xml:space="preserve">, </w:t>
+      </w:r>
+      <w:r>
+        <w:rPr>
+          <w:rFonts w:ascii="Consolas" w:eastAsia="Times New Roman" w:hAnsi="Consolas" w:cs="Times New Roman"/>
+          <w:color w:val="795E26"/>
+          <w:kern w:val="0"/>
+          <w:sz w:val="21"/>
+          <w:szCs w:val="21"/>
+          <w14:ligatures w14:val="none"/>
+        </w:rPr>
+        <w:t>cascade</w:t>
+      </w:r>
+      <w:r>
+        <w:rPr>
+          <w:rFonts w:ascii="Consolas" w:eastAsia="Times New Roman" w:hAnsi="Consolas" w:cs="Times New Roman"/>
+          <w:color w:val="3B3B3B"/>
+          <w:kern w:val="0"/>
+          <w:sz w:val="21"/>
+          <w:szCs w:val="21"/>
+          <w14:ligatures w14:val="none"/>
+        </w:rPr>
+        <w:t xml:space="preserve"> </w:t>
+      </w:r>
+      <w:r>
+        <w:rPr>
+          <w:rFonts w:ascii="Consolas" w:eastAsia="Times New Roman" w:hAnsi="Consolas" w:cs="Times New Roman"/>
+          <w:color w:val="000000"/>
+          <w:kern w:val="0"/>
+          <w:sz w:val="21"/>
+          <w:szCs w:val="21"/>
+          <w14:ligatures w14:val="none"/>
+        </w:rPr>
+        <w:t>=</w:t>
+      </w:r>
+      <w:r>
+        <w:rPr>
+          <w:rFonts w:ascii="Consolas" w:eastAsia="Times New Roman" w:hAnsi="Consolas" w:cs="Times New Roman"/>
+          <w:color w:val="3B3B3B"/>
+          <w:kern w:val="0"/>
+          <w:sz w:val="21"/>
+          <w:szCs w:val="21"/>
+          <w14:ligatures w14:val="none"/>
+        </w:rPr>
+        <w:t xml:space="preserve"> </w:t>
+      </w:r>
+      <w:r>
+        <w:rPr>
+          <w:rFonts w:ascii="Consolas" w:eastAsia="Times New Roman" w:hAnsi="Consolas" w:cs="Times New Roman"/>
+          <w:color w:val="267F99"/>
+          <w:kern w:val="0"/>
+          <w:sz w:val="21"/>
+          <w:szCs w:val="21"/>
+          <w14:ligatures w14:val="none"/>
+        </w:rPr>
+        <w:t>CascadeType</w:t>
+      </w:r>
+      <w:r>
+        <w:rPr>
+          <w:rFonts w:ascii="Consolas" w:eastAsia="Times New Roman" w:hAnsi="Consolas" w:cs="Times New Roman"/>
+          <w:color w:val="3B3B3B"/>
+          <w:kern w:val="0"/>
+          <w:sz w:val="21"/>
+          <w:szCs w:val="21"/>
+          <w14:ligatures w14:val="none"/>
+        </w:rPr>
+        <w:t>.</w:t>
+      </w:r>
+      <w:r>
+        <w:rPr>
+          <w:rFonts w:ascii="Consolas" w:eastAsia="Times New Roman" w:hAnsi="Consolas" w:cs="Times New Roman"/>
+          <w:color w:val="0070C1"/>
+          <w:kern w:val="0"/>
+          <w:sz w:val="21"/>
+          <w:szCs w:val="21"/>
+          <w14:ligatures w14:val="none"/>
+        </w:rPr>
+        <w:t>PERSIST</w:t>
+      </w:r>
+      <w:r>
+        <w:rPr>
+          <w:rFonts w:ascii="Consolas" w:eastAsia="Times New Roman" w:hAnsi="Consolas" w:cs="Times New Roman"/>
+          <w:color w:val="3B3B3B"/>
+          <w:kern w:val="0"/>
+          <w:sz w:val="21"/>
+          <w:szCs w:val="21"/>
+          <w14:ligatures w14:val="none"/>
+        </w:rPr>
+        <w:t xml:space="preserve">) </w:t>
+      </w:r>
+      <w:r>
+        <w:rPr>
+          <w:rFonts w:ascii="Consolas" w:eastAsia="Times New Roman" w:hAnsi="Consolas" w:cs="Times New Roman"/>
+          <w:color w:val="008000"/>
+          <w:kern w:val="0"/>
+          <w:sz w:val="21"/>
+          <w:szCs w:val="21"/>
+          <w14:ligatures w14:val="none"/>
+        </w:rPr>
+        <w:t>// this is the field in address-entity</w:t>
+      </w:r>
+    </w:p>
+    <w:p>
+      <w:pPr>
+        <w:shd w:val="clear" w:color="auto" w:fill="FFFFFF"/>
+        <w:spacing w:after="0" w:line="285" w:lineRule="atLeast"/>
+        <w:rPr>
+          <w:rFonts w:ascii="Consolas" w:eastAsia="Times New Roman" w:hAnsi="Consolas" w:cs="Times New Roman"/>
+          <w:color w:val="3B3B3B"/>
+          <w:kern w:val="0"/>
+          <w:sz w:val="21"/>
+          <w:szCs w:val="21"/>
+          <w14:ligatures w14:val="none"/>
+        </w:rPr>
+      </w:pPr>
+      <w:r>
+        <w:rPr>
+          <w:rFonts w:ascii="Consolas" w:eastAsia="Times New Roman" w:hAnsi="Consolas" w:cs="Times New Roman"/>
+          <w:color w:val="3B3B3B"/>
+          <w:kern w:val="0"/>
+          <w:sz w:val="21"/>
+          <w:szCs w:val="21"/>
+          <w14:ligatures w14:val="none"/>
+        </w:rPr>
+        <w:t>    @</w:t>
+      </w:r>
+      <w:r>
+        <w:rPr>
+          <w:rFonts w:ascii="Consolas" w:eastAsia="Times New Roman" w:hAnsi="Consolas" w:cs="Times New Roman"/>
+          <w:color w:val="267F99"/>
+          <w:kern w:val="0"/>
+          <w:sz w:val="21"/>
+          <w:szCs w:val="21"/>
+          <w14:ligatures w14:val="none"/>
+        </w:rPr>
+        <w:t>Builder</w:t>
+      </w:r>
+      <w:r>
+        <w:rPr>
+          <w:rFonts w:ascii="Consolas" w:eastAsia="Times New Roman" w:hAnsi="Consolas" w:cs="Times New Roman"/>
+          <w:color w:val="3B3B3B"/>
+          <w:kern w:val="0"/>
+          <w:sz w:val="21"/>
+          <w:szCs w:val="21"/>
+          <w14:ligatures w14:val="none"/>
+        </w:rPr>
+        <w:t>.</w:t>
+      </w:r>
+      <w:r>
+        <w:rPr>
+          <w:rFonts w:ascii="Consolas" w:eastAsia="Times New Roman" w:hAnsi="Consolas" w:cs="Times New Roman"/>
+          <w:color w:val="267F99"/>
+          <w:kern w:val="0"/>
+          <w:sz w:val="21"/>
+          <w:szCs w:val="21"/>
+          <w14:ligatures w14:val="none"/>
+        </w:rPr>
+        <w:t>Default</w:t>
+      </w:r>
+    </w:p>
+    <w:p>
+      <w:pPr>
+        <w:shd w:val="clear" w:color="auto" w:fill="FFFFFF"/>
+        <w:spacing w:after="0" w:line="285" w:lineRule="atLeast"/>
+        <w:rPr>
+          <w:rFonts w:ascii="Consolas" w:eastAsia="Times New Roman" w:hAnsi="Consolas" w:cs="Times New Roman"/>
+          <w:color w:val="3B3B3B"/>
+          <w:kern w:val="0"/>
+          <w:sz w:val="21"/>
+          <w:szCs w:val="21"/>
+          <w14:ligatures w14:val="none"/>
+        </w:rPr>
+      </w:pPr>
+      <w:r>
+        <w:rPr>
+          <w:rFonts w:ascii="Consolas" w:eastAsia="Times New Roman" w:hAnsi="Consolas" w:cs="Times New Roman"/>
+          <w:color w:val="3B3B3B"/>
+          <w:kern w:val="0"/>
+          <w:sz w:val="21"/>
+          <w:szCs w:val="21"/>
+          <w14:ligatures w14:val="none"/>
+        </w:rPr>
+        <w:t xml:space="preserve">    </w:t>
+      </w:r>
+      <w:r>
+        <w:rPr>
+          <w:rFonts w:ascii="Consolas" w:eastAsia="Times New Roman" w:hAnsi="Consolas" w:cs="Times New Roman"/>
+          <w:color w:val="008000"/>
+          <w:kern w:val="0"/>
+          <w:sz w:val="21"/>
+          <w:szCs w:val="21"/>
+          <w14:ligatures w14:val="none"/>
+        </w:rPr>
+        <w:t>// private final List&lt;Address&gt; addresses = new ArrayList&lt;</w:t>
+      </w:r>
+      <w:proofErr w:type="gramStart"/>
+      <w:r>
+        <w:rPr>
+          <w:rFonts w:ascii="Consolas" w:eastAsia="Times New Roman" w:hAnsi="Consolas" w:cs="Times New Roman"/>
+          <w:color w:val="008000"/>
+          <w:kern w:val="0"/>
+          <w:sz w:val="21"/>
+          <w:szCs w:val="21"/>
+          <w14:ligatures w14:val="none"/>
+        </w:rPr>
+        <w:t>&gt;(</w:t>
+      </w:r>
+      <w:proofErr w:type="gramEnd"/>
+      <w:r>
+        <w:rPr>
+          <w:rFonts w:ascii="Consolas" w:eastAsia="Times New Roman" w:hAnsi="Consolas" w:cs="Times New Roman"/>
+          <w:color w:val="008000"/>
+          <w:kern w:val="0"/>
+          <w:sz w:val="21"/>
+          <w:szCs w:val="21"/>
+          <w14:ligatures w14:val="none"/>
+        </w:rPr>
+        <w:t>);</w:t>
+      </w:r>
+    </w:p>
+    <w:p>
+      <w:pPr>
+        <w:shd w:val="clear" w:color="auto" w:fill="FFFFFF"/>
+        <w:spacing w:after="0" w:line="285" w:lineRule="atLeast"/>
+        <w:rPr>
+          <w:rFonts w:ascii="Consolas" w:eastAsia="Times New Roman" w:hAnsi="Consolas" w:cs="Times New Roman"/>
+          <w:color w:val="3B3B3B"/>
+          <w:kern w:val="0"/>
+          <w:sz w:val="21"/>
+          <w:szCs w:val="21"/>
+          <w14:ligatures w14:val="none"/>
+        </w:rPr>
+      </w:pPr>
+      <w:r>
+        <w:rPr>
+          <w:rFonts w:ascii="Consolas" w:eastAsia="Times New Roman" w:hAnsi="Consolas" w:cs="Times New Roman"/>
+          <w:color w:val="3B3B3B"/>
+          <w:kern w:val="0"/>
+          <w:sz w:val="21"/>
+          <w:szCs w:val="21"/>
+          <w14:ligatures w14:val="none"/>
+        </w:rPr>
+        <w:t xml:space="preserve">    </w:t>
+      </w:r>
+      <w:r>
+        <w:rPr>
+          <w:rFonts w:ascii="Consolas" w:eastAsia="Times New Roman" w:hAnsi="Consolas" w:cs="Times New Roman"/>
+          <w:color w:val="0000FF"/>
+          <w:kern w:val="0"/>
+          <w:sz w:val="21"/>
+          <w:szCs w:val="21"/>
+          <w14:ligatures w14:val="none"/>
+        </w:rPr>
+        <w:t>private</w:t>
+      </w:r>
+      <w:r>
+        <w:rPr>
+          <w:rFonts w:ascii="Consolas" w:eastAsia="Times New Roman" w:hAnsi="Consolas" w:cs="Times New Roman"/>
+          <w:color w:val="3B3B3B"/>
+          <w:kern w:val="0"/>
+          <w:sz w:val="21"/>
+          <w:szCs w:val="21"/>
+          <w14:ligatures w14:val="none"/>
+        </w:rPr>
+        <w:t xml:space="preserve"> </w:t>
+      </w:r>
+      <w:r>
+        <w:rPr>
+          <w:rFonts w:ascii="Consolas" w:eastAsia="Times New Roman" w:hAnsi="Consolas" w:cs="Times New Roman"/>
+          <w:color w:val="267F99"/>
+          <w:kern w:val="0"/>
+          <w:sz w:val="21"/>
+          <w:szCs w:val="21"/>
+          <w14:ligatures w14:val="none"/>
+        </w:rPr>
+        <w:t>List</w:t>
+      </w:r>
+      <w:r>
+        <w:rPr>
+          <w:rFonts w:ascii="Consolas" w:eastAsia="Times New Roman" w:hAnsi="Consolas" w:cs="Times New Roman"/>
+          <w:color w:val="3B3B3B"/>
+          <w:kern w:val="0"/>
+          <w:sz w:val="21"/>
+          <w:szCs w:val="21"/>
+          <w14:ligatures w14:val="none"/>
+        </w:rPr>
+        <w:t>&lt;</w:t>
+      </w:r>
+      <w:r>
+        <w:rPr>
+          <w:rFonts w:ascii="Consolas" w:eastAsia="Times New Roman" w:hAnsi="Consolas" w:cs="Times New Roman"/>
+          <w:color w:val="267F99"/>
+          <w:kern w:val="0"/>
+          <w:sz w:val="21"/>
+          <w:szCs w:val="21"/>
+          <w14:ligatures w14:val="none"/>
+        </w:rPr>
+        <w:t>Address</w:t>
+      </w:r>
+      <w:r>
+        <w:rPr>
+          <w:rFonts w:ascii="Consolas" w:eastAsia="Times New Roman" w:hAnsi="Consolas" w:cs="Times New Roman"/>
+          <w:color w:val="3B3B3B"/>
+          <w:kern w:val="0"/>
+          <w:sz w:val="21"/>
+          <w:szCs w:val="21"/>
+          <w14:ligatures w14:val="none"/>
+        </w:rPr>
+        <w:t xml:space="preserve">&gt; </w:t>
+      </w:r>
+      <w:r>
+        <w:rPr>
+          <w:rFonts w:ascii="Consolas" w:eastAsia="Times New Roman" w:hAnsi="Consolas" w:cs="Times New Roman"/>
+          <w:color w:val="001080"/>
+          <w:kern w:val="0"/>
+          <w:sz w:val="21"/>
+          <w:szCs w:val="21"/>
+          <w14:ligatures w14:val="none"/>
+        </w:rPr>
+        <w:t>addresses</w:t>
+      </w:r>
+      <w:r>
+        <w:rPr>
+          <w:rFonts w:ascii="Consolas" w:eastAsia="Times New Roman" w:hAnsi="Consolas" w:cs="Times New Roman"/>
+          <w:color w:val="3B3B3B"/>
+          <w:kern w:val="0"/>
+          <w:sz w:val="21"/>
+          <w:szCs w:val="21"/>
+          <w14:ligatures w14:val="none"/>
+        </w:rPr>
+        <w:t xml:space="preserve"> </w:t>
+      </w:r>
+      <w:r>
+        <w:rPr>
+          <w:rFonts w:ascii="Consolas" w:eastAsia="Times New Roman" w:hAnsi="Consolas" w:cs="Times New Roman"/>
+          <w:color w:val="000000"/>
+          <w:kern w:val="0"/>
+          <w:sz w:val="21"/>
+          <w:szCs w:val="21"/>
+          <w14:ligatures w14:val="none"/>
+        </w:rPr>
+        <w:t>=</w:t>
+      </w:r>
+      <w:r>
+        <w:rPr>
+          <w:rFonts w:ascii="Consolas" w:eastAsia="Times New Roman" w:hAnsi="Consolas" w:cs="Times New Roman"/>
+          <w:color w:val="3B3B3B"/>
+          <w:kern w:val="0"/>
+          <w:sz w:val="21"/>
+          <w:szCs w:val="21"/>
+          <w14:ligatures w14:val="none"/>
+        </w:rPr>
+        <w:t xml:space="preserve"> </w:t>
+      </w:r>
+      <w:r>
+        <w:rPr>
+          <w:rFonts w:ascii="Consolas" w:eastAsia="Times New Roman" w:hAnsi="Consolas" w:cs="Times New Roman"/>
+          <w:color w:val="AF00DB"/>
+          <w:kern w:val="0"/>
+          <w:sz w:val="21"/>
+          <w:szCs w:val="21"/>
+          <w14:ligatures w14:val="none"/>
+        </w:rPr>
+        <w:t>new</w:t>
+      </w:r>
+      <w:r>
+        <w:rPr>
+          <w:rFonts w:ascii="Consolas" w:eastAsia="Times New Roman" w:hAnsi="Consolas" w:cs="Times New Roman"/>
+          <w:color w:val="3B3B3B"/>
+          <w:kern w:val="0"/>
+          <w:sz w:val="21"/>
+          <w:szCs w:val="21"/>
+          <w14:ligatures w14:val="none"/>
+        </w:rPr>
+        <w:t xml:space="preserve"> </w:t>
+      </w:r>
+      <w:r>
+        <w:rPr>
+          <w:rFonts w:ascii="Consolas" w:eastAsia="Times New Roman" w:hAnsi="Consolas" w:cs="Times New Roman"/>
+          <w:color w:val="795E26"/>
+          <w:kern w:val="0"/>
+          <w:sz w:val="21"/>
+          <w:szCs w:val="21"/>
+          <w14:ligatures w14:val="none"/>
+        </w:rPr>
+        <w:t>ArrayList</w:t>
+      </w:r>
+      <w:r>
+        <w:rPr>
+          <w:rFonts w:ascii="Consolas" w:eastAsia="Times New Roman" w:hAnsi="Consolas" w:cs="Times New Roman"/>
+          <w:color w:val="3B3B3B"/>
+          <w:kern w:val="0"/>
+          <w:sz w:val="21"/>
+          <w:szCs w:val="21"/>
+          <w14:ligatures w14:val="none"/>
+        </w:rPr>
+        <w:t>&lt;</w:t>
+      </w:r>
+      <w:proofErr w:type="gramStart"/>
+      <w:r>
+        <w:rPr>
+          <w:rFonts w:ascii="Consolas" w:eastAsia="Times New Roman" w:hAnsi="Consolas" w:cs="Times New Roman"/>
+          <w:color w:val="3B3B3B"/>
+          <w:kern w:val="0"/>
+          <w:sz w:val="21"/>
+          <w:szCs w:val="21"/>
+          <w14:ligatures w14:val="none"/>
+        </w:rPr>
+        <w:t>&gt;(</w:t>
+      </w:r>
+      <w:proofErr w:type="gramEnd"/>
+      <w:r>
+        <w:rPr>
+          <w:rFonts w:ascii="Consolas" w:eastAsia="Times New Roman" w:hAnsi="Consolas" w:cs="Times New Roman"/>
+          <w:color w:val="3B3B3B"/>
+          <w:kern w:val="0"/>
+          <w:sz w:val="21"/>
+          <w:szCs w:val="21"/>
+          <w14:ligatures w14:val="none"/>
+        </w:rPr>
+        <w:t>);</w:t>
+      </w:r>
+    </w:p>
+    <w:p>
+      <w:pPr>
+        <w:ind w:left="720" w:firstLine="720"/>
+      </w:pPr>
+      <w:r>
+        <w:t>===========================================</w:t>
+      </w:r>
+    </w:p>
+    <w:p>
+      <w:pPr>
+        <w:rPr>
+          <w:rFonts w:ascii="Sakkal Majalla" w:hAnsi="Sakkal Majalla" w:cs="Sakkal Majalla"/>
+          <w:sz w:val="28"/>
+          <w:szCs w:val="28"/>
+        </w:rPr>
+      </w:pPr>
+      <w:r>
+        <w:rPr>
+          <w:rFonts w:ascii="Sakkal Majalla" w:hAnsi="Sakkal Majalla" w:cs="Sakkal Majalla"/>
+          <w:sz w:val="28"/>
+          <w:szCs w:val="28"/>
+        </w:rPr>
+        <w:t xml:space="preserve">To delete the orphan records from the </w:t>
+      </w:r>
+      <w:r>
+        <w:rPr>
+          <w:rFonts w:ascii="Sakkal Majalla" w:hAnsi="Sakkal Majalla" w:cs="Sakkal Majalla"/>
+          <w:sz w:val="28"/>
+          <w:szCs w:val="28"/>
+        </w:rPr>
+        <w:t>DB</w:t>
+      </w:r>
+      <w:r>
+        <w:rPr>
+          <w:rFonts w:ascii="Sakkal Majalla" w:hAnsi="Sakkal Majalla" w:cs="Sakkal Majalla"/>
+          <w:sz w:val="28"/>
+          <w:szCs w:val="28"/>
+        </w:rPr>
+        <w:t xml:space="preserve"> using java event if the parent is define</w:t>
+      </w:r>
+      <w:r>
+        <w:rPr>
+          <w:rFonts w:ascii="Sakkal Majalla" w:hAnsi="Sakkal Majalla" w:cs="Sakkal Majalla"/>
+          <w:sz w:val="28"/>
+          <w:szCs w:val="28"/>
+        </w:rPr>
+        <w:t>d as</w:t>
+      </w:r>
+      <w:r>
+        <w:rPr>
+          <w:rFonts w:ascii="Sakkal Majalla" w:hAnsi="Sakkal Majalla" w:cs="Sakkal Majalla"/>
+          <w:sz w:val="28"/>
+          <w:szCs w:val="28"/>
+        </w:rPr>
+        <w:t xml:space="preserve"> “</w:t>
+      </w:r>
+      <w:r>
+        <w:rPr>
+          <w:rFonts w:ascii="Sakkal Majalla" w:hAnsi="Sakkal Majalla" w:cs="Sakkal Majalla"/>
+          <w:b/>
+          <w:bCs/>
+          <w:color w:val="C00000"/>
+          <w:sz w:val="28"/>
+          <w:szCs w:val="28"/>
+        </w:rPr>
+        <w:t>Not Null</w:t>
+      </w:r>
+      <w:r>
+        <w:rPr>
+          <w:rFonts w:ascii="Sakkal Majalla" w:hAnsi="Sakkal Majalla" w:cs="Sakkal Majalla"/>
+          <w:sz w:val="28"/>
+          <w:szCs w:val="28"/>
+        </w:rPr>
+        <w:t>”</w:t>
+      </w:r>
+      <w:r>
+        <w:rPr>
+          <w:rFonts w:ascii="Sakkal Majalla" w:hAnsi="Sakkal Majalla" w:cs="Sakkal Majalla"/>
+          <w:sz w:val="28"/>
+          <w:szCs w:val="28"/>
+        </w:rPr>
+        <w:t>, we use orphan removal</w:t>
+      </w:r>
+      <w:r>
+        <w:rPr>
+          <w:rFonts w:ascii="Sakkal Majalla" w:hAnsi="Sakkal Majalla" w:cs="Sakkal Majalla"/>
+          <w:sz w:val="28"/>
+          <w:szCs w:val="28"/>
+        </w:rPr>
+        <w:t>:</w:t>
+      </w:r>
+    </w:p>
+    <w:p>
+      <w:pPr>
+        <w:shd w:val="clear" w:color="auto" w:fill="FFFFFF"/>
+        <w:spacing w:after="0" w:line="285" w:lineRule="atLeast"/>
+        <w:rPr>
+          <w:rFonts w:ascii="Consolas" w:eastAsia="Times New Roman" w:hAnsi="Consolas" w:cs="Times New Roman"/>
+          <w:color w:val="3B3B3B"/>
+          <w:kern w:val="0"/>
+          <w:sz w:val="21"/>
+          <w:szCs w:val="21"/>
+          <w14:ligatures w14:val="none"/>
+        </w:rPr>
+      </w:pPr>
+      <w:r>
+        <w:rPr>
+          <w:rFonts w:ascii="Consolas" w:eastAsia="Times New Roman" w:hAnsi="Consolas" w:cs="Times New Roman"/>
+          <w:color w:val="3B3B3B"/>
+          <w:kern w:val="0"/>
+          <w:sz w:val="21"/>
+          <w:szCs w:val="21"/>
+          <w14:ligatures w14:val="none"/>
+        </w:rPr>
+        <w:t>@</w:t>
+      </w:r>
+      <w:proofErr w:type="gramStart"/>
+      <w:r>
+        <w:rPr>
+          <w:rFonts w:ascii="Consolas" w:eastAsia="Times New Roman" w:hAnsi="Consolas" w:cs="Times New Roman"/>
+          <w:color w:val="267F99"/>
+          <w:kern w:val="0"/>
+          <w:sz w:val="21"/>
+          <w:szCs w:val="21"/>
+          <w14:ligatures w14:val="none"/>
+        </w:rPr>
+        <w:t>OneToMany</w:t>
+      </w:r>
+      <w:r>
+        <w:rPr>
+          <w:rFonts w:ascii="Consolas" w:eastAsia="Times New Roman" w:hAnsi="Consolas" w:cs="Times New Roman"/>
+          <w:color w:val="3B3B3B"/>
+          <w:kern w:val="0"/>
+          <w:sz w:val="21"/>
+          <w:szCs w:val="21"/>
+          <w14:ligatures w14:val="none"/>
+        </w:rPr>
+        <w:t>(</w:t>
+      </w:r>
+      <w:proofErr w:type="gramEnd"/>
+      <w:r>
+        <w:rPr>
+          <w:rFonts w:ascii="Consolas" w:eastAsia="Times New Roman" w:hAnsi="Consolas" w:cs="Times New Roman"/>
+          <w:color w:val="795E26"/>
+          <w:kern w:val="0"/>
+          <w:sz w:val="21"/>
+          <w:szCs w:val="21"/>
+          <w14:ligatures w14:val="none"/>
+        </w:rPr>
+        <w:t>mappedBy</w:t>
+      </w:r>
+      <w:r>
+        <w:rPr>
+          <w:rFonts w:ascii="Consolas" w:eastAsia="Times New Roman" w:hAnsi="Consolas" w:cs="Times New Roman"/>
+          <w:color w:val="3B3B3B"/>
+          <w:kern w:val="0"/>
+          <w:sz w:val="21"/>
+          <w:szCs w:val="21"/>
+          <w14:ligatures w14:val="none"/>
+        </w:rPr>
+        <w:t xml:space="preserve"> </w:t>
+      </w:r>
+      <w:r>
+        <w:rPr>
+          <w:rFonts w:ascii="Consolas" w:eastAsia="Times New Roman" w:hAnsi="Consolas" w:cs="Times New Roman"/>
+          <w:color w:val="000000"/>
+          <w:kern w:val="0"/>
+          <w:sz w:val="21"/>
+          <w:szCs w:val="21"/>
+          <w14:ligatures w14:val="none"/>
+        </w:rPr>
+        <w:t>=</w:t>
+      </w:r>
+      <w:r>
+        <w:rPr>
+          <w:rFonts w:ascii="Consolas" w:eastAsia="Times New Roman" w:hAnsi="Consolas" w:cs="Times New Roman"/>
+          <w:color w:val="3B3B3B"/>
+          <w:kern w:val="0"/>
+          <w:sz w:val="21"/>
+          <w:szCs w:val="21"/>
+          <w14:ligatures w14:val="none"/>
+        </w:rPr>
+        <w:t xml:space="preserve"> </w:t>
+      </w:r>
+      <w:r>
+        <w:rPr>
+          <w:rFonts w:ascii="Consolas" w:eastAsia="Times New Roman" w:hAnsi="Consolas" w:cs="Times New Roman"/>
+          <w:color w:val="A31515"/>
+          <w:kern w:val="0"/>
+          <w:sz w:val="21"/>
+          <w:szCs w:val="21"/>
+          <w14:ligatures w14:val="none"/>
+        </w:rPr>
+        <w:t>"user"</w:t>
+      </w:r>
+      <w:r>
+        <w:rPr>
+          <w:rFonts w:ascii="Consolas" w:eastAsia="Times New Roman" w:hAnsi="Consolas" w:cs="Times New Roman"/>
+          <w:color w:val="3B3B3B"/>
+          <w:kern w:val="0"/>
+          <w:sz w:val="21"/>
+          <w:szCs w:val="21"/>
+          <w14:ligatures w14:val="none"/>
+        </w:rPr>
+        <w:t xml:space="preserve">, </w:t>
+      </w:r>
+      <w:r>
+        <w:rPr>
+          <w:rFonts w:ascii="Consolas" w:eastAsia="Times New Roman" w:hAnsi="Consolas" w:cs="Times New Roman"/>
+          <w:color w:val="795E26"/>
+          <w:kern w:val="0"/>
+          <w:sz w:val="21"/>
+          <w:szCs w:val="21"/>
+          <w14:ligatures w14:val="none"/>
+        </w:rPr>
+        <w:t>cascade</w:t>
+      </w:r>
+      <w:r>
+        <w:rPr>
+          <w:rFonts w:ascii="Consolas" w:eastAsia="Times New Roman" w:hAnsi="Consolas" w:cs="Times New Roman"/>
+          <w:color w:val="3B3B3B"/>
+          <w:kern w:val="0"/>
+          <w:sz w:val="21"/>
+          <w:szCs w:val="21"/>
+          <w14:ligatures w14:val="none"/>
+        </w:rPr>
+        <w:t xml:space="preserve"> </w:t>
+      </w:r>
+      <w:r>
+        <w:rPr>
+          <w:rFonts w:ascii="Consolas" w:eastAsia="Times New Roman" w:hAnsi="Consolas" w:cs="Times New Roman"/>
+          <w:color w:val="000000"/>
+          <w:kern w:val="0"/>
+          <w:sz w:val="21"/>
+          <w:szCs w:val="21"/>
+          <w14:ligatures w14:val="none"/>
+        </w:rPr>
+        <w:t>=</w:t>
+      </w:r>
+      <w:r>
+        <w:rPr>
+          <w:rFonts w:ascii="Consolas" w:eastAsia="Times New Roman" w:hAnsi="Consolas" w:cs="Times New Roman"/>
+          <w:color w:val="3B3B3B"/>
+          <w:kern w:val="0"/>
+          <w:sz w:val="21"/>
+          <w:szCs w:val="21"/>
+          <w14:ligatures w14:val="none"/>
+        </w:rPr>
+        <w:t xml:space="preserve"> {</w:t>
+      </w:r>
+      <w:r>
+        <w:rPr>
+          <w:rFonts w:ascii="Consolas" w:eastAsia="Times New Roman" w:hAnsi="Consolas" w:cs="Times New Roman"/>
+          <w:color w:val="267F99"/>
+          <w:kern w:val="0"/>
+          <w:sz w:val="21"/>
+          <w:szCs w:val="21"/>
+          <w14:ligatures w14:val="none"/>
+        </w:rPr>
+        <w:t>CascadeType</w:t>
+      </w:r>
+      <w:r>
+        <w:rPr>
+          <w:rFonts w:ascii="Consolas" w:eastAsia="Times New Roman" w:hAnsi="Consolas" w:cs="Times New Roman"/>
+          <w:color w:val="3B3B3B"/>
+          <w:kern w:val="0"/>
+          <w:sz w:val="21"/>
+          <w:szCs w:val="21"/>
+          <w14:ligatures w14:val="none"/>
+        </w:rPr>
+        <w:t>.</w:t>
+      </w:r>
+      <w:r>
+        <w:rPr>
+          <w:rFonts w:ascii="Consolas" w:eastAsia="Times New Roman" w:hAnsi="Consolas" w:cs="Times New Roman"/>
+          <w:color w:val="0070C1"/>
+          <w:kern w:val="0"/>
+          <w:sz w:val="21"/>
+          <w:szCs w:val="21"/>
+          <w14:ligatures w14:val="none"/>
+        </w:rPr>
+        <w:t>PERSIST</w:t>
+      </w:r>
+      <w:r>
+        <w:rPr>
+          <w:rFonts w:ascii="Consolas" w:eastAsia="Times New Roman" w:hAnsi="Consolas" w:cs="Times New Roman"/>
+          <w:color w:val="3B3B3B"/>
+          <w:kern w:val="0"/>
+          <w:sz w:val="21"/>
+          <w:szCs w:val="21"/>
+          <w14:ligatures w14:val="none"/>
+        </w:rPr>
+        <w:t xml:space="preserve">, </w:t>
+      </w:r>
+      <w:r>
+        <w:rPr>
+          <w:rFonts w:ascii="Consolas" w:eastAsia="Times New Roman" w:hAnsi="Consolas" w:cs="Times New Roman"/>
+          <w:color w:val="267F99"/>
+          <w:kern w:val="0"/>
+          <w:sz w:val="21"/>
+          <w:szCs w:val="21"/>
+          <w14:ligatures w14:val="none"/>
+        </w:rPr>
+        <w:t>CascadeType</w:t>
+      </w:r>
+      <w:r>
+        <w:rPr>
+          <w:rFonts w:ascii="Consolas" w:eastAsia="Times New Roman" w:hAnsi="Consolas" w:cs="Times New Roman"/>
+          <w:color w:val="3B3B3B"/>
+          <w:kern w:val="0"/>
+          <w:sz w:val="21"/>
+          <w:szCs w:val="21"/>
+          <w14:ligatures w14:val="none"/>
+        </w:rPr>
+        <w:t>.</w:t>
+      </w:r>
+      <w:r>
+        <w:rPr>
+          <w:rFonts w:ascii="Consolas" w:eastAsia="Times New Roman" w:hAnsi="Consolas" w:cs="Times New Roman"/>
+          <w:color w:val="0070C1"/>
+          <w:kern w:val="0"/>
+          <w:sz w:val="21"/>
+          <w:szCs w:val="21"/>
+          <w14:ligatures w14:val="none"/>
+        </w:rPr>
+        <w:t>REMOVE</w:t>
+      </w:r>
+      <w:r>
+        <w:rPr>
+          <w:rFonts w:ascii="Consolas" w:eastAsia="Times New Roman" w:hAnsi="Consolas" w:cs="Times New Roman"/>
+          <w:color w:val="3B3B3B"/>
+          <w:kern w:val="0"/>
+          <w:sz w:val="21"/>
+          <w:szCs w:val="21"/>
+          <w14:ligatures w14:val="none"/>
+        </w:rPr>
+        <w:t xml:space="preserve">}, </w:t>
+      </w:r>
+      <w:r>
+        <w:rPr>
+          <w:rFonts w:ascii="Consolas" w:eastAsia="Times New Roman" w:hAnsi="Consolas" w:cs="Times New Roman"/>
+          <w:color w:val="795E26"/>
+          <w:kern w:val="0"/>
+          <w:sz w:val="21"/>
+          <w:szCs w:val="21"/>
+          <w14:ligatures w14:val="none"/>
+        </w:rPr>
+        <w:t>orphanRemoval</w:t>
+      </w:r>
+      <w:r>
+        <w:rPr>
+          <w:rFonts w:ascii="Consolas" w:eastAsia="Times New Roman" w:hAnsi="Consolas" w:cs="Times New Roman"/>
+          <w:color w:val="3B3B3B"/>
+          <w:kern w:val="0"/>
+          <w:sz w:val="21"/>
+          <w:szCs w:val="21"/>
+          <w14:ligatures w14:val="none"/>
+        </w:rPr>
+        <w:t xml:space="preserve"> </w:t>
+      </w:r>
+      <w:r>
+        <w:rPr>
+          <w:rFonts w:ascii="Consolas" w:eastAsia="Times New Roman" w:hAnsi="Consolas" w:cs="Times New Roman"/>
+          <w:color w:val="000000"/>
+          <w:kern w:val="0"/>
+          <w:sz w:val="21"/>
+          <w:szCs w:val="21"/>
+          <w14:ligatures w14:val="none"/>
+        </w:rPr>
+        <w:t>=</w:t>
+      </w:r>
+      <w:r>
+        <w:rPr>
+          <w:rFonts w:ascii="Consolas" w:eastAsia="Times New Roman" w:hAnsi="Consolas" w:cs="Times New Roman"/>
+          <w:color w:val="3B3B3B"/>
+          <w:kern w:val="0"/>
+          <w:sz w:val="21"/>
+          <w:szCs w:val="21"/>
+          <w14:ligatures w14:val="none"/>
+        </w:rPr>
+        <w:t xml:space="preserve"> </w:t>
+      </w:r>
+      <w:r>
+        <w:rPr>
+          <w:rFonts w:ascii="Consolas" w:eastAsia="Times New Roman" w:hAnsi="Consolas" w:cs="Times New Roman"/>
+          <w:color w:val="0000FF"/>
+          <w:kern w:val="0"/>
+          <w:sz w:val="21"/>
+          <w:szCs w:val="21"/>
+          <w14:ligatures w14:val="none"/>
+        </w:rPr>
+        <w:t>true</w:t>
+      </w:r>
+      <w:r>
+        <w:rPr>
+          <w:rFonts w:ascii="Consolas" w:eastAsia="Times New Roman" w:hAnsi="Consolas" w:cs="Times New Roman"/>
+          <w:color w:val="3B3B3B"/>
+          <w:kern w:val="0"/>
+          <w:sz w:val="21"/>
+          <w:szCs w:val="21"/>
+          <w14:ligatures w14:val="none"/>
+        </w:rPr>
+        <w:t xml:space="preserve">) </w:t>
+      </w:r>
+      <w:r>
+        <w:rPr>
+          <w:rFonts w:ascii="Consolas" w:eastAsia="Times New Roman" w:hAnsi="Consolas" w:cs="Times New Roman"/>
+          <w:color w:val="008000"/>
+          <w:kern w:val="0"/>
+          <w:sz w:val="21"/>
+          <w:szCs w:val="21"/>
+          <w14:ligatures w14:val="none"/>
+        </w:rPr>
+        <w:t>// this is the field in address-entity</w:t>
+      </w:r>
+    </w:p>
+    <w:p>
+      <w:pPr>
+        <w:shd w:val="clear" w:color="auto" w:fill="FFFFFF"/>
+        <w:spacing w:after="0" w:line="285" w:lineRule="atLeast"/>
+        <w:rPr>
+          <w:rFonts w:ascii="Consolas" w:eastAsia="Times New Roman" w:hAnsi="Consolas" w:cs="Times New Roman"/>
+          <w:color w:val="3B3B3B"/>
+          <w:kern w:val="0"/>
+          <w:sz w:val="21"/>
+          <w:szCs w:val="21"/>
+          <w14:ligatures w14:val="none"/>
+        </w:rPr>
+      </w:pPr>
+      <w:r>
+        <w:rPr>
+          <w:rFonts w:ascii="Consolas" w:eastAsia="Times New Roman" w:hAnsi="Consolas" w:cs="Times New Roman"/>
+          <w:color w:val="3B3B3B"/>
+          <w:kern w:val="0"/>
+          <w:sz w:val="21"/>
+          <w:szCs w:val="21"/>
+          <w14:ligatures w14:val="none"/>
+        </w:rPr>
+        <w:t>    @</w:t>
+      </w:r>
+      <w:r>
+        <w:rPr>
+          <w:rFonts w:ascii="Consolas" w:eastAsia="Times New Roman" w:hAnsi="Consolas" w:cs="Times New Roman"/>
+          <w:color w:val="267F99"/>
+          <w:kern w:val="0"/>
+          <w:sz w:val="21"/>
+          <w:szCs w:val="21"/>
+          <w14:ligatures w14:val="none"/>
+        </w:rPr>
+        <w:t>Builder</w:t>
+      </w:r>
+      <w:r>
+        <w:rPr>
+          <w:rFonts w:ascii="Consolas" w:eastAsia="Times New Roman" w:hAnsi="Consolas" w:cs="Times New Roman"/>
+          <w:color w:val="3B3B3B"/>
+          <w:kern w:val="0"/>
+          <w:sz w:val="21"/>
+          <w:szCs w:val="21"/>
+          <w14:ligatures w14:val="none"/>
+        </w:rPr>
+        <w:t>.</w:t>
+      </w:r>
+      <w:r>
+        <w:rPr>
+          <w:rFonts w:ascii="Consolas" w:eastAsia="Times New Roman" w:hAnsi="Consolas" w:cs="Times New Roman"/>
+          <w:color w:val="267F99"/>
+          <w:kern w:val="0"/>
+          <w:sz w:val="21"/>
+          <w:szCs w:val="21"/>
+          <w14:ligatures w14:val="none"/>
+        </w:rPr>
+        <w:t>Default</w:t>
+      </w:r>
+    </w:p>
+    <w:p>
+      <w:pPr>
+        <w:shd w:val="clear" w:color="auto" w:fill="FFFFFF"/>
+        <w:spacing w:after="0" w:line="285" w:lineRule="atLeast"/>
+        <w:rPr>
+          <w:rFonts w:ascii="Consolas" w:eastAsia="Times New Roman" w:hAnsi="Consolas" w:cs="Times New Roman"/>
+          <w:color w:val="3B3B3B"/>
+          <w:kern w:val="0"/>
+          <w:sz w:val="21"/>
+          <w:szCs w:val="21"/>
+          <w14:ligatures w14:val="none"/>
+        </w:rPr>
+      </w:pPr>
+      <w:r>
+        <w:rPr>
+          <w:rFonts w:ascii="Consolas" w:eastAsia="Times New Roman" w:hAnsi="Consolas" w:cs="Times New Roman"/>
+          <w:color w:val="3B3B3B"/>
+          <w:kern w:val="0"/>
+          <w:sz w:val="21"/>
+          <w:szCs w:val="21"/>
+          <w14:ligatures w14:val="none"/>
+        </w:rPr>
+        <w:t xml:space="preserve">    </w:t>
+      </w:r>
+      <w:r>
+        <w:rPr>
+          <w:rFonts w:ascii="Consolas" w:eastAsia="Times New Roman" w:hAnsi="Consolas" w:cs="Times New Roman"/>
+          <w:color w:val="008000"/>
+          <w:kern w:val="0"/>
+          <w:sz w:val="21"/>
+          <w:szCs w:val="21"/>
+          <w14:ligatures w14:val="none"/>
+        </w:rPr>
+        <w:t>// private final List&lt;Address&gt; addresses = new ArrayList&lt;</w:t>
+      </w:r>
+      <w:proofErr w:type="gramStart"/>
+      <w:r>
+        <w:rPr>
+          <w:rFonts w:ascii="Consolas" w:eastAsia="Times New Roman" w:hAnsi="Consolas" w:cs="Times New Roman"/>
+          <w:color w:val="008000"/>
+          <w:kern w:val="0"/>
+          <w:sz w:val="21"/>
+          <w:szCs w:val="21"/>
+          <w14:ligatures w14:val="none"/>
+        </w:rPr>
+        <w:t>&gt;(</w:t>
+      </w:r>
+      <w:proofErr w:type="gramEnd"/>
+      <w:r>
+        <w:rPr>
+          <w:rFonts w:ascii="Consolas" w:eastAsia="Times New Roman" w:hAnsi="Consolas" w:cs="Times New Roman"/>
+          <w:color w:val="008000"/>
+          <w:kern w:val="0"/>
+          <w:sz w:val="21"/>
+          <w:szCs w:val="21"/>
+          <w14:ligatures w14:val="none"/>
+        </w:rPr>
+        <w:t>);</w:t>
+      </w:r>
+    </w:p>
+    <w:p>
+      <w:pPr>
+        <w:shd w:val="clear" w:color="auto" w:fill="FFFFFF"/>
+        <w:spacing w:after="0" w:line="285" w:lineRule="atLeast"/>
+        <w:rPr>
+          <w:rFonts w:ascii="Consolas" w:eastAsia="Times New Roman" w:hAnsi="Consolas" w:cs="Times New Roman"/>
+          <w:color w:val="3B3B3B"/>
+          <w:kern w:val="0"/>
+          <w:sz w:val="21"/>
+          <w:szCs w:val="21"/>
+          <w14:ligatures w14:val="none"/>
+        </w:rPr>
+      </w:pPr>
+      <w:r>
+        <w:rPr>
+          <w:rFonts w:ascii="Consolas" w:eastAsia="Times New Roman" w:hAnsi="Consolas" w:cs="Times New Roman"/>
+          <w:color w:val="3B3B3B"/>
+          <w:kern w:val="0"/>
+          <w:sz w:val="21"/>
+          <w:szCs w:val="21"/>
+          <w14:ligatures w14:val="none"/>
+        </w:rPr>
+        <w:t xml:space="preserve">    </w:t>
+      </w:r>
+      <w:r>
+        <w:rPr>
+          <w:rFonts w:ascii="Consolas" w:eastAsia="Times New Roman" w:hAnsi="Consolas" w:cs="Times New Roman"/>
+          <w:color w:val="0000FF"/>
+          <w:kern w:val="0"/>
+          <w:sz w:val="21"/>
+          <w:szCs w:val="21"/>
+          <w14:ligatures w14:val="none"/>
+        </w:rPr>
+        <w:t>private</w:t>
+      </w:r>
+      <w:r>
+        <w:rPr>
+          <w:rFonts w:ascii="Consolas" w:eastAsia="Times New Roman" w:hAnsi="Consolas" w:cs="Times New Roman"/>
+          <w:color w:val="3B3B3B"/>
+          <w:kern w:val="0"/>
+          <w:sz w:val="21"/>
+          <w:szCs w:val="21"/>
+          <w14:ligatures w14:val="none"/>
+        </w:rPr>
+        <w:t xml:space="preserve"> </w:t>
+      </w:r>
+      <w:r>
+        <w:rPr>
+          <w:rFonts w:ascii="Consolas" w:eastAsia="Times New Roman" w:hAnsi="Consolas" w:cs="Times New Roman"/>
+          <w:color w:val="267F99"/>
+          <w:kern w:val="0"/>
+          <w:sz w:val="21"/>
+          <w:szCs w:val="21"/>
+          <w14:ligatures w14:val="none"/>
+        </w:rPr>
+        <w:t>List</w:t>
+      </w:r>
+      <w:r>
+        <w:rPr>
+          <w:rFonts w:ascii="Consolas" w:eastAsia="Times New Roman" w:hAnsi="Consolas" w:cs="Times New Roman"/>
+          <w:color w:val="3B3B3B"/>
+          <w:kern w:val="0"/>
+          <w:sz w:val="21"/>
+          <w:szCs w:val="21"/>
+          <w14:ligatures w14:val="none"/>
+        </w:rPr>
+        <w:t>&lt;</w:t>
+      </w:r>
+      <w:r>
+        <w:rPr>
+          <w:rFonts w:ascii="Consolas" w:eastAsia="Times New Roman" w:hAnsi="Consolas" w:cs="Times New Roman"/>
+          <w:color w:val="267F99"/>
+          <w:kern w:val="0"/>
+          <w:sz w:val="21"/>
+          <w:szCs w:val="21"/>
+          <w14:ligatures w14:val="none"/>
+        </w:rPr>
+        <w:t>Address</w:t>
+      </w:r>
+      <w:r>
+        <w:rPr>
+          <w:rFonts w:ascii="Consolas" w:eastAsia="Times New Roman" w:hAnsi="Consolas" w:cs="Times New Roman"/>
+          <w:color w:val="3B3B3B"/>
+          <w:kern w:val="0"/>
+          <w:sz w:val="21"/>
+          <w:szCs w:val="21"/>
+          <w14:ligatures w14:val="none"/>
+        </w:rPr>
+        <w:t xml:space="preserve">&gt; </w:t>
+      </w:r>
+      <w:r>
+        <w:rPr>
+          <w:rFonts w:ascii="Consolas" w:eastAsia="Times New Roman" w:hAnsi="Consolas" w:cs="Times New Roman"/>
+          <w:color w:val="001080"/>
+          <w:kern w:val="0"/>
+          <w:sz w:val="21"/>
+          <w:szCs w:val="21"/>
+          <w14:ligatures w14:val="none"/>
+        </w:rPr>
+        <w:t>addresses</w:t>
+      </w:r>
+      <w:r>
+        <w:rPr>
+          <w:rFonts w:ascii="Consolas" w:eastAsia="Times New Roman" w:hAnsi="Consolas" w:cs="Times New Roman"/>
+          <w:color w:val="3B3B3B"/>
+          <w:kern w:val="0"/>
+          <w:sz w:val="21"/>
+          <w:szCs w:val="21"/>
+          <w14:ligatures w14:val="none"/>
+        </w:rPr>
+        <w:t xml:space="preserve"> </w:t>
+      </w:r>
+      <w:r>
+        <w:rPr>
+          <w:rFonts w:ascii="Consolas" w:eastAsia="Times New Roman" w:hAnsi="Consolas" w:cs="Times New Roman"/>
+          <w:color w:val="000000"/>
+          <w:kern w:val="0"/>
+          <w:sz w:val="21"/>
+          <w:szCs w:val="21"/>
+          <w14:ligatures w14:val="none"/>
+        </w:rPr>
+        <w:t>=</w:t>
+      </w:r>
+      <w:r>
+        <w:rPr>
+          <w:rFonts w:ascii="Consolas" w:eastAsia="Times New Roman" w:hAnsi="Consolas" w:cs="Times New Roman"/>
+          <w:color w:val="3B3B3B"/>
+          <w:kern w:val="0"/>
+          <w:sz w:val="21"/>
+          <w:szCs w:val="21"/>
+          <w14:ligatures w14:val="none"/>
+        </w:rPr>
+        <w:t xml:space="preserve"> </w:t>
+      </w:r>
+      <w:r>
+        <w:rPr>
+          <w:rFonts w:ascii="Consolas" w:eastAsia="Times New Roman" w:hAnsi="Consolas" w:cs="Times New Roman"/>
+          <w:color w:val="AF00DB"/>
+          <w:kern w:val="0"/>
+          <w:sz w:val="21"/>
+          <w:szCs w:val="21"/>
+          <w14:ligatures w14:val="none"/>
+        </w:rPr>
+        <w:t>new</w:t>
+      </w:r>
+      <w:r>
+        <w:rPr>
+          <w:rFonts w:ascii="Consolas" w:eastAsia="Times New Roman" w:hAnsi="Consolas" w:cs="Times New Roman"/>
+          <w:color w:val="3B3B3B"/>
+          <w:kern w:val="0"/>
+          <w:sz w:val="21"/>
+          <w:szCs w:val="21"/>
+          <w14:ligatures w14:val="none"/>
+        </w:rPr>
+        <w:t xml:space="preserve"> </w:t>
+      </w:r>
+      <w:r>
+        <w:rPr>
+          <w:rFonts w:ascii="Consolas" w:eastAsia="Times New Roman" w:hAnsi="Consolas" w:cs="Times New Roman"/>
+          <w:color w:val="795E26"/>
+          <w:kern w:val="0"/>
+          <w:sz w:val="21"/>
+          <w:szCs w:val="21"/>
+          <w14:ligatures w14:val="none"/>
+        </w:rPr>
+        <w:t>ArrayList</w:t>
+      </w:r>
+      <w:r>
+        <w:rPr>
+          <w:rFonts w:ascii="Consolas" w:eastAsia="Times New Roman" w:hAnsi="Consolas" w:cs="Times New Roman"/>
+          <w:color w:val="3B3B3B"/>
+          <w:kern w:val="0"/>
+          <w:sz w:val="21"/>
+          <w:szCs w:val="21"/>
+          <w14:ligatures w14:val="none"/>
+        </w:rPr>
+        <w:t>&lt;</w:t>
+      </w:r>
+      <w:proofErr w:type="gramStart"/>
+      <w:r>
+        <w:rPr>
+          <w:rFonts w:ascii="Consolas" w:eastAsia="Times New Roman" w:hAnsi="Consolas" w:cs="Times New Roman"/>
+          <w:color w:val="3B3B3B"/>
+          <w:kern w:val="0"/>
+          <w:sz w:val="21"/>
+          <w:szCs w:val="21"/>
+          <w14:ligatures w14:val="none"/>
+        </w:rPr>
+        <w:t>&gt;(</w:t>
+      </w:r>
+      <w:proofErr w:type="gramEnd"/>
+      <w:r>
+        <w:rPr>
+          <w:rFonts w:ascii="Consolas" w:eastAsia="Times New Roman" w:hAnsi="Consolas" w:cs="Times New Roman"/>
+          <w:color w:val="3B3B3B"/>
+          <w:kern w:val="0"/>
+          <w:sz w:val="21"/>
+          <w:szCs w:val="21"/>
+          <w14:ligatures w14:val="none"/>
+        </w:rPr>
+        <w:t>);</w:t>
+      </w:r>
+    </w:p>
+    <w:p>
+      <w:pPr>
+        <w:ind w:left="720" w:firstLine="720"/>
+      </w:pPr>
+      <w:r>
+        <w:t>===========================================</w:t>
+      </w:r>
+    </w:p>
+    <w:p>
+      <w:pPr>
+        <w:rPr>
+          <w:rFonts w:ascii="Sakkal Majalla" w:hAnsi="Sakkal Majalla" w:cs="Sakkal Majalla"/>
+          <w:sz w:val="28"/>
+          <w:szCs w:val="28"/>
+        </w:rPr>
+      </w:pPr>
+      <w:r>
+        <w:rPr>
+          <w:rFonts w:ascii="Sakkal Majalla" w:hAnsi="Sakkal Majalla" w:cs="Sakkal Majalla"/>
+          <w:sz w:val="28"/>
+          <w:szCs w:val="28"/>
+        </w:rPr>
+        <w:t xml:space="preserve">To solve the issue of transient objects in Spring Boot, we can use </w:t>
+      </w:r>
+      <w:r>
+        <w:rPr>
+          <w:rFonts w:ascii="Sakkal Majalla" w:hAnsi="Sakkal Majalla" w:cs="Sakkal Majalla"/>
+          <w:b/>
+          <w:bCs/>
+          <w:i/>
+          <w:iCs/>
+          <w:color w:val="3A7C22" w:themeColor="accent6" w:themeShade="BF"/>
+          <w:sz w:val="28"/>
+          <w:szCs w:val="28"/>
+        </w:rPr>
+        <w:t>@Transactional</w:t>
+      </w:r>
+      <w:r>
+        <w:rPr>
+          <w:rFonts w:ascii="Sakkal Majalla" w:hAnsi="Sakkal Majalla" w:cs="Sakkal Majalla"/>
+          <w:sz w:val="28"/>
+          <w:szCs w:val="28"/>
+        </w:rPr>
+        <w:t>-annotation.</w:t>
+      </w:r>
+    </w:p>
+    <w:p>
+      <w:pPr>
+        <w:ind w:left="720" w:firstLine="720"/>
+      </w:pPr>
+      <w:r>
+        <w:t>===========================================</w:t>
+      </w:r>
     </w:p>
     <w:sectPr>
       <w:pgSz w:w="12240" w:h="15840"/>
@@ -3492,7 +5899,7 @@
   <w:style w:type="paragraph" w:default="1" w:styleId="Normal">
     <w:name w:val="Normal"/>
     <w:qFormat/>
-    <w:rsid w:val="00CE77E8"/>
+    <w:rsid w:val="00E7787A"/>
   </w:style>
   <w:style w:type="paragraph" w:styleId="Heading1">
     <w:name w:val="heading 1"/>

</xml_diff>

<commit_message>
Adding spring boot notes about the custom and derived queries
</commit_message>
<xml_diff>
--- a/Spring-Boot/Part-01/Spring-Boot-Notes-03.docx
+++ b/Spring-Boot/Part-01/Spring-Boot-Notes-03.docx
@@ -40,7 +40,7 @@
                     <pic:cNvPicPr/>
                   </pic:nvPicPr>
                   <pic:blipFill>
-                    <a:blip r:embed="rId4"/>
+                    <a:blip r:embed="rId6"/>
                     <a:stretch>
                       <a:fillRect/>
                     </a:stretch>
@@ -91,7 +91,7 @@
                     <pic:cNvPicPr/>
                   </pic:nvPicPr>
                   <pic:blipFill>
-                    <a:blip r:embed="rId5"/>
+                    <a:blip r:embed="rId7"/>
                     <a:stretch>
                       <a:fillRect/>
                     </a:stretch>
@@ -2534,7 +2534,7 @@
                     <pic:cNvPicPr/>
                   </pic:nvPicPr>
                   <pic:blipFill>
-                    <a:blip r:embed="rId6"/>
+                    <a:blip r:embed="rId8"/>
                     <a:stretch>
                       <a:fillRect/>
                     </a:stretch>
@@ -5489,6 +5489,2882 @@
         <w:t>===========================================</w:t>
       </w:r>
     </w:p>
+    <w:p>
+      <w:pPr>
+        <w:rPr>
+          <w:rFonts w:ascii="Sakkal Majalla" w:hAnsi="Sakkal Majalla" w:cs="Sakkal Majalla"/>
+          <w:sz w:val="28"/>
+          <w:szCs w:val="28"/>
+        </w:rPr>
+      </w:pPr>
+      <w:r>
+        <w:rPr>
+          <w:rFonts w:ascii="Sakkal Majalla" w:hAnsi="Sakkal Majalla" w:cs="Sakkal Majalla"/>
+          <w:sz w:val="28"/>
+          <w:szCs w:val="28"/>
+        </w:rPr>
+        <w:lastRenderedPageBreak/>
+        <w:t>When designing the table schema, we should take into account the FK behaviour for delete and update, so we reduce the number of migration files.</w:t>
+      </w:r>
+    </w:p>
+    <w:p>
+      <w:pPr>
+        <w:ind w:left="720" w:firstLine="720"/>
+      </w:pPr>
+      <w:r>
+        <w:t>===========================================</w:t>
+      </w:r>
+    </w:p>
+    <w:p>
+      <w:pPr>
+        <w:rPr>
+          <w:rFonts w:ascii="Sakkal Majalla" w:hAnsi="Sakkal Majalla" w:cs="Sakkal Majalla"/>
+          <w:sz w:val="28"/>
+          <w:szCs w:val="28"/>
+          <w:rtl/>
+        </w:rPr>
+      </w:pPr>
+      <w:r>
+        <w:rPr>
+          <w:rFonts w:ascii="Sakkal Majalla" w:hAnsi="Sakkal Majalla" w:cs="Sakkal Majalla"/>
+          <w:sz w:val="28"/>
+          <w:szCs w:val="28"/>
+        </w:rPr>
+        <w:t xml:space="preserve">If we set </w:t>
+      </w:r>
+      <w:r>
+        <w:rPr>
+          <w:rFonts w:ascii="Sakkal Majalla" w:hAnsi="Sakkal Majalla" w:cs="Sakkal Majalla"/>
+          <w:sz w:val="28"/>
+          <w:szCs w:val="28"/>
+        </w:rPr>
+        <w:t>a like keyword to the derived method of the repository, the CRUD repository will use like instead of equals.</w:t>
+      </w:r>
+    </w:p>
+    <w:p>
+      <w:pPr>
+        <w:rPr>
+          <w:rFonts w:ascii="Sakkal Majalla" w:hAnsi="Sakkal Majalla" w:cs="Sakkal Majalla"/>
+          <w:sz w:val="28"/>
+          <w:szCs w:val="28"/>
+        </w:rPr>
+      </w:pPr>
+      <w:r>
+        <w:rPr>
+          <w:rFonts w:ascii="Sakkal Majalla" w:hAnsi="Sakkal Majalla" w:cs="Sakkal Majalla"/>
+          <w:sz w:val="28"/>
+          <w:szCs w:val="28"/>
+        </w:rPr>
+        <w:t xml:space="preserve">The same we can use </w:t>
+      </w:r>
+      <w:r>
+        <w:rPr>
+          <w:rFonts w:ascii="Sakkal Majalla" w:hAnsi="Sakkal Majalla" w:cs="Sakkal Majalla"/>
+          <w:b/>
+          <w:bCs/>
+          <w:color w:val="0070C0"/>
+          <w:sz w:val="28"/>
+          <w:szCs w:val="28"/>
+        </w:rPr>
+        <w:t>Containing</w:t>
+      </w:r>
+      <w:r>
+        <w:rPr>
+          <w:rFonts w:ascii="Sakkal Majalla" w:hAnsi="Sakkal Majalla" w:cs="Sakkal Majalla"/>
+          <w:sz w:val="28"/>
+          <w:szCs w:val="28"/>
+        </w:rPr>
+        <w:t xml:space="preserve">, </w:t>
+      </w:r>
+      <w:proofErr w:type="spellStart"/>
+      <w:r>
+        <w:rPr>
+          <w:rFonts w:ascii="Sakkal Majalla" w:hAnsi="Sakkal Majalla" w:cs="Sakkal Majalla"/>
+          <w:b/>
+          <w:bCs/>
+          <w:color w:val="0070C0"/>
+          <w:sz w:val="28"/>
+          <w:szCs w:val="28"/>
+        </w:rPr>
+        <w:t>StartingWith</w:t>
+      </w:r>
+      <w:proofErr w:type="spellEnd"/>
+      <w:r>
+        <w:rPr>
+          <w:rFonts w:ascii="Sakkal Majalla" w:hAnsi="Sakkal Majalla" w:cs="Sakkal Majalla"/>
+          <w:sz w:val="28"/>
+          <w:szCs w:val="28"/>
+        </w:rPr>
+        <w:t xml:space="preserve">, </w:t>
+      </w:r>
+      <w:proofErr w:type="spellStart"/>
+      <w:r>
+        <w:rPr>
+          <w:rFonts w:ascii="Sakkal Majalla" w:hAnsi="Sakkal Majalla" w:cs="Sakkal Majalla"/>
+          <w:b/>
+          <w:bCs/>
+          <w:color w:val="0070C0"/>
+          <w:sz w:val="28"/>
+          <w:szCs w:val="28"/>
+        </w:rPr>
+        <w:t>EndingWith</w:t>
+      </w:r>
+      <w:proofErr w:type="spellEnd"/>
+      <w:r>
+        <w:rPr>
+          <w:rFonts w:ascii="Sakkal Majalla" w:hAnsi="Sakkal Majalla" w:cs="Sakkal Majalla"/>
+          <w:sz w:val="28"/>
+          <w:szCs w:val="28"/>
+        </w:rPr>
+        <w:t xml:space="preserve">, </w:t>
+      </w:r>
+      <w:r>
+        <w:rPr>
+          <w:rFonts w:ascii="Sakkal Majalla" w:hAnsi="Sakkal Majalla" w:cs="Sakkal Majalla"/>
+          <w:b/>
+          <w:bCs/>
+          <w:color w:val="A6A6A6" w:themeColor="background1" w:themeShade="A6"/>
+          <w:sz w:val="28"/>
+          <w:szCs w:val="28"/>
+        </w:rPr>
+        <w:t>etc</w:t>
+      </w:r>
+      <w:r>
+        <w:rPr>
+          <w:rFonts w:ascii="Sakkal Majalla" w:hAnsi="Sakkal Majalla" w:cs="Sakkal Majalla"/>
+          <w:sz w:val="28"/>
+          <w:szCs w:val="28"/>
+        </w:rPr>
+        <w:t>.</w:t>
+      </w:r>
+    </w:p>
+    <w:p>
+      <w:pPr>
+        <w:rPr>
+          <w:rFonts w:ascii="Sakkal Majalla" w:hAnsi="Sakkal Majalla" w:cs="Sakkal Majalla"/>
+          <w:sz w:val="28"/>
+          <w:szCs w:val="28"/>
+        </w:rPr>
+      </w:pPr>
+      <w:r>
+        <w:rPr>
+          <w:rFonts w:ascii="Sakkal Majalla" w:hAnsi="Sakkal Majalla" w:cs="Sakkal Majalla"/>
+          <w:sz w:val="28"/>
+          <w:szCs w:val="28"/>
+        </w:rPr>
+        <w:t xml:space="preserve">All the above methods are case sensitive; to make them case insensitive, we should add: </w:t>
+      </w:r>
+      <w:proofErr w:type="spellStart"/>
+      <w:r>
+        <w:rPr>
+          <w:rFonts w:ascii="Sakkal Majalla" w:hAnsi="Sakkal Majalla" w:cs="Sakkal Majalla"/>
+          <w:b/>
+          <w:bCs/>
+          <w:color w:val="0070C0"/>
+          <w:sz w:val="28"/>
+          <w:szCs w:val="28"/>
+        </w:rPr>
+        <w:t>IgnoreCase</w:t>
+      </w:r>
+      <w:proofErr w:type="spellEnd"/>
+      <w:r>
+        <w:rPr>
+          <w:rFonts w:ascii="Sakkal Majalla" w:hAnsi="Sakkal Majalla" w:cs="Sakkal Majalla"/>
+          <w:sz w:val="28"/>
+          <w:szCs w:val="28"/>
+        </w:rPr>
+        <w:t>.</w:t>
+      </w:r>
+    </w:p>
+    <w:p>
+      <w:pPr>
+        <w:rPr>
+          <w:rFonts w:ascii="Sakkal Majalla" w:hAnsi="Sakkal Majalla" w:cs="Sakkal Majalla"/>
+          <w:sz w:val="28"/>
+          <w:szCs w:val="28"/>
+        </w:rPr>
+      </w:pPr>
+      <w:r>
+        <w:rPr>
+          <w:rFonts w:ascii="Sakkal Majalla" w:hAnsi="Sakkal Majalla" w:cs="Sakkal Majalla"/>
+          <w:b/>
+          <w:bCs/>
+          <w:color w:val="A6A6A6" w:themeColor="background1" w:themeShade="A6"/>
+          <w:sz w:val="28"/>
+          <w:szCs w:val="28"/>
+        </w:rPr>
+        <w:t>Ex</w:t>
+      </w:r>
+      <w:r>
+        <w:rPr>
+          <w:rFonts w:ascii="Sakkal Majalla" w:hAnsi="Sakkal Majalla" w:cs="Sakkal Majalla"/>
+          <w:sz w:val="28"/>
+          <w:szCs w:val="28"/>
+        </w:rPr>
+        <w:t xml:space="preserve">: </w:t>
+      </w:r>
+      <w:r>
+        <w:rPr>
+          <w:rFonts w:ascii="Sakkal Majalla" w:hAnsi="Sakkal Majalla" w:cs="Sakkal Majalla"/>
+          <w:b/>
+          <w:bCs/>
+          <w:color w:val="3A7C22" w:themeColor="accent6" w:themeShade="BF"/>
+          <w:sz w:val="28"/>
+          <w:szCs w:val="28"/>
+        </w:rPr>
+        <w:t xml:space="preserve">public </w:t>
+      </w:r>
+      <w:r>
+        <w:rPr>
+          <w:rFonts w:ascii="Sakkal Majalla" w:hAnsi="Sakkal Majalla" w:cs="Sakkal Majalla"/>
+          <w:b/>
+          <w:bCs/>
+          <w:color w:val="BF4E14" w:themeColor="accent2" w:themeShade="BF"/>
+          <w:sz w:val="28"/>
+          <w:szCs w:val="28"/>
+        </w:rPr>
+        <w:t>List</w:t>
+      </w:r>
+      <w:r>
+        <w:rPr>
+          <w:rFonts w:ascii="Sakkal Majalla" w:hAnsi="Sakkal Majalla" w:cs="Sakkal Majalla"/>
+          <w:b/>
+          <w:bCs/>
+          <w:sz w:val="28"/>
+          <w:szCs w:val="28"/>
+        </w:rPr>
+        <w:t>&lt;</w:t>
+      </w:r>
+      <w:r>
+        <w:rPr>
+          <w:rFonts w:ascii="Sakkal Majalla" w:hAnsi="Sakkal Majalla" w:cs="Sakkal Majalla"/>
+          <w:b/>
+          <w:bCs/>
+          <w:color w:val="BF4E14" w:themeColor="accent2" w:themeShade="BF"/>
+          <w:sz w:val="28"/>
+          <w:szCs w:val="28"/>
+        </w:rPr>
+        <w:t>Product</w:t>
+      </w:r>
+      <w:r>
+        <w:rPr>
+          <w:rFonts w:ascii="Sakkal Majalla" w:hAnsi="Sakkal Majalla" w:cs="Sakkal Majalla"/>
+          <w:b/>
+          <w:bCs/>
+          <w:sz w:val="28"/>
+          <w:szCs w:val="28"/>
+        </w:rPr>
+        <w:t xml:space="preserve">&gt; </w:t>
+      </w:r>
+      <w:r>
+        <w:rPr>
+          <w:rFonts w:ascii="Sakkal Majalla" w:hAnsi="Sakkal Majalla" w:cs="Sakkal Majalla"/>
+          <w:b/>
+          <w:bCs/>
+          <w:color w:val="C00000"/>
+          <w:sz w:val="28"/>
+          <w:szCs w:val="28"/>
+        </w:rPr>
+        <w:t>findNyNameLike</w:t>
+      </w:r>
+      <w:r>
+        <w:rPr>
+          <w:rFonts w:ascii="Sakkal Majalla" w:hAnsi="Sakkal Majalla" w:cs="Sakkal Majalla"/>
+          <w:b/>
+          <w:bCs/>
+          <w:color w:val="C00000"/>
+          <w:sz w:val="28"/>
+          <w:szCs w:val="28"/>
+        </w:rPr>
+        <w:t xml:space="preserve"> </w:t>
+      </w:r>
+      <w:r>
+        <w:rPr>
+          <w:rFonts w:ascii="Sakkal Majalla" w:hAnsi="Sakkal Majalla" w:cs="Sakkal Majalla"/>
+          <w:b/>
+          <w:bCs/>
+          <w:sz w:val="28"/>
+          <w:szCs w:val="28"/>
+        </w:rPr>
+        <w:t>(</w:t>
+      </w:r>
+      <w:r>
+        <w:rPr>
+          <w:rFonts w:ascii="Sakkal Majalla" w:hAnsi="Sakkal Majalla" w:cs="Sakkal Majalla"/>
+          <w:b/>
+          <w:bCs/>
+          <w:color w:val="BF4E14" w:themeColor="accent2" w:themeShade="BF"/>
+          <w:sz w:val="28"/>
+          <w:szCs w:val="28"/>
+        </w:rPr>
+        <w:t xml:space="preserve">string </w:t>
+      </w:r>
+      <w:r>
+        <w:rPr>
+          <w:rFonts w:ascii="Sakkal Majalla" w:hAnsi="Sakkal Majalla" w:cs="Sakkal Majalla"/>
+          <w:b/>
+          <w:bCs/>
+          <w:color w:val="3A7C22" w:themeColor="accent6" w:themeShade="BF"/>
+          <w:sz w:val="28"/>
+          <w:szCs w:val="28"/>
+        </w:rPr>
+        <w:t>productName</w:t>
+      </w:r>
+      <w:r>
+        <w:rPr>
+          <w:rFonts w:ascii="Sakkal Majalla" w:hAnsi="Sakkal Majalla" w:cs="Sakkal Majalla"/>
+          <w:b/>
+          <w:bCs/>
+          <w:sz w:val="28"/>
+          <w:szCs w:val="28"/>
+        </w:rPr>
+        <w:t>);</w:t>
+      </w:r>
+    </w:p>
+    <w:p>
+      <w:pPr>
+        <w:ind w:left="720" w:firstLine="720"/>
+      </w:pPr>
+      <w:r>
+        <w:t>===========================================</w:t>
+      </w:r>
+    </w:p>
+    <w:p>
+      <w:pPr>
+        <w:rPr>
+          <w:rFonts w:ascii="Sakkal Majalla" w:hAnsi="Sakkal Majalla" w:cs="Sakkal Majalla"/>
+          <w:sz w:val="28"/>
+          <w:szCs w:val="28"/>
+          <w:lang w:bidi="ar-SY"/>
+        </w:rPr>
+      </w:pPr>
+      <w:r>
+        <w:rPr>
+          <w:rFonts w:ascii="Sakkal Majalla" w:hAnsi="Sakkal Majalla" w:cs="Sakkal Majalla"/>
+          <w:sz w:val="28"/>
+          <w:szCs w:val="28"/>
+          <w:lang w:bidi="ar-SY"/>
+        </w:rPr>
+        <w:t xml:space="preserve">For the numbers like prices, we can use: </w:t>
+      </w:r>
+      <w:proofErr w:type="spellStart"/>
+      <w:r>
+        <w:rPr>
+          <w:rFonts w:ascii="Sakkal Majalla" w:hAnsi="Sakkal Majalla" w:cs="Sakkal Majalla"/>
+          <w:b/>
+          <w:bCs/>
+          <w:color w:val="BF4E14" w:themeColor="accent2" w:themeShade="BF"/>
+          <w:sz w:val="28"/>
+          <w:szCs w:val="28"/>
+          <w:lang w:bidi="ar-SY"/>
+        </w:rPr>
+        <w:t>GreaterThan</w:t>
+      </w:r>
+      <w:proofErr w:type="spellEnd"/>
+      <w:r>
+        <w:rPr>
+          <w:rFonts w:ascii="Sakkal Majalla" w:hAnsi="Sakkal Majalla" w:cs="Sakkal Majalla"/>
+          <w:sz w:val="28"/>
+          <w:szCs w:val="28"/>
+          <w:lang w:bidi="ar-SY"/>
+        </w:rPr>
+        <w:t xml:space="preserve">, </w:t>
+      </w:r>
+      <w:r>
+        <w:rPr>
+          <w:rFonts w:ascii="Sakkal Majalla" w:hAnsi="Sakkal Majalla" w:cs="Sakkal Majalla"/>
+          <w:b/>
+          <w:bCs/>
+          <w:color w:val="BF4E14" w:themeColor="accent2" w:themeShade="BF"/>
+          <w:sz w:val="28"/>
+          <w:szCs w:val="28"/>
+          <w:lang w:bidi="ar-SY"/>
+        </w:rPr>
+        <w:t>Between</w:t>
+      </w:r>
+      <w:r>
+        <w:rPr>
+          <w:rFonts w:ascii="Sakkal Majalla" w:hAnsi="Sakkal Majalla" w:cs="Sakkal Majalla"/>
+          <w:sz w:val="28"/>
+          <w:szCs w:val="28"/>
+          <w:lang w:bidi="ar-SY"/>
+        </w:rPr>
+        <w:t xml:space="preserve">, </w:t>
+      </w:r>
+      <w:proofErr w:type="spellStart"/>
+      <w:r>
+        <w:rPr>
+          <w:rFonts w:ascii="Sakkal Majalla" w:hAnsi="Sakkal Majalla" w:cs="Sakkal Majalla"/>
+          <w:b/>
+          <w:bCs/>
+          <w:color w:val="BF4E14" w:themeColor="accent2" w:themeShade="BF"/>
+          <w:sz w:val="28"/>
+          <w:szCs w:val="28"/>
+          <w:lang w:bidi="ar-SY"/>
+        </w:rPr>
+        <w:t>LessThan</w:t>
+      </w:r>
+      <w:proofErr w:type="spellEnd"/>
+      <w:r>
+        <w:rPr>
+          <w:rFonts w:ascii="Sakkal Majalla" w:hAnsi="Sakkal Majalla" w:cs="Sakkal Majalla"/>
+          <w:sz w:val="28"/>
+          <w:szCs w:val="28"/>
+          <w:lang w:bidi="ar-SY"/>
+        </w:rPr>
+        <w:t>,</w:t>
+      </w:r>
+      <w:r>
+        <w:rPr>
+          <w:rFonts w:ascii="Sakkal Majalla" w:hAnsi="Sakkal Majalla" w:cs="Sakkal Majalla"/>
+          <w:sz w:val="28"/>
+          <w:szCs w:val="28"/>
+          <w:lang w:bidi="ar-SY"/>
+        </w:rPr>
+        <w:t xml:space="preserve"> </w:t>
+      </w:r>
+      <w:proofErr w:type="spellStart"/>
+      <w:r>
+        <w:rPr>
+          <w:rFonts w:ascii="Sakkal Majalla" w:hAnsi="Sakkal Majalla" w:cs="Sakkal Majalla"/>
+          <w:b/>
+          <w:bCs/>
+          <w:color w:val="BF4E14" w:themeColor="accent2" w:themeShade="BF"/>
+          <w:sz w:val="28"/>
+          <w:szCs w:val="28"/>
+          <w:lang w:bidi="ar-SY"/>
+        </w:rPr>
+        <w:t>LessThanEqual</w:t>
+      </w:r>
+      <w:proofErr w:type="spellEnd"/>
+      <w:r>
+        <w:rPr>
+          <w:rFonts w:ascii="Sakkal Majalla" w:hAnsi="Sakkal Majalla" w:cs="Sakkal Majalla"/>
+          <w:sz w:val="28"/>
+          <w:szCs w:val="28"/>
+          <w:lang w:bidi="ar-SY"/>
+        </w:rPr>
+        <w:t>,</w:t>
+      </w:r>
+      <w:r>
+        <w:rPr>
+          <w:rFonts w:ascii="Sakkal Majalla" w:hAnsi="Sakkal Majalla" w:cs="Sakkal Majalla"/>
+          <w:sz w:val="28"/>
+          <w:szCs w:val="28"/>
+          <w:lang w:bidi="ar-SY"/>
+        </w:rPr>
+        <w:t xml:space="preserve"> </w:t>
+      </w:r>
+      <w:r>
+        <w:rPr>
+          <w:rFonts w:ascii="Sakkal Majalla" w:hAnsi="Sakkal Majalla" w:cs="Sakkal Majalla"/>
+          <w:b/>
+          <w:bCs/>
+          <w:color w:val="A6A6A6" w:themeColor="background1" w:themeShade="A6"/>
+          <w:sz w:val="28"/>
+          <w:szCs w:val="28"/>
+          <w:lang w:bidi="ar-SY"/>
+        </w:rPr>
+        <w:t>etc</w:t>
+      </w:r>
+      <w:r>
+        <w:rPr>
+          <w:rFonts w:ascii="Sakkal Majalla" w:hAnsi="Sakkal Majalla" w:cs="Sakkal Majalla"/>
+          <w:sz w:val="28"/>
+          <w:szCs w:val="28"/>
+          <w:lang w:bidi="ar-SY"/>
+        </w:rPr>
+        <w:t>.</w:t>
+      </w:r>
+    </w:p>
+    <w:p>
+      <w:pPr>
+        <w:ind w:left="720" w:firstLine="720"/>
+      </w:pPr>
+      <w:r>
+        <w:t>===========================================</w:t>
+      </w:r>
+    </w:p>
+    <w:p>
+      <w:pPr>
+        <w:rPr>
+          <w:rFonts w:ascii="Sakkal Majalla" w:hAnsi="Sakkal Majalla" w:cs="Sakkal Majalla"/>
+          <w:sz w:val="28"/>
+          <w:szCs w:val="28"/>
+          <w:lang w:bidi="ar-SY"/>
+        </w:rPr>
+      </w:pPr>
+      <w:r>
+        <w:rPr>
+          <w:rFonts w:ascii="Sakkal Majalla" w:hAnsi="Sakkal Majalla" w:cs="Sakkal Majalla"/>
+          <w:sz w:val="28"/>
+          <w:szCs w:val="28"/>
+          <w:lang w:bidi="ar-SY"/>
+        </w:rPr>
+        <w:t xml:space="preserve">For the null values, we can use: </w:t>
+      </w:r>
+      <w:r>
+        <w:rPr>
+          <w:rFonts w:ascii="Sakkal Majalla" w:hAnsi="Sakkal Majalla" w:cs="Sakkal Majalla"/>
+          <w:b/>
+          <w:bCs/>
+          <w:color w:val="3A7C22" w:themeColor="accent6" w:themeShade="BF"/>
+          <w:sz w:val="28"/>
+          <w:szCs w:val="28"/>
+          <w:lang w:bidi="ar-SY"/>
+        </w:rPr>
+        <w:t>Null</w:t>
+      </w:r>
+      <w:r>
+        <w:rPr>
+          <w:rFonts w:ascii="Sakkal Majalla" w:hAnsi="Sakkal Majalla" w:cs="Sakkal Majalla"/>
+          <w:sz w:val="28"/>
+          <w:szCs w:val="28"/>
+          <w:lang w:bidi="ar-SY"/>
+        </w:rPr>
+        <w:t xml:space="preserve">, and </w:t>
+      </w:r>
+      <w:proofErr w:type="spellStart"/>
+      <w:r>
+        <w:rPr>
+          <w:rFonts w:ascii="Sakkal Majalla" w:hAnsi="Sakkal Majalla" w:cs="Sakkal Majalla"/>
+          <w:b/>
+          <w:bCs/>
+          <w:color w:val="3A7C22" w:themeColor="accent6" w:themeShade="BF"/>
+          <w:sz w:val="28"/>
+          <w:szCs w:val="28"/>
+          <w:lang w:bidi="ar-SY"/>
+        </w:rPr>
+        <w:t>NotNull</w:t>
+      </w:r>
+      <w:proofErr w:type="spellEnd"/>
+      <w:r>
+        <w:rPr>
+          <w:rFonts w:ascii="Sakkal Majalla" w:hAnsi="Sakkal Majalla" w:cs="Sakkal Majalla"/>
+          <w:sz w:val="28"/>
+          <w:szCs w:val="28"/>
+          <w:lang w:bidi="ar-SY"/>
+        </w:rPr>
+        <w:t>.</w:t>
+      </w:r>
+    </w:p>
+    <w:p>
+      <w:pPr>
+        <w:ind w:left="720" w:firstLine="720"/>
+      </w:pPr>
+      <w:r>
+        <w:t>===========================================</w:t>
+      </w:r>
+    </w:p>
+    <w:p>
+      <w:pPr>
+        <w:rPr>
+          <w:rFonts w:ascii="Sakkal Majalla" w:hAnsi="Sakkal Majalla" w:cs="Sakkal Majalla"/>
+          <w:sz w:val="28"/>
+          <w:szCs w:val="28"/>
+          <w:lang w:bidi="ar-SY"/>
+        </w:rPr>
+      </w:pPr>
+      <w:r>
+        <w:rPr>
+          <w:rFonts w:ascii="Sakkal Majalla" w:hAnsi="Sakkal Majalla" w:cs="Sakkal Majalla"/>
+          <w:sz w:val="28"/>
+          <w:szCs w:val="28"/>
+          <w:lang w:bidi="ar-SY"/>
+        </w:rPr>
+        <w:t>To handle multiple conditions, we can use And, Or, etc.</w:t>
+      </w:r>
+    </w:p>
+    <w:p>
+      <w:pPr>
+        <w:rPr>
+          <w:rFonts w:ascii="Sakkal Majalla" w:hAnsi="Sakkal Majalla" w:cs="Sakkal Majalla"/>
+          <w:b/>
+          <w:bCs/>
+          <w:color w:val="000000" w:themeColor="text1"/>
+          <w:sz w:val="28"/>
+          <w:szCs w:val="28"/>
+        </w:rPr>
+      </w:pPr>
+      <w:r>
+        <w:rPr>
+          <w:rFonts w:ascii="Sakkal Majalla" w:hAnsi="Sakkal Majalla" w:cs="Sakkal Majalla"/>
+          <w:sz w:val="28"/>
+          <w:szCs w:val="28"/>
+          <w:lang w:bidi="ar-SY"/>
+        </w:rPr>
+        <w:t xml:space="preserve">Ex: </w:t>
+      </w:r>
+      <w:r>
+        <w:rPr>
+          <w:rFonts w:ascii="Sakkal Majalla" w:hAnsi="Sakkal Majalla" w:cs="Sakkal Majalla"/>
+          <w:b/>
+          <w:bCs/>
+          <w:color w:val="3A7C22" w:themeColor="accent6" w:themeShade="BF"/>
+          <w:sz w:val="28"/>
+          <w:szCs w:val="28"/>
+          <w:lang w:bidi="ar-SY"/>
+        </w:rPr>
+        <w:t xml:space="preserve">public </w:t>
+      </w:r>
+      <w:r>
+        <w:rPr>
+          <w:rFonts w:ascii="Sakkal Majalla" w:hAnsi="Sakkal Majalla" w:cs="Sakkal Majalla"/>
+          <w:b/>
+          <w:bCs/>
+          <w:color w:val="4C94D8" w:themeColor="text2" w:themeTint="80"/>
+          <w:sz w:val="28"/>
+          <w:szCs w:val="28"/>
+          <w:lang w:bidi="ar-SY"/>
+        </w:rPr>
+        <w:t xml:space="preserve">Product </w:t>
+      </w:r>
+      <w:proofErr w:type="spellStart"/>
+      <w:proofErr w:type="gramStart"/>
+      <w:r>
+        <w:rPr>
+          <w:rFonts w:ascii="Sakkal Majalla" w:hAnsi="Sakkal Majalla" w:cs="Sakkal Majalla"/>
+          <w:b/>
+          <w:bCs/>
+          <w:color w:val="C00000"/>
+          <w:sz w:val="28"/>
+          <w:szCs w:val="28"/>
+        </w:rPr>
+        <w:t>find</w:t>
+      </w:r>
+      <w:r>
+        <w:rPr>
+          <w:rFonts w:ascii="Sakkal Majalla" w:hAnsi="Sakkal Majalla" w:cs="Sakkal Majalla"/>
+          <w:b/>
+          <w:bCs/>
+          <w:color w:val="C00000"/>
+          <w:sz w:val="28"/>
+          <w:szCs w:val="28"/>
+        </w:rPr>
+        <w:t>B</w:t>
+      </w:r>
+      <w:r>
+        <w:rPr>
+          <w:rFonts w:ascii="Sakkal Majalla" w:hAnsi="Sakkal Majalla" w:cs="Sakkal Majalla"/>
+          <w:b/>
+          <w:bCs/>
+          <w:color w:val="C00000"/>
+          <w:sz w:val="28"/>
+          <w:szCs w:val="28"/>
+        </w:rPr>
+        <w:t>yName</w:t>
+      </w:r>
+      <w:r>
+        <w:rPr>
+          <w:rFonts w:ascii="Sakkal Majalla" w:hAnsi="Sakkal Majalla" w:cs="Sakkal Majalla"/>
+          <w:b/>
+          <w:bCs/>
+          <w:color w:val="C00000"/>
+          <w:sz w:val="28"/>
+          <w:szCs w:val="28"/>
+        </w:rPr>
+        <w:t>AndPrice</w:t>
+      </w:r>
+      <w:proofErr w:type="spellEnd"/>
+      <w:r>
+        <w:rPr>
+          <w:rFonts w:ascii="Sakkal Majalla" w:hAnsi="Sakkal Majalla" w:cs="Sakkal Majalla"/>
+          <w:b/>
+          <w:bCs/>
+          <w:color w:val="000000" w:themeColor="text1"/>
+          <w:sz w:val="28"/>
+          <w:szCs w:val="28"/>
+        </w:rPr>
+        <w:t>(</w:t>
+      </w:r>
+      <w:proofErr w:type="gramEnd"/>
+      <w:r>
+        <w:rPr>
+          <w:rFonts w:ascii="Sakkal Majalla" w:hAnsi="Sakkal Majalla" w:cs="Sakkal Majalla"/>
+          <w:b/>
+          <w:bCs/>
+          <w:color w:val="4C94D8" w:themeColor="text2" w:themeTint="80"/>
+          <w:sz w:val="28"/>
+          <w:szCs w:val="28"/>
+        </w:rPr>
+        <w:t xml:space="preserve">string </w:t>
+      </w:r>
+      <w:r>
+        <w:rPr>
+          <w:rFonts w:ascii="Sakkal Majalla" w:hAnsi="Sakkal Majalla" w:cs="Sakkal Majalla"/>
+          <w:b/>
+          <w:bCs/>
+          <w:color w:val="3A7C22" w:themeColor="accent6" w:themeShade="BF"/>
+          <w:sz w:val="28"/>
+          <w:szCs w:val="28"/>
+        </w:rPr>
+        <w:t>name</w:t>
+      </w:r>
+      <w:r>
+        <w:rPr>
+          <w:rFonts w:ascii="Sakkal Majalla" w:hAnsi="Sakkal Majalla" w:cs="Sakkal Majalla"/>
+          <w:b/>
+          <w:bCs/>
+          <w:color w:val="000000" w:themeColor="text1"/>
+          <w:sz w:val="28"/>
+          <w:szCs w:val="28"/>
+        </w:rPr>
+        <w:t xml:space="preserve">, </w:t>
+      </w:r>
+      <w:proofErr w:type="spellStart"/>
+      <w:r>
+        <w:rPr>
+          <w:rFonts w:ascii="Sakkal Majalla" w:hAnsi="Sakkal Majalla" w:cs="Sakkal Majalla"/>
+          <w:b/>
+          <w:bCs/>
+          <w:color w:val="4C94D8" w:themeColor="text2" w:themeTint="80"/>
+          <w:sz w:val="28"/>
+          <w:szCs w:val="28"/>
+        </w:rPr>
+        <w:t>BigDecimal</w:t>
+      </w:r>
+      <w:proofErr w:type="spellEnd"/>
+      <w:r>
+        <w:rPr>
+          <w:rFonts w:ascii="Sakkal Majalla" w:hAnsi="Sakkal Majalla" w:cs="Sakkal Majalla"/>
+          <w:b/>
+          <w:bCs/>
+          <w:color w:val="4C94D8" w:themeColor="text2" w:themeTint="80"/>
+          <w:sz w:val="28"/>
+          <w:szCs w:val="28"/>
+        </w:rPr>
+        <w:t xml:space="preserve"> </w:t>
+      </w:r>
+      <w:r>
+        <w:rPr>
+          <w:rFonts w:ascii="Sakkal Majalla" w:hAnsi="Sakkal Majalla" w:cs="Sakkal Majalla"/>
+          <w:b/>
+          <w:bCs/>
+          <w:color w:val="3A7C22" w:themeColor="accent6" w:themeShade="BF"/>
+          <w:sz w:val="28"/>
+          <w:szCs w:val="28"/>
+        </w:rPr>
+        <w:t>price</w:t>
+      </w:r>
+      <w:r>
+        <w:rPr>
+          <w:rFonts w:ascii="Sakkal Majalla" w:hAnsi="Sakkal Majalla" w:cs="Sakkal Majalla"/>
+          <w:b/>
+          <w:bCs/>
+          <w:color w:val="000000" w:themeColor="text1"/>
+          <w:sz w:val="28"/>
+          <w:szCs w:val="28"/>
+        </w:rPr>
+        <w:t>)</w:t>
+      </w:r>
+    </w:p>
+    <w:p>
+      <w:pPr>
+        <w:ind w:left="720" w:firstLine="720"/>
+      </w:pPr>
+      <w:r>
+        <w:t>===========================================</w:t>
+      </w:r>
+    </w:p>
+    <w:p>
+      <w:pPr>
+        <w:rPr>
+          <w:rFonts w:ascii="Sakkal Majalla" w:hAnsi="Sakkal Majalla" w:cs="Sakkal Majalla"/>
+          <w:sz w:val="28"/>
+          <w:szCs w:val="28"/>
+          <w:lang w:bidi="ar-SY"/>
+        </w:rPr>
+      </w:pPr>
+      <w:r>
+        <w:rPr>
+          <w:rFonts w:ascii="Sakkal Majalla" w:hAnsi="Sakkal Majalla" w:cs="Sakkal Majalla"/>
+          <w:sz w:val="28"/>
+          <w:szCs w:val="28"/>
+          <w:lang w:bidi="ar-SY"/>
+        </w:rPr>
+        <w:t xml:space="preserve">For sorting, we can use: </w:t>
+      </w:r>
+      <w:proofErr w:type="spellStart"/>
+      <w:r>
+        <w:rPr>
+          <w:rFonts w:ascii="Sakkal Majalla" w:hAnsi="Sakkal Majalla" w:cs="Sakkal Majalla"/>
+          <w:sz w:val="28"/>
+          <w:szCs w:val="28"/>
+          <w:lang w:bidi="ar-SY"/>
+        </w:rPr>
+        <w:t>SortBy</w:t>
+      </w:r>
+      <w:proofErr w:type="spellEnd"/>
+      <w:r>
+        <w:rPr>
+          <w:rFonts w:ascii="Sakkal Majalla" w:hAnsi="Sakkal Majalla" w:cs="Sakkal Majalla"/>
+          <w:sz w:val="28"/>
+          <w:szCs w:val="28"/>
+          <w:lang w:bidi="ar-SY"/>
+        </w:rPr>
+        <w:t>, Asc, Desc.</w:t>
+      </w:r>
+    </w:p>
+    <w:p>
+      <w:pPr>
+        <w:rPr>
+          <w:rFonts w:ascii="Sakkal Majalla" w:hAnsi="Sakkal Majalla" w:cs="Sakkal Majalla"/>
+          <w:b/>
+          <w:bCs/>
+          <w:sz w:val="28"/>
+          <w:szCs w:val="28"/>
+        </w:rPr>
+      </w:pPr>
+      <w:r>
+        <w:rPr>
+          <w:rFonts w:ascii="Sakkal Majalla" w:hAnsi="Sakkal Majalla" w:cs="Sakkal Majalla"/>
+          <w:b/>
+          <w:bCs/>
+          <w:color w:val="A6A6A6" w:themeColor="background1" w:themeShade="A6"/>
+          <w:sz w:val="28"/>
+          <w:szCs w:val="28"/>
+        </w:rPr>
+        <w:t>Ex</w:t>
+      </w:r>
+      <w:r>
+        <w:rPr>
+          <w:rFonts w:ascii="Sakkal Majalla" w:hAnsi="Sakkal Majalla" w:cs="Sakkal Majalla"/>
+          <w:sz w:val="28"/>
+          <w:szCs w:val="28"/>
+        </w:rPr>
+        <w:t xml:space="preserve">: </w:t>
+      </w:r>
+      <w:r>
+        <w:rPr>
+          <w:rFonts w:ascii="Sakkal Majalla" w:hAnsi="Sakkal Majalla" w:cs="Sakkal Majalla"/>
+          <w:b/>
+          <w:bCs/>
+          <w:color w:val="3A7C22" w:themeColor="accent6" w:themeShade="BF"/>
+          <w:sz w:val="28"/>
+          <w:szCs w:val="28"/>
+        </w:rPr>
+        <w:t xml:space="preserve">public </w:t>
+      </w:r>
+      <w:r>
+        <w:rPr>
+          <w:rFonts w:ascii="Sakkal Majalla" w:hAnsi="Sakkal Majalla" w:cs="Sakkal Majalla"/>
+          <w:b/>
+          <w:bCs/>
+          <w:color w:val="BF4E14" w:themeColor="accent2" w:themeShade="BF"/>
+          <w:sz w:val="28"/>
+          <w:szCs w:val="28"/>
+        </w:rPr>
+        <w:t>List</w:t>
+      </w:r>
+      <w:r>
+        <w:rPr>
+          <w:rFonts w:ascii="Sakkal Majalla" w:hAnsi="Sakkal Majalla" w:cs="Sakkal Majalla"/>
+          <w:b/>
+          <w:bCs/>
+          <w:sz w:val="28"/>
+          <w:szCs w:val="28"/>
+        </w:rPr>
+        <w:t>&lt;</w:t>
+      </w:r>
+      <w:r>
+        <w:rPr>
+          <w:rFonts w:ascii="Sakkal Majalla" w:hAnsi="Sakkal Majalla" w:cs="Sakkal Majalla"/>
+          <w:b/>
+          <w:bCs/>
+          <w:color w:val="BF4E14" w:themeColor="accent2" w:themeShade="BF"/>
+          <w:sz w:val="28"/>
+          <w:szCs w:val="28"/>
+        </w:rPr>
+        <w:t>Product</w:t>
+      </w:r>
+      <w:r>
+        <w:rPr>
+          <w:rFonts w:ascii="Sakkal Majalla" w:hAnsi="Sakkal Majalla" w:cs="Sakkal Majalla"/>
+          <w:b/>
+          <w:bCs/>
+          <w:sz w:val="28"/>
+          <w:szCs w:val="28"/>
+        </w:rPr>
+        <w:t xml:space="preserve">&gt; </w:t>
+      </w:r>
+      <w:proofErr w:type="spellStart"/>
+      <w:r>
+        <w:rPr>
+          <w:rFonts w:ascii="Sakkal Majalla" w:hAnsi="Sakkal Majalla" w:cs="Sakkal Majalla"/>
+          <w:b/>
+          <w:bCs/>
+          <w:color w:val="C00000"/>
+          <w:sz w:val="28"/>
+          <w:szCs w:val="28"/>
+        </w:rPr>
+        <w:t>find</w:t>
+      </w:r>
+      <w:r>
+        <w:rPr>
+          <w:rFonts w:ascii="Sakkal Majalla" w:hAnsi="Sakkal Majalla" w:cs="Sakkal Majalla"/>
+          <w:b/>
+          <w:bCs/>
+          <w:color w:val="C00000"/>
+          <w:sz w:val="28"/>
+          <w:szCs w:val="28"/>
+        </w:rPr>
+        <w:t>B</w:t>
+      </w:r>
+      <w:r>
+        <w:rPr>
+          <w:rFonts w:ascii="Sakkal Majalla" w:hAnsi="Sakkal Majalla" w:cs="Sakkal Majalla"/>
+          <w:b/>
+          <w:bCs/>
+          <w:color w:val="C00000"/>
+          <w:sz w:val="28"/>
+          <w:szCs w:val="28"/>
+        </w:rPr>
+        <w:t>yNameLike</w:t>
+      </w:r>
+      <w:r>
+        <w:rPr>
+          <w:rFonts w:ascii="Sakkal Majalla" w:hAnsi="Sakkal Majalla" w:cs="Sakkal Majalla"/>
+          <w:b/>
+          <w:bCs/>
+          <w:color w:val="C00000"/>
+          <w:sz w:val="28"/>
+          <w:szCs w:val="28"/>
+        </w:rPr>
+        <w:t>SortByPriceAsc</w:t>
+      </w:r>
+      <w:proofErr w:type="spellEnd"/>
+      <w:r>
+        <w:rPr>
+          <w:rFonts w:ascii="Sakkal Majalla" w:hAnsi="Sakkal Majalla" w:cs="Sakkal Majalla"/>
+          <w:b/>
+          <w:bCs/>
+          <w:color w:val="C00000"/>
+          <w:sz w:val="28"/>
+          <w:szCs w:val="28"/>
+        </w:rPr>
+        <w:t xml:space="preserve"> </w:t>
+      </w:r>
+      <w:r>
+        <w:rPr>
+          <w:rFonts w:ascii="Sakkal Majalla" w:hAnsi="Sakkal Majalla" w:cs="Sakkal Majalla"/>
+          <w:b/>
+          <w:bCs/>
+          <w:sz w:val="28"/>
+          <w:szCs w:val="28"/>
+        </w:rPr>
+        <w:t>(</w:t>
+      </w:r>
+      <w:r>
+        <w:rPr>
+          <w:rFonts w:ascii="Sakkal Majalla" w:hAnsi="Sakkal Majalla" w:cs="Sakkal Majalla"/>
+          <w:b/>
+          <w:bCs/>
+          <w:color w:val="BF4E14" w:themeColor="accent2" w:themeShade="BF"/>
+          <w:sz w:val="28"/>
+          <w:szCs w:val="28"/>
+        </w:rPr>
+        <w:t xml:space="preserve">string </w:t>
+      </w:r>
+      <w:r>
+        <w:rPr>
+          <w:rFonts w:ascii="Sakkal Majalla" w:hAnsi="Sakkal Majalla" w:cs="Sakkal Majalla"/>
+          <w:b/>
+          <w:bCs/>
+          <w:color w:val="3A7C22" w:themeColor="accent6" w:themeShade="BF"/>
+          <w:sz w:val="28"/>
+          <w:szCs w:val="28"/>
+        </w:rPr>
+        <w:t>productName</w:t>
+      </w:r>
+      <w:r>
+        <w:rPr>
+          <w:rFonts w:ascii="Sakkal Majalla" w:hAnsi="Sakkal Majalla" w:cs="Sakkal Majalla"/>
+          <w:b/>
+          <w:bCs/>
+          <w:sz w:val="28"/>
+          <w:szCs w:val="28"/>
+        </w:rPr>
+        <w:t>)</w:t>
+      </w:r>
+      <w:r>
+        <w:rPr>
+          <w:rFonts w:ascii="Sakkal Majalla" w:hAnsi="Sakkal Majalla" w:cs="Sakkal Majalla"/>
+          <w:b/>
+          <w:bCs/>
+          <w:sz w:val="28"/>
+          <w:szCs w:val="28"/>
+        </w:rPr>
+        <w:t>.</w:t>
+      </w:r>
+    </w:p>
+    <w:p>
+      <w:pPr>
+        <w:ind w:left="720" w:firstLine="720"/>
+      </w:pPr>
+      <w:r>
+        <w:t>===========================================</w:t>
+      </w:r>
+    </w:p>
+    <w:p>
+      <w:pPr>
+        <w:rPr>
+          <w:rFonts w:ascii="Sakkal Majalla" w:hAnsi="Sakkal Majalla" w:cs="Sakkal Majalla"/>
+          <w:sz w:val="28"/>
+          <w:szCs w:val="28"/>
+          <w:lang w:bidi="ar-SY"/>
+        </w:rPr>
+      </w:pPr>
+      <w:r>
+        <w:rPr>
+          <w:rFonts w:ascii="Sakkal Majalla" w:hAnsi="Sakkal Majalla" w:cs="Sakkal Majalla"/>
+          <w:sz w:val="28"/>
+          <w:szCs w:val="28"/>
+          <w:lang w:bidi="ar-SY"/>
+        </w:rPr>
+        <w:t xml:space="preserve">For using limit with the </w:t>
+      </w:r>
+      <w:r>
+        <w:rPr>
+          <w:rFonts w:ascii="Sakkal Majalla" w:hAnsi="Sakkal Majalla" w:cs="Sakkal Majalla"/>
+          <w:b/>
+          <w:bCs/>
+          <w:color w:val="4C94D8" w:themeColor="text2" w:themeTint="80"/>
+          <w:sz w:val="28"/>
+          <w:szCs w:val="28"/>
+          <w:lang w:bidi="ar-SY"/>
+        </w:rPr>
+        <w:t>Crud</w:t>
+      </w:r>
+      <w:r>
+        <w:rPr>
+          <w:rFonts w:ascii="Sakkal Majalla" w:hAnsi="Sakkal Majalla" w:cs="Sakkal Majalla"/>
+          <w:b/>
+          <w:bCs/>
+          <w:color w:val="4C94D8" w:themeColor="text2" w:themeTint="80"/>
+          <w:sz w:val="28"/>
+          <w:szCs w:val="28"/>
+          <w:lang w:bidi="ar-SY"/>
+        </w:rPr>
+        <w:t xml:space="preserve"> R</w:t>
+      </w:r>
+      <w:r>
+        <w:rPr>
+          <w:rFonts w:ascii="Sakkal Majalla" w:hAnsi="Sakkal Majalla" w:cs="Sakkal Majalla"/>
+          <w:b/>
+          <w:bCs/>
+          <w:color w:val="4C94D8" w:themeColor="text2" w:themeTint="80"/>
+          <w:sz w:val="28"/>
+          <w:szCs w:val="28"/>
+          <w:lang w:bidi="ar-SY"/>
+        </w:rPr>
+        <w:t>epository</w:t>
+      </w:r>
+      <w:r>
+        <w:rPr>
+          <w:rFonts w:ascii="Sakkal Majalla" w:hAnsi="Sakkal Majalla" w:cs="Sakkal Majalla"/>
+          <w:sz w:val="28"/>
+          <w:szCs w:val="28"/>
+          <w:lang w:bidi="ar-SY"/>
+        </w:rPr>
+        <w:t xml:space="preserve">, we can use </w:t>
+      </w:r>
+      <w:r>
+        <w:rPr>
+          <w:rFonts w:ascii="Sakkal Majalla" w:hAnsi="Sakkal Majalla" w:cs="Sakkal Majalla"/>
+          <w:b/>
+          <w:bCs/>
+          <w:color w:val="002060"/>
+          <w:sz w:val="28"/>
+          <w:szCs w:val="28"/>
+          <w:lang w:bidi="ar-SY"/>
+        </w:rPr>
+        <w:t>Top</w:t>
+      </w:r>
+      <w:r>
+        <w:rPr>
+          <w:rFonts w:ascii="Sakkal Majalla" w:hAnsi="Sakkal Majalla" w:cs="Sakkal Majalla"/>
+          <w:color w:val="002060"/>
+          <w:sz w:val="28"/>
+          <w:szCs w:val="28"/>
+          <w:lang w:bidi="ar-SY"/>
+        </w:rPr>
+        <w:t xml:space="preserve"> </w:t>
+      </w:r>
+      <w:r>
+        <w:rPr>
+          <w:rFonts w:ascii="Sakkal Majalla" w:hAnsi="Sakkal Majalla" w:cs="Sakkal Majalla"/>
+          <w:sz w:val="28"/>
+          <w:szCs w:val="28"/>
+          <w:lang w:bidi="ar-SY"/>
+        </w:rPr>
+        <w:t xml:space="preserve">&amp; </w:t>
+      </w:r>
+      <w:r>
+        <w:rPr>
+          <w:rFonts w:ascii="Sakkal Majalla" w:hAnsi="Sakkal Majalla" w:cs="Sakkal Majalla"/>
+          <w:b/>
+          <w:bCs/>
+          <w:color w:val="002060"/>
+          <w:sz w:val="28"/>
+          <w:szCs w:val="28"/>
+          <w:lang w:bidi="ar-SY"/>
+        </w:rPr>
+        <w:t>First</w:t>
+      </w:r>
+      <w:r>
+        <w:rPr>
+          <w:rFonts w:ascii="Sakkal Majalla" w:hAnsi="Sakkal Majalla" w:cs="Sakkal Majalla"/>
+          <w:sz w:val="28"/>
+          <w:szCs w:val="28"/>
+          <w:lang w:bidi="ar-SY"/>
+        </w:rPr>
+        <w:t>.</w:t>
+      </w:r>
+    </w:p>
+    <w:p>
+      <w:pPr>
+        <w:rPr>
+          <w:rFonts w:ascii="Sakkal Majalla" w:hAnsi="Sakkal Majalla" w:cs="Sakkal Majalla"/>
+          <w:sz w:val="28"/>
+          <w:szCs w:val="28"/>
+        </w:rPr>
+      </w:pPr>
+      <w:r>
+        <w:rPr>
+          <w:rFonts w:ascii="Sakkal Majalla" w:hAnsi="Sakkal Majalla" w:cs="Sakkal Majalla"/>
+          <w:b/>
+          <w:bCs/>
+          <w:color w:val="A6A6A6" w:themeColor="background1" w:themeShade="A6"/>
+          <w:sz w:val="28"/>
+          <w:szCs w:val="28"/>
+        </w:rPr>
+        <w:t>Ex</w:t>
+      </w:r>
+      <w:r>
+        <w:rPr>
+          <w:rFonts w:ascii="Sakkal Majalla" w:hAnsi="Sakkal Majalla" w:cs="Sakkal Majalla"/>
+          <w:sz w:val="28"/>
+          <w:szCs w:val="28"/>
+        </w:rPr>
+        <w:t xml:space="preserve">: </w:t>
+      </w:r>
+      <w:r>
+        <w:rPr>
+          <w:rFonts w:ascii="Sakkal Majalla" w:hAnsi="Sakkal Majalla" w:cs="Sakkal Majalla"/>
+          <w:b/>
+          <w:bCs/>
+          <w:color w:val="3A7C22" w:themeColor="accent6" w:themeShade="BF"/>
+          <w:sz w:val="28"/>
+          <w:szCs w:val="28"/>
+        </w:rPr>
+        <w:t xml:space="preserve">public </w:t>
+      </w:r>
+      <w:r>
+        <w:rPr>
+          <w:rFonts w:ascii="Sakkal Majalla" w:hAnsi="Sakkal Majalla" w:cs="Sakkal Majalla"/>
+          <w:b/>
+          <w:bCs/>
+          <w:color w:val="BF4E14" w:themeColor="accent2" w:themeShade="BF"/>
+          <w:sz w:val="28"/>
+          <w:szCs w:val="28"/>
+        </w:rPr>
+        <w:t>List</w:t>
+      </w:r>
+      <w:r>
+        <w:rPr>
+          <w:rFonts w:ascii="Sakkal Majalla" w:hAnsi="Sakkal Majalla" w:cs="Sakkal Majalla"/>
+          <w:b/>
+          <w:bCs/>
+          <w:sz w:val="28"/>
+          <w:szCs w:val="28"/>
+        </w:rPr>
+        <w:t>&lt;</w:t>
+      </w:r>
+      <w:r>
+        <w:rPr>
+          <w:rFonts w:ascii="Sakkal Majalla" w:hAnsi="Sakkal Majalla" w:cs="Sakkal Majalla"/>
+          <w:b/>
+          <w:bCs/>
+          <w:color w:val="BF4E14" w:themeColor="accent2" w:themeShade="BF"/>
+          <w:sz w:val="28"/>
+          <w:szCs w:val="28"/>
+        </w:rPr>
+        <w:t>Product</w:t>
+      </w:r>
+      <w:r>
+        <w:rPr>
+          <w:rFonts w:ascii="Sakkal Majalla" w:hAnsi="Sakkal Majalla" w:cs="Sakkal Majalla"/>
+          <w:b/>
+          <w:bCs/>
+          <w:sz w:val="28"/>
+          <w:szCs w:val="28"/>
+        </w:rPr>
+        <w:t xml:space="preserve">&gt; </w:t>
+      </w:r>
+      <w:r>
+        <w:rPr>
+          <w:rFonts w:ascii="Sakkal Majalla" w:hAnsi="Sakkal Majalla" w:cs="Sakkal Majalla"/>
+          <w:b/>
+          <w:bCs/>
+          <w:color w:val="C00000"/>
+          <w:sz w:val="28"/>
+          <w:szCs w:val="28"/>
+        </w:rPr>
+        <w:t>find</w:t>
+      </w:r>
+      <w:r>
+        <w:rPr>
+          <w:rFonts w:ascii="Sakkal Majalla" w:hAnsi="Sakkal Majalla" w:cs="Sakkal Majalla"/>
+          <w:b/>
+          <w:bCs/>
+          <w:color w:val="C00000"/>
+          <w:sz w:val="28"/>
+          <w:szCs w:val="28"/>
+        </w:rPr>
+        <w:t>Top5B</w:t>
+      </w:r>
+      <w:r>
+        <w:rPr>
+          <w:rFonts w:ascii="Sakkal Majalla" w:hAnsi="Sakkal Majalla" w:cs="Sakkal Majalla"/>
+          <w:b/>
+          <w:bCs/>
+          <w:color w:val="C00000"/>
+          <w:sz w:val="28"/>
+          <w:szCs w:val="28"/>
+        </w:rPr>
+        <w:t>yNameLike</w:t>
+      </w:r>
+      <w:r>
+        <w:rPr>
+          <w:rFonts w:ascii="Sakkal Majalla" w:hAnsi="Sakkal Majalla" w:cs="Sakkal Majalla"/>
+          <w:b/>
+          <w:bCs/>
+          <w:color w:val="C00000"/>
+          <w:sz w:val="28"/>
+          <w:szCs w:val="28"/>
+        </w:rPr>
+        <w:t>OrderByPriceDesc</w:t>
+      </w:r>
+      <w:r>
+        <w:rPr>
+          <w:rFonts w:ascii="Sakkal Majalla" w:hAnsi="Sakkal Majalla" w:cs="Sakkal Majalla"/>
+          <w:b/>
+          <w:bCs/>
+          <w:color w:val="C00000"/>
+          <w:sz w:val="28"/>
+          <w:szCs w:val="28"/>
+        </w:rPr>
+        <w:t xml:space="preserve"> </w:t>
+      </w:r>
+      <w:r>
+        <w:rPr>
+          <w:rFonts w:ascii="Sakkal Majalla" w:hAnsi="Sakkal Majalla" w:cs="Sakkal Majalla"/>
+          <w:b/>
+          <w:bCs/>
+          <w:sz w:val="28"/>
+          <w:szCs w:val="28"/>
+        </w:rPr>
+        <w:t>(</w:t>
+      </w:r>
+      <w:r>
+        <w:rPr>
+          <w:rFonts w:ascii="Sakkal Majalla" w:hAnsi="Sakkal Majalla" w:cs="Sakkal Majalla"/>
+          <w:b/>
+          <w:bCs/>
+          <w:color w:val="BF4E14" w:themeColor="accent2" w:themeShade="BF"/>
+          <w:sz w:val="28"/>
+          <w:szCs w:val="28"/>
+        </w:rPr>
+        <w:t xml:space="preserve">string </w:t>
+      </w:r>
+      <w:r>
+        <w:rPr>
+          <w:rFonts w:ascii="Sakkal Majalla" w:hAnsi="Sakkal Majalla" w:cs="Sakkal Majalla"/>
+          <w:b/>
+          <w:bCs/>
+          <w:color w:val="3A7C22" w:themeColor="accent6" w:themeShade="BF"/>
+          <w:sz w:val="28"/>
+          <w:szCs w:val="28"/>
+        </w:rPr>
+        <w:t>productName</w:t>
+      </w:r>
+      <w:r>
+        <w:rPr>
+          <w:rFonts w:ascii="Sakkal Majalla" w:hAnsi="Sakkal Majalla" w:cs="Sakkal Majalla"/>
+          <w:b/>
+          <w:bCs/>
+          <w:sz w:val="28"/>
+          <w:szCs w:val="28"/>
+        </w:rPr>
+        <w:t>);</w:t>
+      </w:r>
+    </w:p>
+    <w:p>
+      <w:pPr>
+        <w:ind w:left="720" w:firstLine="720"/>
+      </w:pPr>
+      <w:r>
+        <w:t>===========================================</w:t>
+      </w:r>
+    </w:p>
+    <w:p>
+      <w:pPr>
+        <w:rPr>
+          <w:rFonts w:ascii="Sakkal Majalla" w:hAnsi="Sakkal Majalla" w:cs="Sakkal Majalla"/>
+          <w:sz w:val="28"/>
+          <w:szCs w:val="28"/>
+          <w:lang w:bidi="ar-SY"/>
+        </w:rPr>
+      </w:pPr>
+    </w:p>
+    <w:p>
+      <w:pPr>
+        <w:shd w:val="clear" w:color="auto" w:fill="FFFFFF"/>
+        <w:spacing w:after="0" w:line="285" w:lineRule="atLeast"/>
+        <w:rPr>
+          <w:rFonts w:ascii="Sakkal Majalla" w:eastAsia="Times New Roman" w:hAnsi="Sakkal Majalla" w:cs="Sakkal Majalla"/>
+          <w:color w:val="000000" w:themeColor="text1"/>
+          <w:kern w:val="0"/>
+          <w:sz w:val="28"/>
+          <w:szCs w:val="28"/>
+          <w14:ligatures w14:val="none"/>
+        </w:rPr>
+      </w:pPr>
+      <w:r>
+        <w:rPr>
+          <w:rFonts w:ascii="Sakkal Majalla" w:eastAsia="Times New Roman" w:hAnsi="Sakkal Majalla" w:cs="Sakkal Majalla"/>
+          <w:color w:val="000000" w:themeColor="text1"/>
+          <w:kern w:val="0"/>
+          <w:sz w:val="28"/>
+          <w:szCs w:val="28"/>
+          <w14:ligatures w14:val="none"/>
+        </w:rPr>
+        <w:lastRenderedPageBreak/>
+        <w:t xml:space="preserve">We can </w:t>
+      </w:r>
+      <w:r>
+        <w:rPr>
+          <w:rFonts w:ascii="Sakkal Majalla" w:eastAsia="Times New Roman" w:hAnsi="Sakkal Majalla" w:cs="Sakkal Majalla"/>
+          <w:color w:val="000000" w:themeColor="text1"/>
+          <w:kern w:val="0"/>
+          <w:sz w:val="28"/>
+          <w:szCs w:val="28"/>
+          <w14:ligatures w14:val="none"/>
+        </w:rPr>
+        <w:t>also use</w:t>
+      </w:r>
+      <w:r>
+        <w:rPr>
+          <w:rFonts w:ascii="Sakkal Majalla" w:eastAsia="Times New Roman" w:hAnsi="Sakkal Majalla" w:cs="Sakkal Majalla"/>
+          <w:color w:val="000000" w:themeColor="text1"/>
+          <w:kern w:val="0"/>
+          <w:sz w:val="28"/>
+          <w:szCs w:val="28"/>
+          <w14:ligatures w14:val="none"/>
+        </w:rPr>
+        <w:t xml:space="preserve"> join, join left, etc.</w:t>
+      </w:r>
+    </w:p>
+    <w:p>
+      <w:pPr>
+        <w:shd w:val="clear" w:color="auto" w:fill="FFFFFF"/>
+        <w:spacing w:after="0" w:line="285" w:lineRule="atLeast"/>
+        <w:rPr>
+          <w:rFonts w:ascii="Consolas" w:eastAsia="Times New Roman" w:hAnsi="Consolas" w:cs="Times New Roman"/>
+          <w:color w:val="3B3B3B"/>
+          <w:kern w:val="0"/>
+          <w:sz w:val="21"/>
+          <w:szCs w:val="21"/>
+          <w14:ligatures w14:val="none"/>
+        </w:rPr>
+      </w:pPr>
+      <w:r>
+        <w:rPr>
+          <w:rFonts w:ascii="Consolas" w:eastAsia="Times New Roman" w:hAnsi="Consolas" w:cs="Times New Roman"/>
+          <w:color w:val="0000FF"/>
+          <w:kern w:val="0"/>
+          <w:sz w:val="21"/>
+          <w:szCs w:val="21"/>
+          <w14:ligatures w14:val="none"/>
+        </w:rPr>
+        <w:t>public</w:t>
+      </w:r>
+      <w:r>
+        <w:rPr>
+          <w:rFonts w:ascii="Consolas" w:eastAsia="Times New Roman" w:hAnsi="Consolas" w:cs="Times New Roman"/>
+          <w:color w:val="3B3B3B"/>
+          <w:kern w:val="0"/>
+          <w:sz w:val="21"/>
+          <w:szCs w:val="21"/>
+          <w14:ligatures w14:val="none"/>
+        </w:rPr>
+        <w:t xml:space="preserve"> </w:t>
+      </w:r>
+      <w:r>
+        <w:rPr>
+          <w:rFonts w:ascii="Consolas" w:eastAsia="Times New Roman" w:hAnsi="Consolas" w:cs="Times New Roman"/>
+          <w:color w:val="0000FF"/>
+          <w:kern w:val="0"/>
+          <w:sz w:val="21"/>
+          <w:szCs w:val="21"/>
+          <w14:ligatures w14:val="none"/>
+        </w:rPr>
+        <w:t>interface</w:t>
+      </w:r>
+      <w:r>
+        <w:rPr>
+          <w:rFonts w:ascii="Consolas" w:eastAsia="Times New Roman" w:hAnsi="Consolas" w:cs="Times New Roman"/>
+          <w:color w:val="3B3B3B"/>
+          <w:kern w:val="0"/>
+          <w:sz w:val="21"/>
+          <w:szCs w:val="21"/>
+          <w14:ligatures w14:val="none"/>
+        </w:rPr>
+        <w:t xml:space="preserve"> </w:t>
+      </w:r>
+      <w:proofErr w:type="spellStart"/>
+      <w:r>
+        <w:rPr>
+          <w:rFonts w:ascii="Consolas" w:eastAsia="Times New Roman" w:hAnsi="Consolas" w:cs="Times New Roman"/>
+          <w:color w:val="267F99"/>
+          <w:kern w:val="0"/>
+          <w:sz w:val="21"/>
+          <w:szCs w:val="21"/>
+          <w14:ligatures w14:val="none"/>
+        </w:rPr>
+        <w:t>ProductRepository</w:t>
+      </w:r>
+      <w:proofErr w:type="spellEnd"/>
+      <w:r>
+        <w:rPr>
+          <w:rFonts w:ascii="Consolas" w:eastAsia="Times New Roman" w:hAnsi="Consolas" w:cs="Times New Roman"/>
+          <w:color w:val="3B3B3B"/>
+          <w:kern w:val="0"/>
+          <w:sz w:val="21"/>
+          <w:szCs w:val="21"/>
+          <w14:ligatures w14:val="none"/>
+        </w:rPr>
+        <w:t xml:space="preserve"> </w:t>
+      </w:r>
+      <w:r>
+        <w:rPr>
+          <w:rFonts w:ascii="Consolas" w:eastAsia="Times New Roman" w:hAnsi="Consolas" w:cs="Times New Roman"/>
+          <w:color w:val="0000FF"/>
+          <w:kern w:val="0"/>
+          <w:sz w:val="21"/>
+          <w:szCs w:val="21"/>
+          <w14:ligatures w14:val="none"/>
+        </w:rPr>
+        <w:t>extends</w:t>
+      </w:r>
+      <w:r>
+        <w:rPr>
+          <w:rFonts w:ascii="Consolas" w:eastAsia="Times New Roman" w:hAnsi="Consolas" w:cs="Times New Roman"/>
+          <w:color w:val="3B3B3B"/>
+          <w:kern w:val="0"/>
+          <w:sz w:val="21"/>
+          <w:szCs w:val="21"/>
+          <w14:ligatures w14:val="none"/>
+        </w:rPr>
+        <w:t xml:space="preserve"> </w:t>
+      </w:r>
+      <w:r>
+        <w:rPr>
+          <w:rFonts w:ascii="Consolas" w:eastAsia="Times New Roman" w:hAnsi="Consolas" w:cs="Times New Roman"/>
+          <w:color w:val="267F99"/>
+          <w:kern w:val="0"/>
+          <w:sz w:val="21"/>
+          <w:szCs w:val="21"/>
+          <w14:ligatures w14:val="none"/>
+        </w:rPr>
+        <w:t>CrudRepository</w:t>
+      </w:r>
+      <w:r>
+        <w:rPr>
+          <w:rFonts w:ascii="Consolas" w:eastAsia="Times New Roman" w:hAnsi="Consolas" w:cs="Times New Roman"/>
+          <w:color w:val="3B3B3B"/>
+          <w:kern w:val="0"/>
+          <w:sz w:val="21"/>
+          <w:szCs w:val="21"/>
+          <w14:ligatures w14:val="none"/>
+        </w:rPr>
+        <w:t>&lt;</w:t>
+      </w:r>
+      <w:r>
+        <w:rPr>
+          <w:rFonts w:ascii="Consolas" w:eastAsia="Times New Roman" w:hAnsi="Consolas" w:cs="Times New Roman"/>
+          <w:color w:val="267F99"/>
+          <w:kern w:val="0"/>
+          <w:sz w:val="21"/>
+          <w:szCs w:val="21"/>
+          <w14:ligatures w14:val="none"/>
+        </w:rPr>
+        <w:t>Product</w:t>
+      </w:r>
+      <w:r>
+        <w:rPr>
+          <w:rFonts w:ascii="Consolas" w:eastAsia="Times New Roman" w:hAnsi="Consolas" w:cs="Times New Roman"/>
+          <w:color w:val="3B3B3B"/>
+          <w:kern w:val="0"/>
+          <w:sz w:val="21"/>
+          <w:szCs w:val="21"/>
+          <w14:ligatures w14:val="none"/>
+        </w:rPr>
+        <w:t xml:space="preserve">, </w:t>
+      </w:r>
+      <w:proofErr w:type="gramStart"/>
+      <w:r>
+        <w:rPr>
+          <w:rFonts w:ascii="Consolas" w:eastAsia="Times New Roman" w:hAnsi="Consolas" w:cs="Times New Roman"/>
+          <w:color w:val="267F99"/>
+          <w:kern w:val="0"/>
+          <w:sz w:val="21"/>
+          <w:szCs w:val="21"/>
+          <w14:ligatures w14:val="none"/>
+        </w:rPr>
+        <w:t>Long</w:t>
+      </w:r>
+      <w:proofErr w:type="gramEnd"/>
+      <w:r>
+        <w:rPr>
+          <w:rFonts w:ascii="Consolas" w:eastAsia="Times New Roman" w:hAnsi="Consolas" w:cs="Times New Roman"/>
+          <w:color w:val="3B3B3B"/>
+          <w:kern w:val="0"/>
+          <w:sz w:val="21"/>
+          <w:szCs w:val="21"/>
+          <w14:ligatures w14:val="none"/>
+        </w:rPr>
+        <w:t>&gt; {</w:t>
+      </w:r>
+    </w:p>
+    <w:p>
+      <w:pPr>
+        <w:shd w:val="clear" w:color="auto" w:fill="FFFFFF"/>
+        <w:spacing w:after="0" w:line="285" w:lineRule="atLeast"/>
+        <w:rPr>
+          <w:rFonts w:ascii="Consolas" w:eastAsia="Times New Roman" w:hAnsi="Consolas" w:cs="Times New Roman"/>
+          <w:color w:val="3B3B3B"/>
+          <w:kern w:val="0"/>
+          <w:sz w:val="21"/>
+          <w:szCs w:val="21"/>
+          <w14:ligatures w14:val="none"/>
+        </w:rPr>
+      </w:pPr>
+      <w:r>
+        <w:rPr>
+          <w:rFonts w:ascii="Consolas" w:eastAsia="Times New Roman" w:hAnsi="Consolas" w:cs="Times New Roman"/>
+          <w:color w:val="3B3B3B"/>
+          <w:kern w:val="0"/>
+          <w:sz w:val="21"/>
+          <w:szCs w:val="21"/>
+          <w14:ligatures w14:val="none"/>
+        </w:rPr>
+        <w:t xml:space="preserve">    </w:t>
+      </w:r>
+      <w:r>
+        <w:rPr>
+          <w:rFonts w:ascii="Consolas" w:eastAsia="Times New Roman" w:hAnsi="Consolas" w:cs="Times New Roman"/>
+          <w:color w:val="008000"/>
+          <w:kern w:val="0"/>
+          <w:sz w:val="21"/>
+          <w:szCs w:val="21"/>
+          <w14:ligatures w14:val="none"/>
+        </w:rPr>
+        <w:t>// SQL or JPQL</w:t>
+      </w:r>
+    </w:p>
+    <w:p>
+      <w:pPr>
+        <w:shd w:val="clear" w:color="auto" w:fill="FFFFFF"/>
+        <w:spacing w:after="0" w:line="285" w:lineRule="atLeast"/>
+        <w:rPr>
+          <w:rFonts w:ascii="Consolas" w:eastAsia="Times New Roman" w:hAnsi="Consolas" w:cs="Times New Roman"/>
+          <w:color w:val="3B3B3B"/>
+          <w:kern w:val="0"/>
+          <w:sz w:val="21"/>
+          <w:szCs w:val="21"/>
+          <w14:ligatures w14:val="none"/>
+        </w:rPr>
+      </w:pPr>
+    </w:p>
+    <w:p>
+      <w:pPr>
+        <w:shd w:val="clear" w:color="auto" w:fill="FFFFFF"/>
+        <w:spacing w:after="0" w:line="285" w:lineRule="atLeast"/>
+        <w:rPr>
+          <w:rFonts w:ascii="Consolas" w:eastAsia="Times New Roman" w:hAnsi="Consolas" w:cs="Times New Roman"/>
+          <w:color w:val="3B3B3B"/>
+          <w:kern w:val="0"/>
+          <w:sz w:val="21"/>
+          <w:szCs w:val="21"/>
+          <w14:ligatures w14:val="none"/>
+        </w:rPr>
+      </w:pPr>
+      <w:r>
+        <w:rPr>
+          <w:rFonts w:ascii="Consolas" w:eastAsia="Times New Roman" w:hAnsi="Consolas" w:cs="Times New Roman"/>
+          <w:color w:val="3B3B3B"/>
+          <w:kern w:val="0"/>
+          <w:sz w:val="21"/>
+          <w:szCs w:val="21"/>
+          <w14:ligatures w14:val="none"/>
+        </w:rPr>
+        <w:t xml:space="preserve">    </w:t>
+      </w:r>
+      <w:r>
+        <w:rPr>
+          <w:rFonts w:ascii="Consolas" w:eastAsia="Times New Roman" w:hAnsi="Consolas" w:cs="Times New Roman"/>
+          <w:color w:val="008000"/>
+          <w:kern w:val="0"/>
+          <w:sz w:val="21"/>
+          <w:szCs w:val="21"/>
+          <w14:ligatures w14:val="none"/>
+        </w:rPr>
+        <w:t>// SQL</w:t>
+      </w:r>
+    </w:p>
+    <w:p>
+      <w:pPr>
+        <w:shd w:val="clear" w:color="auto" w:fill="FFFFFF"/>
+        <w:spacing w:after="0" w:line="285" w:lineRule="atLeast"/>
+        <w:rPr>
+          <w:rFonts w:ascii="Consolas" w:eastAsia="Times New Roman" w:hAnsi="Consolas" w:cs="Times New Roman"/>
+          <w:color w:val="3B3B3B"/>
+          <w:kern w:val="0"/>
+          <w:sz w:val="21"/>
+          <w:szCs w:val="21"/>
+          <w14:ligatures w14:val="none"/>
+        </w:rPr>
+      </w:pPr>
+      <w:r>
+        <w:rPr>
+          <w:rFonts w:ascii="Consolas" w:eastAsia="Times New Roman" w:hAnsi="Consolas" w:cs="Times New Roman"/>
+          <w:color w:val="3B3B3B"/>
+          <w:kern w:val="0"/>
+          <w:sz w:val="21"/>
+          <w:szCs w:val="21"/>
+          <w14:ligatures w14:val="none"/>
+        </w:rPr>
+        <w:t xml:space="preserve">    </w:t>
+      </w:r>
+      <w:r>
+        <w:rPr>
+          <w:rFonts w:ascii="Consolas" w:eastAsia="Times New Roman" w:hAnsi="Consolas" w:cs="Times New Roman"/>
+          <w:color w:val="008000"/>
+          <w:kern w:val="0"/>
+          <w:sz w:val="21"/>
+          <w:szCs w:val="21"/>
+          <w14:ligatures w14:val="none"/>
+        </w:rPr>
+        <w:t>// @</w:t>
+      </w:r>
+      <w:proofErr w:type="gramStart"/>
+      <w:r>
+        <w:rPr>
+          <w:rFonts w:ascii="Consolas" w:eastAsia="Times New Roman" w:hAnsi="Consolas" w:cs="Times New Roman"/>
+          <w:color w:val="008000"/>
+          <w:kern w:val="0"/>
+          <w:sz w:val="21"/>
+          <w:szCs w:val="21"/>
+          <w14:ligatures w14:val="none"/>
+        </w:rPr>
+        <w:t>Query(</w:t>
+      </w:r>
+      <w:proofErr w:type="gramEnd"/>
+      <w:r>
+        <w:rPr>
+          <w:rFonts w:ascii="Consolas" w:eastAsia="Times New Roman" w:hAnsi="Consolas" w:cs="Times New Roman"/>
+          <w:color w:val="008000"/>
+          <w:kern w:val="0"/>
+          <w:sz w:val="21"/>
+          <w:szCs w:val="21"/>
+          <w14:ligatures w14:val="none"/>
+        </w:rPr>
+        <w:t xml:space="preserve">value = "select * from products p where </w:t>
+      </w:r>
+      <w:proofErr w:type="spellStart"/>
+      <w:proofErr w:type="gramStart"/>
+      <w:r>
+        <w:rPr>
+          <w:rFonts w:ascii="Consolas" w:eastAsia="Times New Roman" w:hAnsi="Consolas" w:cs="Times New Roman"/>
+          <w:color w:val="008000"/>
+          <w:kern w:val="0"/>
+          <w:sz w:val="21"/>
+          <w:szCs w:val="21"/>
+          <w14:ligatures w14:val="none"/>
+        </w:rPr>
+        <w:t>p.price</w:t>
+      </w:r>
+      <w:proofErr w:type="spellEnd"/>
+      <w:proofErr w:type="gramEnd"/>
+      <w:r>
+        <w:rPr>
+          <w:rFonts w:ascii="Consolas" w:eastAsia="Times New Roman" w:hAnsi="Consolas" w:cs="Times New Roman"/>
+          <w:color w:val="008000"/>
+          <w:kern w:val="0"/>
+          <w:sz w:val="21"/>
+          <w:szCs w:val="21"/>
+          <w14:ligatures w14:val="none"/>
+        </w:rPr>
+        <w:t xml:space="preserve"> </w:t>
+      </w:r>
+      <w:proofErr w:type="gramStart"/>
+      <w:r>
+        <w:rPr>
+          <w:rFonts w:ascii="Consolas" w:eastAsia="Times New Roman" w:hAnsi="Consolas" w:cs="Times New Roman"/>
+          <w:color w:val="008000"/>
+          <w:kern w:val="0"/>
+          <w:sz w:val="21"/>
+          <w:szCs w:val="21"/>
+          <w14:ligatures w14:val="none"/>
+        </w:rPr>
+        <w:t>between :min</w:t>
+      </w:r>
+      <w:proofErr w:type="gramEnd"/>
+      <w:r>
+        <w:rPr>
+          <w:rFonts w:ascii="Consolas" w:eastAsia="Times New Roman" w:hAnsi="Consolas" w:cs="Times New Roman"/>
+          <w:color w:val="008000"/>
+          <w:kern w:val="0"/>
+          <w:sz w:val="21"/>
+          <w:szCs w:val="21"/>
+          <w14:ligatures w14:val="none"/>
+        </w:rPr>
+        <w:t xml:space="preserve"> </w:t>
+      </w:r>
+      <w:proofErr w:type="gramStart"/>
+      <w:r>
+        <w:rPr>
+          <w:rFonts w:ascii="Consolas" w:eastAsia="Times New Roman" w:hAnsi="Consolas" w:cs="Times New Roman"/>
+          <w:color w:val="008000"/>
+          <w:kern w:val="0"/>
+          <w:sz w:val="21"/>
+          <w:szCs w:val="21"/>
+          <w14:ligatures w14:val="none"/>
+        </w:rPr>
+        <w:t>and :max</w:t>
+      </w:r>
+      <w:proofErr w:type="gramEnd"/>
+      <w:r>
+        <w:rPr>
+          <w:rFonts w:ascii="Consolas" w:eastAsia="Times New Roman" w:hAnsi="Consolas" w:cs="Times New Roman"/>
+          <w:color w:val="008000"/>
+          <w:kern w:val="0"/>
+          <w:sz w:val="21"/>
+          <w:szCs w:val="21"/>
+          <w14:ligatures w14:val="none"/>
+        </w:rPr>
+        <w:t xml:space="preserve"> order by p.name", </w:t>
+      </w:r>
+      <w:proofErr w:type="spellStart"/>
+      <w:r>
+        <w:rPr>
+          <w:rFonts w:ascii="Consolas" w:eastAsia="Times New Roman" w:hAnsi="Consolas" w:cs="Times New Roman"/>
+          <w:color w:val="008000"/>
+          <w:kern w:val="0"/>
+          <w:sz w:val="21"/>
+          <w:szCs w:val="21"/>
+          <w14:ligatures w14:val="none"/>
+        </w:rPr>
+        <w:t>nativeQuery</w:t>
+      </w:r>
+      <w:proofErr w:type="spellEnd"/>
+      <w:r>
+        <w:rPr>
+          <w:rFonts w:ascii="Consolas" w:eastAsia="Times New Roman" w:hAnsi="Consolas" w:cs="Times New Roman"/>
+          <w:color w:val="008000"/>
+          <w:kern w:val="0"/>
+          <w:sz w:val="21"/>
+          <w:szCs w:val="21"/>
+          <w14:ligatures w14:val="none"/>
+        </w:rPr>
+        <w:t xml:space="preserve"> = true)</w:t>
+      </w:r>
+    </w:p>
+    <w:p>
+      <w:pPr>
+        <w:shd w:val="clear" w:color="auto" w:fill="FFFFFF"/>
+        <w:spacing w:after="0" w:line="285" w:lineRule="atLeast"/>
+        <w:rPr>
+          <w:rFonts w:ascii="Consolas" w:eastAsia="Times New Roman" w:hAnsi="Consolas" w:cs="Times New Roman"/>
+          <w:color w:val="3B3B3B"/>
+          <w:kern w:val="0"/>
+          <w:sz w:val="21"/>
+          <w:szCs w:val="21"/>
+          <w14:ligatures w14:val="none"/>
+        </w:rPr>
+      </w:pPr>
+      <w:r>
+        <w:rPr>
+          <w:rFonts w:ascii="Consolas" w:eastAsia="Times New Roman" w:hAnsi="Consolas" w:cs="Times New Roman"/>
+          <w:color w:val="3B3B3B"/>
+          <w:kern w:val="0"/>
+          <w:sz w:val="21"/>
+          <w:szCs w:val="21"/>
+          <w14:ligatures w14:val="none"/>
+        </w:rPr>
+        <w:t xml:space="preserve">    </w:t>
+      </w:r>
+    </w:p>
+    <w:p>
+      <w:pPr>
+        <w:shd w:val="clear" w:color="auto" w:fill="FFFFFF"/>
+        <w:spacing w:after="0" w:line="285" w:lineRule="atLeast"/>
+        <w:rPr>
+          <w:rFonts w:ascii="Consolas" w:eastAsia="Times New Roman" w:hAnsi="Consolas" w:cs="Times New Roman"/>
+          <w:color w:val="3B3B3B"/>
+          <w:kern w:val="0"/>
+          <w:sz w:val="21"/>
+          <w:szCs w:val="21"/>
+          <w14:ligatures w14:val="none"/>
+        </w:rPr>
+      </w:pPr>
+      <w:r>
+        <w:rPr>
+          <w:rFonts w:ascii="Consolas" w:eastAsia="Times New Roman" w:hAnsi="Consolas" w:cs="Times New Roman"/>
+          <w:color w:val="3B3B3B"/>
+          <w:kern w:val="0"/>
+          <w:sz w:val="21"/>
+          <w:szCs w:val="21"/>
+          <w14:ligatures w14:val="none"/>
+        </w:rPr>
+        <w:t xml:space="preserve">    </w:t>
+      </w:r>
+      <w:r>
+        <w:rPr>
+          <w:rFonts w:ascii="Consolas" w:eastAsia="Times New Roman" w:hAnsi="Consolas" w:cs="Times New Roman"/>
+          <w:color w:val="008000"/>
+          <w:kern w:val="0"/>
+          <w:sz w:val="21"/>
+          <w:szCs w:val="21"/>
+          <w14:ligatures w14:val="none"/>
+        </w:rPr>
+        <w:t>// JPQL</w:t>
+      </w:r>
+    </w:p>
+    <w:p>
+      <w:pPr>
+        <w:shd w:val="clear" w:color="auto" w:fill="FFFFFF"/>
+        <w:spacing w:after="0" w:line="285" w:lineRule="atLeast"/>
+        <w:rPr>
+          <w:rFonts w:ascii="Consolas" w:eastAsia="Times New Roman" w:hAnsi="Consolas" w:cs="Times New Roman"/>
+          <w:color w:val="3B3B3B"/>
+          <w:kern w:val="0"/>
+          <w:sz w:val="21"/>
+          <w:szCs w:val="21"/>
+          <w14:ligatures w14:val="none"/>
+        </w:rPr>
+      </w:pPr>
+      <w:r>
+        <w:rPr>
+          <w:rFonts w:ascii="Consolas" w:eastAsia="Times New Roman" w:hAnsi="Consolas" w:cs="Times New Roman"/>
+          <w:color w:val="3B3B3B"/>
+          <w:kern w:val="0"/>
+          <w:sz w:val="21"/>
+          <w:szCs w:val="21"/>
+          <w14:ligatures w14:val="none"/>
+        </w:rPr>
+        <w:t>    @</w:t>
+      </w:r>
+      <w:proofErr w:type="gramStart"/>
+      <w:r>
+        <w:rPr>
+          <w:rFonts w:ascii="Consolas" w:eastAsia="Times New Roman" w:hAnsi="Consolas" w:cs="Times New Roman"/>
+          <w:color w:val="267F99"/>
+          <w:kern w:val="0"/>
+          <w:sz w:val="21"/>
+          <w:szCs w:val="21"/>
+          <w14:ligatures w14:val="none"/>
+        </w:rPr>
+        <w:t>Query</w:t>
+      </w:r>
+      <w:r>
+        <w:rPr>
+          <w:rFonts w:ascii="Consolas" w:eastAsia="Times New Roman" w:hAnsi="Consolas" w:cs="Times New Roman"/>
+          <w:color w:val="3B3B3B"/>
+          <w:kern w:val="0"/>
+          <w:sz w:val="21"/>
+          <w:szCs w:val="21"/>
+          <w14:ligatures w14:val="none"/>
+        </w:rPr>
+        <w:t>(</w:t>
+      </w:r>
+      <w:proofErr w:type="gramEnd"/>
+      <w:r>
+        <w:rPr>
+          <w:rFonts w:ascii="Consolas" w:eastAsia="Times New Roman" w:hAnsi="Consolas" w:cs="Times New Roman"/>
+          <w:color w:val="A31515"/>
+          <w:kern w:val="0"/>
+          <w:sz w:val="21"/>
+          <w:szCs w:val="21"/>
+          <w14:ligatures w14:val="none"/>
+        </w:rPr>
+        <w:t>"</w:t>
+      </w:r>
+      <w:r>
+        <w:rPr>
+          <w:rFonts w:ascii="Consolas" w:eastAsia="Times New Roman" w:hAnsi="Consolas" w:cs="Times New Roman"/>
+          <w:color w:val="AF00DB"/>
+          <w:kern w:val="0"/>
+          <w:sz w:val="21"/>
+          <w:szCs w:val="21"/>
+          <w14:ligatures w14:val="none"/>
+        </w:rPr>
+        <w:t>select</w:t>
+      </w:r>
+      <w:r>
+        <w:rPr>
+          <w:rFonts w:ascii="Consolas" w:eastAsia="Times New Roman" w:hAnsi="Consolas" w:cs="Times New Roman"/>
+          <w:color w:val="A31515"/>
+          <w:kern w:val="0"/>
+          <w:sz w:val="21"/>
+          <w:szCs w:val="21"/>
+          <w14:ligatures w14:val="none"/>
+        </w:rPr>
+        <w:t xml:space="preserve"> </w:t>
+      </w:r>
+      <w:r>
+        <w:rPr>
+          <w:rFonts w:ascii="Consolas" w:eastAsia="Times New Roman" w:hAnsi="Consolas" w:cs="Times New Roman"/>
+          <w:color w:val="001080"/>
+          <w:kern w:val="0"/>
+          <w:sz w:val="21"/>
+          <w:szCs w:val="21"/>
+          <w14:ligatures w14:val="none"/>
+        </w:rPr>
+        <w:t>p</w:t>
+      </w:r>
+      <w:r>
+        <w:rPr>
+          <w:rFonts w:ascii="Consolas" w:eastAsia="Times New Roman" w:hAnsi="Consolas" w:cs="Times New Roman"/>
+          <w:color w:val="A31515"/>
+          <w:kern w:val="0"/>
+          <w:sz w:val="21"/>
+          <w:szCs w:val="21"/>
+          <w14:ligatures w14:val="none"/>
+        </w:rPr>
+        <w:t xml:space="preserve"> </w:t>
+      </w:r>
+      <w:r>
+        <w:rPr>
+          <w:rFonts w:ascii="Consolas" w:eastAsia="Times New Roman" w:hAnsi="Consolas" w:cs="Times New Roman"/>
+          <w:color w:val="AF00DB"/>
+          <w:kern w:val="0"/>
+          <w:sz w:val="21"/>
+          <w:szCs w:val="21"/>
+          <w14:ligatures w14:val="none"/>
+        </w:rPr>
+        <w:t>from</w:t>
+      </w:r>
+      <w:r>
+        <w:rPr>
+          <w:rFonts w:ascii="Consolas" w:eastAsia="Times New Roman" w:hAnsi="Consolas" w:cs="Times New Roman"/>
+          <w:color w:val="A31515"/>
+          <w:kern w:val="0"/>
+          <w:sz w:val="21"/>
+          <w:szCs w:val="21"/>
+          <w14:ligatures w14:val="none"/>
+        </w:rPr>
+        <w:t xml:space="preserve"> </w:t>
+      </w:r>
+      <w:r>
+        <w:rPr>
+          <w:rFonts w:ascii="Consolas" w:eastAsia="Times New Roman" w:hAnsi="Consolas" w:cs="Times New Roman"/>
+          <w:color w:val="267F99"/>
+          <w:kern w:val="0"/>
+          <w:sz w:val="21"/>
+          <w:szCs w:val="21"/>
+          <w14:ligatures w14:val="none"/>
+        </w:rPr>
+        <w:t>Product</w:t>
+      </w:r>
+      <w:r>
+        <w:rPr>
+          <w:rFonts w:ascii="Consolas" w:eastAsia="Times New Roman" w:hAnsi="Consolas" w:cs="Times New Roman"/>
+          <w:color w:val="A31515"/>
+          <w:kern w:val="0"/>
+          <w:sz w:val="21"/>
+          <w:szCs w:val="21"/>
+          <w14:ligatures w14:val="none"/>
+        </w:rPr>
+        <w:t xml:space="preserve"> </w:t>
+      </w:r>
+      <w:r>
+        <w:rPr>
+          <w:rFonts w:ascii="Consolas" w:eastAsia="Times New Roman" w:hAnsi="Consolas" w:cs="Times New Roman"/>
+          <w:color w:val="001080"/>
+          <w:kern w:val="0"/>
+          <w:sz w:val="21"/>
+          <w:szCs w:val="21"/>
+          <w14:ligatures w14:val="none"/>
+        </w:rPr>
+        <w:t>p</w:t>
+      </w:r>
+      <w:r>
+        <w:rPr>
+          <w:rFonts w:ascii="Consolas" w:eastAsia="Times New Roman" w:hAnsi="Consolas" w:cs="Times New Roman"/>
+          <w:color w:val="A31515"/>
+          <w:kern w:val="0"/>
+          <w:sz w:val="21"/>
+          <w:szCs w:val="21"/>
+          <w14:ligatures w14:val="none"/>
+        </w:rPr>
+        <w:t xml:space="preserve"> </w:t>
+      </w:r>
+      <w:r>
+        <w:rPr>
+          <w:rFonts w:ascii="Consolas" w:eastAsia="Times New Roman" w:hAnsi="Consolas" w:cs="Times New Roman"/>
+          <w:color w:val="AF00DB"/>
+          <w:kern w:val="0"/>
+          <w:sz w:val="21"/>
+          <w:szCs w:val="21"/>
+          <w14:ligatures w14:val="none"/>
+        </w:rPr>
+        <w:t>where</w:t>
+      </w:r>
+      <w:r>
+        <w:rPr>
+          <w:rFonts w:ascii="Consolas" w:eastAsia="Times New Roman" w:hAnsi="Consolas" w:cs="Times New Roman"/>
+          <w:color w:val="A31515"/>
+          <w:kern w:val="0"/>
+          <w:sz w:val="21"/>
+          <w:szCs w:val="21"/>
+          <w14:ligatures w14:val="none"/>
+        </w:rPr>
+        <w:t xml:space="preserve"> </w:t>
+      </w:r>
+      <w:proofErr w:type="spellStart"/>
+      <w:proofErr w:type="gramStart"/>
+      <w:r>
+        <w:rPr>
+          <w:rFonts w:ascii="Consolas" w:eastAsia="Times New Roman" w:hAnsi="Consolas" w:cs="Times New Roman"/>
+          <w:color w:val="001080"/>
+          <w:kern w:val="0"/>
+          <w:sz w:val="21"/>
+          <w:szCs w:val="21"/>
+          <w14:ligatures w14:val="none"/>
+        </w:rPr>
+        <w:t>p</w:t>
+      </w:r>
+      <w:r>
+        <w:rPr>
+          <w:rFonts w:ascii="Consolas" w:eastAsia="Times New Roman" w:hAnsi="Consolas" w:cs="Times New Roman"/>
+          <w:color w:val="000000"/>
+          <w:kern w:val="0"/>
+          <w:sz w:val="21"/>
+          <w:szCs w:val="21"/>
+          <w14:ligatures w14:val="none"/>
+        </w:rPr>
+        <w:t>.</w:t>
+      </w:r>
+      <w:r>
+        <w:rPr>
+          <w:rFonts w:ascii="Consolas" w:eastAsia="Times New Roman" w:hAnsi="Consolas" w:cs="Times New Roman"/>
+          <w:color w:val="001080"/>
+          <w:kern w:val="0"/>
+          <w:sz w:val="21"/>
+          <w:szCs w:val="21"/>
+          <w14:ligatures w14:val="none"/>
+        </w:rPr>
+        <w:t>price</w:t>
+      </w:r>
+      <w:proofErr w:type="spellEnd"/>
+      <w:proofErr w:type="gramEnd"/>
+      <w:r>
+        <w:rPr>
+          <w:rFonts w:ascii="Consolas" w:eastAsia="Times New Roman" w:hAnsi="Consolas" w:cs="Times New Roman"/>
+          <w:color w:val="A31515"/>
+          <w:kern w:val="0"/>
+          <w:sz w:val="21"/>
+          <w:szCs w:val="21"/>
+          <w14:ligatures w14:val="none"/>
+        </w:rPr>
+        <w:t xml:space="preserve"> </w:t>
+      </w:r>
+      <w:proofErr w:type="gramStart"/>
+      <w:r>
+        <w:rPr>
+          <w:rFonts w:ascii="Consolas" w:eastAsia="Times New Roman" w:hAnsi="Consolas" w:cs="Times New Roman"/>
+          <w:color w:val="AF00DB"/>
+          <w:kern w:val="0"/>
+          <w:sz w:val="21"/>
+          <w:szCs w:val="21"/>
+          <w14:ligatures w14:val="none"/>
+        </w:rPr>
+        <w:t>between</w:t>
+      </w:r>
+      <w:r>
+        <w:rPr>
+          <w:rFonts w:ascii="Consolas" w:eastAsia="Times New Roman" w:hAnsi="Consolas" w:cs="Times New Roman"/>
+          <w:color w:val="A31515"/>
+          <w:kern w:val="0"/>
+          <w:sz w:val="21"/>
+          <w:szCs w:val="21"/>
+          <w14:ligatures w14:val="none"/>
+        </w:rPr>
+        <w:t xml:space="preserve"> </w:t>
+      </w:r>
+      <w:r>
+        <w:rPr>
+          <w:rFonts w:ascii="Consolas" w:eastAsia="Times New Roman" w:hAnsi="Consolas" w:cs="Times New Roman"/>
+          <w:color w:val="000000"/>
+          <w:kern w:val="0"/>
+          <w:sz w:val="21"/>
+          <w:szCs w:val="21"/>
+          <w14:ligatures w14:val="none"/>
+        </w:rPr>
+        <w:t>:</w:t>
+      </w:r>
+      <w:r>
+        <w:rPr>
+          <w:rFonts w:ascii="Consolas" w:eastAsia="Times New Roman" w:hAnsi="Consolas" w:cs="Times New Roman"/>
+          <w:color w:val="001080"/>
+          <w:kern w:val="0"/>
+          <w:sz w:val="21"/>
+          <w:szCs w:val="21"/>
+          <w14:ligatures w14:val="none"/>
+        </w:rPr>
+        <w:t>min</w:t>
+      </w:r>
+      <w:proofErr w:type="gramEnd"/>
+      <w:r>
+        <w:rPr>
+          <w:rFonts w:ascii="Consolas" w:eastAsia="Times New Roman" w:hAnsi="Consolas" w:cs="Times New Roman"/>
+          <w:color w:val="A31515"/>
+          <w:kern w:val="0"/>
+          <w:sz w:val="21"/>
+          <w:szCs w:val="21"/>
+          <w14:ligatures w14:val="none"/>
+        </w:rPr>
+        <w:t xml:space="preserve"> </w:t>
+      </w:r>
+      <w:proofErr w:type="gramStart"/>
+      <w:r>
+        <w:rPr>
+          <w:rFonts w:ascii="Consolas" w:eastAsia="Times New Roman" w:hAnsi="Consolas" w:cs="Times New Roman"/>
+          <w:color w:val="AF00DB"/>
+          <w:kern w:val="0"/>
+          <w:sz w:val="21"/>
+          <w:szCs w:val="21"/>
+          <w14:ligatures w14:val="none"/>
+        </w:rPr>
+        <w:t>and</w:t>
+      </w:r>
+      <w:r>
+        <w:rPr>
+          <w:rFonts w:ascii="Consolas" w:eastAsia="Times New Roman" w:hAnsi="Consolas" w:cs="Times New Roman"/>
+          <w:color w:val="A31515"/>
+          <w:kern w:val="0"/>
+          <w:sz w:val="21"/>
+          <w:szCs w:val="21"/>
+          <w14:ligatures w14:val="none"/>
+        </w:rPr>
+        <w:t xml:space="preserve"> </w:t>
+      </w:r>
+      <w:r>
+        <w:rPr>
+          <w:rFonts w:ascii="Consolas" w:eastAsia="Times New Roman" w:hAnsi="Consolas" w:cs="Times New Roman"/>
+          <w:color w:val="000000"/>
+          <w:kern w:val="0"/>
+          <w:sz w:val="21"/>
+          <w:szCs w:val="21"/>
+          <w14:ligatures w14:val="none"/>
+        </w:rPr>
+        <w:t>:</w:t>
+      </w:r>
+      <w:r>
+        <w:rPr>
+          <w:rFonts w:ascii="Consolas" w:eastAsia="Times New Roman" w:hAnsi="Consolas" w:cs="Times New Roman"/>
+          <w:color w:val="001080"/>
+          <w:kern w:val="0"/>
+          <w:sz w:val="21"/>
+          <w:szCs w:val="21"/>
+          <w14:ligatures w14:val="none"/>
+        </w:rPr>
+        <w:t>max</w:t>
+      </w:r>
+      <w:proofErr w:type="gramEnd"/>
+      <w:r>
+        <w:rPr>
+          <w:rFonts w:ascii="Consolas" w:eastAsia="Times New Roman" w:hAnsi="Consolas" w:cs="Times New Roman"/>
+          <w:color w:val="A31515"/>
+          <w:kern w:val="0"/>
+          <w:sz w:val="21"/>
+          <w:szCs w:val="21"/>
+          <w14:ligatures w14:val="none"/>
+        </w:rPr>
+        <w:t xml:space="preserve"> </w:t>
+      </w:r>
+      <w:r>
+        <w:rPr>
+          <w:rFonts w:ascii="Consolas" w:eastAsia="Times New Roman" w:hAnsi="Consolas" w:cs="Times New Roman"/>
+          <w:color w:val="AF00DB"/>
+          <w:kern w:val="0"/>
+          <w:sz w:val="21"/>
+          <w:szCs w:val="21"/>
+          <w14:ligatures w14:val="none"/>
+        </w:rPr>
+        <w:t>order</w:t>
+      </w:r>
+      <w:r>
+        <w:rPr>
+          <w:rFonts w:ascii="Consolas" w:eastAsia="Times New Roman" w:hAnsi="Consolas" w:cs="Times New Roman"/>
+          <w:color w:val="A31515"/>
+          <w:kern w:val="0"/>
+          <w:sz w:val="21"/>
+          <w:szCs w:val="21"/>
+          <w14:ligatures w14:val="none"/>
+        </w:rPr>
+        <w:t xml:space="preserve"> </w:t>
+      </w:r>
+      <w:r>
+        <w:rPr>
+          <w:rFonts w:ascii="Consolas" w:eastAsia="Times New Roman" w:hAnsi="Consolas" w:cs="Times New Roman"/>
+          <w:color w:val="AF00DB"/>
+          <w:kern w:val="0"/>
+          <w:sz w:val="21"/>
+          <w:szCs w:val="21"/>
+          <w14:ligatures w14:val="none"/>
+        </w:rPr>
+        <w:t>by</w:t>
+      </w:r>
+      <w:r>
+        <w:rPr>
+          <w:rFonts w:ascii="Consolas" w:eastAsia="Times New Roman" w:hAnsi="Consolas" w:cs="Times New Roman"/>
+          <w:color w:val="A31515"/>
+          <w:kern w:val="0"/>
+          <w:sz w:val="21"/>
+          <w:szCs w:val="21"/>
+          <w14:ligatures w14:val="none"/>
+        </w:rPr>
+        <w:t xml:space="preserve"> </w:t>
+      </w:r>
+      <w:r>
+        <w:rPr>
+          <w:rFonts w:ascii="Consolas" w:eastAsia="Times New Roman" w:hAnsi="Consolas" w:cs="Times New Roman"/>
+          <w:color w:val="001080"/>
+          <w:kern w:val="0"/>
+          <w:sz w:val="21"/>
+          <w:szCs w:val="21"/>
+          <w14:ligatures w14:val="none"/>
+        </w:rPr>
+        <w:t>p</w:t>
+      </w:r>
+      <w:r>
+        <w:rPr>
+          <w:rFonts w:ascii="Consolas" w:eastAsia="Times New Roman" w:hAnsi="Consolas" w:cs="Times New Roman"/>
+          <w:color w:val="000000"/>
+          <w:kern w:val="0"/>
+          <w:sz w:val="21"/>
+          <w:szCs w:val="21"/>
+          <w14:ligatures w14:val="none"/>
+        </w:rPr>
+        <w:t>.</w:t>
+      </w:r>
+      <w:r>
+        <w:rPr>
+          <w:rFonts w:ascii="Consolas" w:eastAsia="Times New Roman" w:hAnsi="Consolas" w:cs="Times New Roman"/>
+          <w:color w:val="001080"/>
+          <w:kern w:val="0"/>
+          <w:sz w:val="21"/>
+          <w:szCs w:val="21"/>
+          <w14:ligatures w14:val="none"/>
+        </w:rPr>
+        <w:t>name</w:t>
+      </w:r>
+      <w:r>
+        <w:rPr>
+          <w:rFonts w:ascii="Consolas" w:eastAsia="Times New Roman" w:hAnsi="Consolas" w:cs="Times New Roman"/>
+          <w:color w:val="A31515"/>
+          <w:kern w:val="0"/>
+          <w:sz w:val="21"/>
+          <w:szCs w:val="21"/>
+          <w14:ligatures w14:val="none"/>
+        </w:rPr>
+        <w:t>"</w:t>
+      </w:r>
+      <w:r>
+        <w:rPr>
+          <w:rFonts w:ascii="Consolas" w:eastAsia="Times New Roman" w:hAnsi="Consolas" w:cs="Times New Roman"/>
+          <w:color w:val="3B3B3B"/>
+          <w:kern w:val="0"/>
+          <w:sz w:val="21"/>
+          <w:szCs w:val="21"/>
+          <w14:ligatures w14:val="none"/>
+        </w:rPr>
+        <w:t>)</w:t>
+      </w:r>
+    </w:p>
+    <w:p>
+      <w:pPr>
+        <w:shd w:val="clear" w:color="auto" w:fill="FFFFFF"/>
+        <w:spacing w:after="0" w:line="285" w:lineRule="atLeast"/>
+        <w:rPr>
+          <w:rFonts w:ascii="Consolas" w:eastAsia="Times New Roman" w:hAnsi="Consolas" w:cs="Times New Roman"/>
+          <w:color w:val="3B3B3B"/>
+          <w:kern w:val="0"/>
+          <w:sz w:val="21"/>
+          <w:szCs w:val="21"/>
+          <w14:ligatures w14:val="none"/>
+        </w:rPr>
+      </w:pPr>
+      <w:r>
+        <w:rPr>
+          <w:rFonts w:ascii="Consolas" w:eastAsia="Times New Roman" w:hAnsi="Consolas" w:cs="Times New Roman"/>
+          <w:color w:val="3B3B3B"/>
+          <w:kern w:val="0"/>
+          <w:sz w:val="21"/>
+          <w:szCs w:val="21"/>
+          <w14:ligatures w14:val="none"/>
+        </w:rPr>
+        <w:t xml:space="preserve">    </w:t>
+      </w:r>
+      <w:r>
+        <w:rPr>
+          <w:rFonts w:ascii="Consolas" w:eastAsia="Times New Roman" w:hAnsi="Consolas" w:cs="Times New Roman"/>
+          <w:color w:val="267F99"/>
+          <w:kern w:val="0"/>
+          <w:sz w:val="21"/>
+          <w:szCs w:val="21"/>
+          <w14:ligatures w14:val="none"/>
+        </w:rPr>
+        <w:t>List</w:t>
+      </w:r>
+      <w:r>
+        <w:rPr>
+          <w:rFonts w:ascii="Consolas" w:eastAsia="Times New Roman" w:hAnsi="Consolas" w:cs="Times New Roman"/>
+          <w:color w:val="3B3B3B"/>
+          <w:kern w:val="0"/>
+          <w:sz w:val="21"/>
+          <w:szCs w:val="21"/>
+          <w14:ligatures w14:val="none"/>
+        </w:rPr>
+        <w:t>&lt;</w:t>
+      </w:r>
+      <w:r>
+        <w:rPr>
+          <w:rFonts w:ascii="Consolas" w:eastAsia="Times New Roman" w:hAnsi="Consolas" w:cs="Times New Roman"/>
+          <w:color w:val="267F99"/>
+          <w:kern w:val="0"/>
+          <w:sz w:val="21"/>
+          <w:szCs w:val="21"/>
+          <w14:ligatures w14:val="none"/>
+        </w:rPr>
+        <w:t>Product</w:t>
+      </w:r>
+      <w:r>
+        <w:rPr>
+          <w:rFonts w:ascii="Consolas" w:eastAsia="Times New Roman" w:hAnsi="Consolas" w:cs="Times New Roman"/>
+          <w:color w:val="3B3B3B"/>
+          <w:kern w:val="0"/>
+          <w:sz w:val="21"/>
+          <w:szCs w:val="21"/>
+          <w14:ligatures w14:val="none"/>
+        </w:rPr>
+        <w:t xml:space="preserve">&gt; </w:t>
+      </w:r>
+      <w:proofErr w:type="spellStart"/>
+      <w:r>
+        <w:rPr>
+          <w:rFonts w:ascii="Consolas" w:eastAsia="Times New Roman" w:hAnsi="Consolas" w:cs="Times New Roman"/>
+          <w:color w:val="795E26"/>
+          <w:kern w:val="0"/>
+          <w:sz w:val="21"/>
+          <w:szCs w:val="21"/>
+          <w14:ligatures w14:val="none"/>
+        </w:rPr>
+        <w:t>findProducts</w:t>
+      </w:r>
+      <w:proofErr w:type="spellEnd"/>
+      <w:r>
+        <w:rPr>
+          <w:rFonts w:ascii="Consolas" w:eastAsia="Times New Roman" w:hAnsi="Consolas" w:cs="Times New Roman"/>
+          <w:color w:val="3B3B3B"/>
+          <w:kern w:val="0"/>
+          <w:sz w:val="21"/>
+          <w:szCs w:val="21"/>
+          <w14:ligatures w14:val="none"/>
+        </w:rPr>
+        <w:t>(@</w:t>
+      </w:r>
+      <w:r>
+        <w:rPr>
+          <w:rFonts w:ascii="Consolas" w:eastAsia="Times New Roman" w:hAnsi="Consolas" w:cs="Times New Roman"/>
+          <w:color w:val="267F99"/>
+          <w:kern w:val="0"/>
+          <w:sz w:val="21"/>
+          <w:szCs w:val="21"/>
+          <w14:ligatures w14:val="none"/>
+        </w:rPr>
+        <w:t>Param</w:t>
+      </w:r>
+      <w:r>
+        <w:rPr>
+          <w:rFonts w:ascii="Consolas" w:eastAsia="Times New Roman" w:hAnsi="Consolas" w:cs="Times New Roman"/>
+          <w:color w:val="3B3B3B"/>
+          <w:kern w:val="0"/>
+          <w:sz w:val="21"/>
+          <w:szCs w:val="21"/>
+          <w14:ligatures w14:val="none"/>
+        </w:rPr>
+        <w:t>(</w:t>
+      </w:r>
+      <w:r>
+        <w:rPr>
+          <w:rFonts w:ascii="Consolas" w:eastAsia="Times New Roman" w:hAnsi="Consolas" w:cs="Times New Roman"/>
+          <w:color w:val="A31515"/>
+          <w:kern w:val="0"/>
+          <w:sz w:val="21"/>
+          <w:szCs w:val="21"/>
+          <w14:ligatures w14:val="none"/>
+        </w:rPr>
+        <w:t>"min"</w:t>
+      </w:r>
+      <w:r>
+        <w:rPr>
+          <w:rFonts w:ascii="Consolas" w:eastAsia="Times New Roman" w:hAnsi="Consolas" w:cs="Times New Roman"/>
+          <w:color w:val="3B3B3B"/>
+          <w:kern w:val="0"/>
+          <w:sz w:val="21"/>
+          <w:szCs w:val="21"/>
+          <w14:ligatures w14:val="none"/>
+        </w:rPr>
+        <w:t xml:space="preserve">) </w:t>
+      </w:r>
+      <w:proofErr w:type="spellStart"/>
+      <w:r>
+        <w:rPr>
+          <w:rFonts w:ascii="Consolas" w:eastAsia="Times New Roman" w:hAnsi="Consolas" w:cs="Times New Roman"/>
+          <w:color w:val="267F99"/>
+          <w:kern w:val="0"/>
+          <w:sz w:val="21"/>
+          <w:szCs w:val="21"/>
+          <w14:ligatures w14:val="none"/>
+        </w:rPr>
+        <w:t>BigDecimal</w:t>
+      </w:r>
+      <w:proofErr w:type="spellEnd"/>
+      <w:r>
+        <w:rPr>
+          <w:rFonts w:ascii="Consolas" w:eastAsia="Times New Roman" w:hAnsi="Consolas" w:cs="Times New Roman"/>
+          <w:color w:val="3B3B3B"/>
+          <w:kern w:val="0"/>
+          <w:sz w:val="21"/>
+          <w:szCs w:val="21"/>
+          <w14:ligatures w14:val="none"/>
+        </w:rPr>
+        <w:t xml:space="preserve"> </w:t>
+      </w:r>
+      <w:r>
+        <w:rPr>
+          <w:rFonts w:ascii="Consolas" w:eastAsia="Times New Roman" w:hAnsi="Consolas" w:cs="Times New Roman"/>
+          <w:color w:val="001080"/>
+          <w:kern w:val="0"/>
+          <w:sz w:val="21"/>
+          <w:szCs w:val="21"/>
+          <w14:ligatures w14:val="none"/>
+        </w:rPr>
+        <w:t>min</w:t>
+      </w:r>
+      <w:r>
+        <w:rPr>
+          <w:rFonts w:ascii="Consolas" w:eastAsia="Times New Roman" w:hAnsi="Consolas" w:cs="Times New Roman"/>
+          <w:color w:val="3B3B3B"/>
+          <w:kern w:val="0"/>
+          <w:sz w:val="21"/>
+          <w:szCs w:val="21"/>
+          <w14:ligatures w14:val="none"/>
+        </w:rPr>
+        <w:t>, @</w:t>
+      </w:r>
+      <w:r>
+        <w:rPr>
+          <w:rFonts w:ascii="Consolas" w:eastAsia="Times New Roman" w:hAnsi="Consolas" w:cs="Times New Roman"/>
+          <w:color w:val="267F99"/>
+          <w:kern w:val="0"/>
+          <w:sz w:val="21"/>
+          <w:szCs w:val="21"/>
+          <w14:ligatures w14:val="none"/>
+        </w:rPr>
+        <w:t>Param</w:t>
+      </w:r>
+      <w:r>
+        <w:rPr>
+          <w:rFonts w:ascii="Consolas" w:eastAsia="Times New Roman" w:hAnsi="Consolas" w:cs="Times New Roman"/>
+          <w:color w:val="3B3B3B"/>
+          <w:kern w:val="0"/>
+          <w:sz w:val="21"/>
+          <w:szCs w:val="21"/>
+          <w14:ligatures w14:val="none"/>
+        </w:rPr>
+        <w:t>(</w:t>
+      </w:r>
+      <w:r>
+        <w:rPr>
+          <w:rFonts w:ascii="Consolas" w:eastAsia="Times New Roman" w:hAnsi="Consolas" w:cs="Times New Roman"/>
+          <w:color w:val="A31515"/>
+          <w:kern w:val="0"/>
+          <w:sz w:val="21"/>
+          <w:szCs w:val="21"/>
+          <w14:ligatures w14:val="none"/>
+        </w:rPr>
+        <w:t>"max"</w:t>
+      </w:r>
+      <w:r>
+        <w:rPr>
+          <w:rFonts w:ascii="Consolas" w:eastAsia="Times New Roman" w:hAnsi="Consolas" w:cs="Times New Roman"/>
+          <w:color w:val="3B3B3B"/>
+          <w:kern w:val="0"/>
+          <w:sz w:val="21"/>
+          <w:szCs w:val="21"/>
+          <w14:ligatures w14:val="none"/>
+        </w:rPr>
+        <w:t xml:space="preserve">) </w:t>
+      </w:r>
+      <w:proofErr w:type="spellStart"/>
+      <w:r>
+        <w:rPr>
+          <w:rFonts w:ascii="Consolas" w:eastAsia="Times New Roman" w:hAnsi="Consolas" w:cs="Times New Roman"/>
+          <w:color w:val="267F99"/>
+          <w:kern w:val="0"/>
+          <w:sz w:val="21"/>
+          <w:szCs w:val="21"/>
+          <w14:ligatures w14:val="none"/>
+        </w:rPr>
+        <w:t>BigDecimal</w:t>
+      </w:r>
+      <w:proofErr w:type="spellEnd"/>
+      <w:r>
+        <w:rPr>
+          <w:rFonts w:ascii="Consolas" w:eastAsia="Times New Roman" w:hAnsi="Consolas" w:cs="Times New Roman"/>
+          <w:color w:val="3B3B3B"/>
+          <w:kern w:val="0"/>
+          <w:sz w:val="21"/>
+          <w:szCs w:val="21"/>
+          <w14:ligatures w14:val="none"/>
+        </w:rPr>
+        <w:t xml:space="preserve"> </w:t>
+      </w:r>
+      <w:r>
+        <w:rPr>
+          <w:rFonts w:ascii="Consolas" w:eastAsia="Times New Roman" w:hAnsi="Consolas" w:cs="Times New Roman"/>
+          <w:color w:val="001080"/>
+          <w:kern w:val="0"/>
+          <w:sz w:val="21"/>
+          <w:szCs w:val="21"/>
+          <w14:ligatures w14:val="none"/>
+        </w:rPr>
+        <w:t>max</w:t>
+      </w:r>
+      <w:r>
+        <w:rPr>
+          <w:rFonts w:ascii="Consolas" w:eastAsia="Times New Roman" w:hAnsi="Consolas" w:cs="Times New Roman"/>
+          <w:color w:val="3B3B3B"/>
+          <w:kern w:val="0"/>
+          <w:sz w:val="21"/>
+          <w:szCs w:val="21"/>
+          <w14:ligatures w14:val="none"/>
+        </w:rPr>
+        <w:t>);</w:t>
+      </w:r>
+    </w:p>
+    <w:p>
+      <w:pPr>
+        <w:shd w:val="clear" w:color="auto" w:fill="FFFFFF"/>
+        <w:spacing w:after="0" w:line="285" w:lineRule="atLeast"/>
+        <w:rPr>
+          <w:rFonts w:ascii="Consolas" w:eastAsia="Times New Roman" w:hAnsi="Consolas" w:cs="Times New Roman"/>
+          <w:color w:val="3B3B3B"/>
+          <w:kern w:val="0"/>
+          <w:sz w:val="21"/>
+          <w:szCs w:val="21"/>
+          <w14:ligatures w14:val="none"/>
+        </w:rPr>
+      </w:pPr>
+      <w:r>
+        <w:rPr>
+          <w:rFonts w:ascii="Consolas" w:eastAsia="Times New Roman" w:hAnsi="Consolas" w:cs="Times New Roman"/>
+          <w:color w:val="3B3B3B"/>
+          <w:kern w:val="0"/>
+          <w:sz w:val="21"/>
+          <w:szCs w:val="21"/>
+          <w14:ligatures w14:val="none"/>
+        </w:rPr>
+        <w:t>}</w:t>
+      </w:r>
+    </w:p>
+    <w:p>
+      <w:pPr>
+        <w:ind w:left="720" w:firstLine="720"/>
+      </w:pPr>
+      <w:r>
+        <w:t>===========================================</w:t>
+      </w:r>
+    </w:p>
+    <w:p>
+      <w:pPr>
+        <w:shd w:val="clear" w:color="auto" w:fill="FFFFFF"/>
+        <w:spacing w:after="0" w:line="285" w:lineRule="atLeast"/>
+        <w:rPr>
+          <w:rFonts w:ascii="Sakkal Majalla" w:eastAsia="Times New Roman" w:hAnsi="Sakkal Majalla" w:cs="Sakkal Majalla"/>
+          <w:color w:val="3B3B3B"/>
+          <w:kern w:val="0"/>
+          <w:sz w:val="28"/>
+          <w:szCs w:val="28"/>
+          <w14:ligatures w14:val="none"/>
+        </w:rPr>
+      </w:pPr>
+      <w:r>
+        <w:rPr>
+          <w:rFonts w:ascii="Sakkal Majalla" w:eastAsia="Times New Roman" w:hAnsi="Sakkal Majalla" w:cs="Sakkal Majalla"/>
+          <w:color w:val="3B3B3B"/>
+          <w:kern w:val="0"/>
+          <w:sz w:val="28"/>
+          <w:szCs w:val="28"/>
+          <w14:ligatures w14:val="none"/>
+        </w:rPr>
+        <w:t xml:space="preserve">To update the entities using the </w:t>
+      </w:r>
+      <w:r>
+        <w:rPr>
+          <w:rFonts w:ascii="Sakkal Majalla" w:eastAsia="Times New Roman" w:hAnsi="Sakkal Majalla" w:cs="Sakkal Majalla"/>
+          <w:b/>
+          <w:bCs/>
+          <w:color w:val="002060"/>
+          <w:kern w:val="0"/>
+          <w:sz w:val="28"/>
+          <w:szCs w:val="28"/>
+          <w14:ligatures w14:val="none"/>
+        </w:rPr>
+        <w:t>JPQL</w:t>
+      </w:r>
+      <w:r>
+        <w:rPr>
+          <w:rFonts w:ascii="Sakkal Majalla" w:eastAsia="Times New Roman" w:hAnsi="Sakkal Majalla" w:cs="Sakkal Majalla"/>
+          <w:b/>
+          <w:bCs/>
+          <w:color w:val="002060"/>
+          <w:kern w:val="0"/>
+          <w:sz w:val="28"/>
+          <w:szCs w:val="28"/>
+          <w14:ligatures w14:val="none"/>
+        </w:rPr>
+        <w:t>,</w:t>
+      </w:r>
+      <w:r>
+        <w:rPr>
+          <w:rFonts w:ascii="Sakkal Majalla" w:eastAsia="Times New Roman" w:hAnsi="Sakkal Majalla" w:cs="Sakkal Majalla"/>
+          <w:color w:val="002060"/>
+          <w:kern w:val="0"/>
+          <w:sz w:val="28"/>
+          <w:szCs w:val="28"/>
+          <w14:ligatures w14:val="none"/>
+        </w:rPr>
+        <w:t xml:space="preserve"> </w:t>
+      </w:r>
+      <w:r>
+        <w:rPr>
+          <w:rFonts w:ascii="Sakkal Majalla" w:eastAsia="Times New Roman" w:hAnsi="Sakkal Majalla" w:cs="Sakkal Majalla"/>
+          <w:color w:val="3B3B3B"/>
+          <w:kern w:val="0"/>
+          <w:sz w:val="28"/>
+          <w:szCs w:val="28"/>
+          <w14:ligatures w14:val="none"/>
+        </w:rPr>
+        <w:t>we should use: @</w:t>
+      </w:r>
+      <w:r>
+        <w:rPr>
+          <w:rFonts w:ascii="Sakkal Majalla" w:eastAsia="Times New Roman" w:hAnsi="Sakkal Majalla" w:cs="Sakkal Majalla"/>
+          <w:b/>
+          <w:bCs/>
+          <w:color w:val="002060"/>
+          <w:kern w:val="0"/>
+          <w:sz w:val="28"/>
+          <w:szCs w:val="28"/>
+          <w14:ligatures w14:val="none"/>
+        </w:rPr>
+        <w:t>Modifying</w:t>
+      </w:r>
+      <w:r>
+        <w:rPr>
+          <w:rFonts w:ascii="Sakkal Majalla" w:eastAsia="Times New Roman" w:hAnsi="Sakkal Majalla" w:cs="Sakkal Majalla"/>
+          <w:color w:val="3B3B3B"/>
+          <w:kern w:val="0"/>
+          <w:sz w:val="28"/>
+          <w:szCs w:val="28"/>
+          <w14:ligatures w14:val="none"/>
+        </w:rPr>
+        <w:t>-</w:t>
+      </w:r>
+      <w:r>
+        <w:rPr>
+          <w:rFonts w:ascii="Sakkal Majalla" w:eastAsia="Times New Roman" w:hAnsi="Sakkal Majalla" w:cs="Sakkal Majalla"/>
+          <w:b/>
+          <w:bCs/>
+          <w:color w:val="002060"/>
+          <w:kern w:val="0"/>
+          <w:sz w:val="28"/>
+          <w:szCs w:val="28"/>
+          <w14:ligatures w14:val="none"/>
+        </w:rPr>
+        <w:t>annotation</w:t>
+      </w:r>
+      <w:r>
+        <w:rPr>
+          <w:rFonts w:ascii="Sakkal Majalla" w:eastAsia="Times New Roman" w:hAnsi="Sakkal Majalla" w:cs="Sakkal Majalla"/>
+          <w:color w:val="3B3B3B"/>
+          <w:kern w:val="0"/>
+          <w:sz w:val="28"/>
+          <w:szCs w:val="28"/>
+          <w14:ligatures w14:val="none"/>
+        </w:rPr>
+        <w:t>.</w:t>
+      </w:r>
+    </w:p>
+    <w:p>
+      <w:pPr>
+        <w:shd w:val="clear" w:color="auto" w:fill="FFFFFF"/>
+        <w:spacing w:after="0" w:line="285" w:lineRule="atLeast"/>
+        <w:rPr>
+          <w:rFonts w:ascii="Sakkal Majalla" w:eastAsia="Times New Roman" w:hAnsi="Sakkal Majalla" w:cs="Sakkal Majalla"/>
+          <w:color w:val="3B3B3B"/>
+          <w:kern w:val="0"/>
+          <w:sz w:val="28"/>
+          <w:szCs w:val="28"/>
+          <w14:ligatures w14:val="none"/>
+        </w:rPr>
+      </w:pPr>
+      <w:r>
+        <w:rPr>
+          <w:rFonts w:ascii="Sakkal Majalla" w:eastAsia="Times New Roman" w:hAnsi="Sakkal Majalla" w:cs="Sakkal Majalla"/>
+          <w:color w:val="3B3B3B"/>
+          <w:kern w:val="0"/>
+          <w:sz w:val="28"/>
+          <w:szCs w:val="28"/>
+          <w14:ligatures w14:val="none"/>
+        </w:rPr>
+        <w:t xml:space="preserve">When we have an </w:t>
+      </w:r>
+      <w:r>
+        <w:rPr>
+          <w:rFonts w:ascii="Sakkal Majalla" w:eastAsia="Times New Roman" w:hAnsi="Sakkal Majalla" w:cs="Sakkal Majalla"/>
+          <w:b/>
+          <w:bCs/>
+          <w:color w:val="BF4E14" w:themeColor="accent2" w:themeShade="BF"/>
+          <w:kern w:val="0"/>
+          <w:sz w:val="28"/>
+          <w:szCs w:val="28"/>
+          <w14:ligatures w14:val="none"/>
+        </w:rPr>
+        <w:t>update operation</w:t>
+      </w:r>
+      <w:r>
+        <w:rPr>
+          <w:rFonts w:ascii="Sakkal Majalla" w:eastAsia="Times New Roman" w:hAnsi="Sakkal Majalla" w:cs="Sakkal Majalla"/>
+          <w:color w:val="3B3B3B"/>
+          <w:kern w:val="0"/>
+          <w:sz w:val="28"/>
+          <w:szCs w:val="28"/>
+          <w14:ligatures w14:val="none"/>
+        </w:rPr>
+        <w:t xml:space="preserve">, we should wrap the service method with </w:t>
+      </w:r>
+      <w:r>
+        <w:rPr>
+          <w:rFonts w:ascii="Sakkal Majalla" w:eastAsia="Times New Roman" w:hAnsi="Sakkal Majalla" w:cs="Sakkal Majalla"/>
+          <w:b/>
+          <w:bCs/>
+          <w:color w:val="BF4E14" w:themeColor="accent2" w:themeShade="BF"/>
+          <w:kern w:val="0"/>
+          <w:sz w:val="28"/>
+          <w:szCs w:val="28"/>
+          <w14:ligatures w14:val="none"/>
+        </w:rPr>
+        <w:t>@</w:t>
+      </w:r>
+      <w:r>
+        <w:rPr>
+          <w:rFonts w:ascii="Sakkal Majalla" w:eastAsia="Times New Roman" w:hAnsi="Sakkal Majalla" w:cs="Sakkal Majalla"/>
+          <w:b/>
+          <w:bCs/>
+          <w:color w:val="BF4E14" w:themeColor="accent2" w:themeShade="BF"/>
+          <w:kern w:val="0"/>
+          <w:sz w:val="28"/>
+          <w:szCs w:val="28"/>
+          <w14:ligatures w14:val="none"/>
+        </w:rPr>
+        <w:t>Transaction</w:t>
+      </w:r>
+      <w:r>
+        <w:rPr>
+          <w:rFonts w:ascii="Sakkal Majalla" w:eastAsia="Times New Roman" w:hAnsi="Sakkal Majalla" w:cs="Sakkal Majalla"/>
+          <w:color w:val="3B3B3B"/>
+          <w:kern w:val="0"/>
+          <w:sz w:val="28"/>
+          <w:szCs w:val="28"/>
+          <w14:ligatures w14:val="none"/>
+        </w:rPr>
+        <w:t>-</w:t>
+      </w:r>
+      <w:r>
+        <w:rPr>
+          <w:rFonts w:ascii="Sakkal Majalla" w:eastAsia="Times New Roman" w:hAnsi="Sakkal Majalla" w:cs="Sakkal Majalla"/>
+          <w:b/>
+          <w:bCs/>
+          <w:color w:val="BF4E14" w:themeColor="accent2" w:themeShade="BF"/>
+          <w:kern w:val="0"/>
+          <w:sz w:val="28"/>
+          <w:szCs w:val="28"/>
+          <w14:ligatures w14:val="none"/>
+        </w:rPr>
+        <w:t>annotation</w:t>
+      </w:r>
+      <w:r>
+        <w:rPr>
+          <w:rFonts w:ascii="Sakkal Majalla" w:eastAsia="Times New Roman" w:hAnsi="Sakkal Majalla" w:cs="Sakkal Majalla"/>
+          <w:color w:val="3B3B3B"/>
+          <w:kern w:val="0"/>
+          <w:sz w:val="28"/>
+          <w:szCs w:val="28"/>
+          <w14:ligatures w14:val="none"/>
+        </w:rPr>
+        <w:t>.</w:t>
+      </w:r>
+    </w:p>
+    <w:p>
+      <w:pPr>
+        <w:ind w:left="720" w:firstLine="720"/>
+      </w:pPr>
+      <w:r>
+        <w:t>===========================================</w:t>
+      </w:r>
+    </w:p>
+    <w:p>
+      <w:pPr>
+        <w:shd w:val="clear" w:color="auto" w:fill="FFFFFF"/>
+        <w:spacing w:after="0" w:line="285" w:lineRule="atLeast"/>
+        <w:rPr>
+          <w:rFonts w:ascii="Sakkal Majalla" w:eastAsia="Times New Roman" w:hAnsi="Sakkal Majalla" w:cs="Sakkal Majalla"/>
+          <w:color w:val="3B3B3B"/>
+          <w:kern w:val="0"/>
+          <w:sz w:val="28"/>
+          <w:szCs w:val="28"/>
+          <w14:ligatures w14:val="none"/>
+        </w:rPr>
+      </w:pPr>
+    </w:p>
+    <w:p>
+      <w:pPr>
+        <w:rPr>
+          <w:rFonts w:ascii="Sakkal Majalla" w:hAnsi="Sakkal Majalla" w:cs="Sakkal Majalla"/>
+          <w:sz w:val="28"/>
+          <w:szCs w:val="28"/>
+          <w:rtl/>
+          <w:lang w:bidi="ar-SY"/>
+        </w:rPr>
+      </w:pPr>
+    </w:p>
     <w:sectPr>
       <w:pgSz w:w="12240" w:h="15840"/>
       <w:pgMar w:top="1440" w:right="1440" w:bottom="1440" w:left="1440" w:header="720" w:footer="720" w:gutter="0"/>
@@ -5497,6 +8373,56 @@
     </w:sectPr>
   </w:body>
 </w:document>
+</file>
+
+<file path=word/endnotes.xml><?xml version="1.0" encoding="utf-8"?>
+<w:endnotes xmlns:wpc="http://schemas.microsoft.com/office/word/2010/wordprocessingCanvas" xmlns:cx="http://schemas.microsoft.com/office/drawing/2014/chartex" xmlns:cx1="http://schemas.microsoft.com/office/drawing/2015/9/8/chartex" xmlns:cx2="http://schemas.microsoft.com/office/drawing/2015/10/21/chartex" xmlns:cx3="http://schemas.microsoft.com/office/drawing/2016/5/9/chartex" xmlns:cx4="http://schemas.microsoft.com/office/drawing/2016/5/10/chartex" xmlns:cx5="http://schemas.microsoft.com/office/drawing/2016/5/11/chartex" xmlns:cx6="http://schemas.microsoft.com/office/drawing/2016/5/12/chartex" xmlns:cx7="http://schemas.microsoft.com/office/drawing/2016/5/13/chartex" xmlns:cx8="http://schemas.microsoft.com/office/drawing/2016/5/14/chartex" xmlns:mc="http://schemas.openxmlformats.org/markup-compatibility/2006" xmlns:aink="http://schemas.microsoft.com/office/drawing/2016/ink" xmlns:am3d="http://schemas.microsoft.com/office/drawing/2017/model3d" xmlns:o="urn:schemas-microsoft-com:office:office" xmlns:oel="http://schemas.microsoft.com/office/2019/extlst" xmlns:r="http://schemas.openxmlformats.org/officeDocument/2006/relationships" xmlns:m="http://schemas.openxmlformats.org/officeDocument/2006/math" xmlns:v="urn:schemas-microsoft-com:vml" xmlns:wp14="http://schemas.microsoft.com/office/word/2010/wordprocessingDrawing" xmlns:wp="http://schemas.openxmlformats.org/drawingml/2006/wordprocessingDrawing" xmlns:w10="urn:schemas-microsoft-com:office:word" xmlns:w="http://schemas.openxmlformats.org/wordprocessingml/2006/main" xmlns:w14="http://schemas.microsoft.com/office/word/2010/wordml" xmlns:w15="http://schemas.microsoft.com/office/word/2012/wordml" xmlns:w16cex="http://schemas.microsoft.com/office/word/2018/wordml/cex" xmlns:w16cid="http://schemas.microsoft.com/office/word/2016/wordml/cid" xmlns:w16="http://schemas.microsoft.com/office/word/2018/wordml" xmlns:w16du="http://schemas.microsoft.com/office/word/2023/wordml/word16du" xmlns:w16sdtdh="http://schemas.microsoft.com/office/word/2020/wordml/sdtdatahash" xmlns:w16sdtfl="http://schemas.microsoft.com/office/word/2024/wordml/sdtformatlock" xmlns:w16se="http://schemas.microsoft.com/office/word/2015/wordml/symex" xmlns:wpg="http://schemas.microsoft.com/office/word/2010/wordprocessingGroup" xmlns:wpi="http://schemas.microsoft.com/office/word/2010/wordprocessingInk" xmlns:wne="http://schemas.microsoft.com/office/word/2006/wordml" xmlns:wps="http://schemas.microsoft.com/office/word/2010/wordprocessingShape" mc:Ignorable="w14 w15 w16se w16cid w16 w16cex w16sdtdh w16sdtfl w16du wp14">
+  <w:endnote w:type="separator" w:id="-1">
+    <w:p>
+      <w:pPr>
+        <w:spacing w:after="0" w:line="240" w:lineRule="auto"/>
+      </w:pPr>
+      <w:r>
+        <w:separator/>
+      </w:r>
+    </w:p>
+  </w:endnote>
+  <w:endnote w:type="continuationSeparator" w:id="0">
+    <w:p>
+      <w:pPr>
+        <w:spacing w:after="0" w:line="240" w:lineRule="auto"/>
+      </w:pPr>
+      <w:r>
+        <w:continuationSeparator/>
+      </w:r>
+    </w:p>
+  </w:endnote>
+</w:endnotes>
+</file>
+
+<file path=word/footnotes.xml><?xml version="1.0" encoding="utf-8"?>
+<w:footnotes xmlns:wpc="http://schemas.microsoft.com/office/word/2010/wordprocessingCanvas" xmlns:cx="http://schemas.microsoft.com/office/drawing/2014/chartex" xmlns:cx1="http://schemas.microsoft.com/office/drawing/2015/9/8/chartex" xmlns:cx2="http://schemas.microsoft.com/office/drawing/2015/10/21/chartex" xmlns:cx3="http://schemas.microsoft.com/office/drawing/2016/5/9/chartex" xmlns:cx4="http://schemas.microsoft.com/office/drawing/2016/5/10/chartex" xmlns:cx5="http://schemas.microsoft.com/office/drawing/2016/5/11/chartex" xmlns:cx6="http://schemas.microsoft.com/office/drawing/2016/5/12/chartex" xmlns:cx7="http://schemas.microsoft.com/office/drawing/2016/5/13/chartex" xmlns:cx8="http://schemas.microsoft.com/office/drawing/2016/5/14/chartex" xmlns:mc="http://schemas.openxmlformats.org/markup-compatibility/2006" xmlns:aink="http://schemas.microsoft.com/office/drawing/2016/ink" xmlns:am3d="http://schemas.microsoft.com/office/drawing/2017/model3d" xmlns:o="urn:schemas-microsoft-com:office:office" xmlns:oel="http://schemas.microsoft.com/office/2019/extlst" xmlns:r="http://schemas.openxmlformats.org/officeDocument/2006/relationships" xmlns:m="http://schemas.openxmlformats.org/officeDocument/2006/math" xmlns:v="urn:schemas-microsoft-com:vml" xmlns:wp14="http://schemas.microsoft.com/office/word/2010/wordprocessingDrawing" xmlns:wp="http://schemas.openxmlformats.org/drawingml/2006/wordprocessingDrawing" xmlns:w10="urn:schemas-microsoft-com:office:word" xmlns:w="http://schemas.openxmlformats.org/wordprocessingml/2006/main" xmlns:w14="http://schemas.microsoft.com/office/word/2010/wordml" xmlns:w15="http://schemas.microsoft.com/office/word/2012/wordml" xmlns:w16cex="http://schemas.microsoft.com/office/word/2018/wordml/cex" xmlns:w16cid="http://schemas.microsoft.com/office/word/2016/wordml/cid" xmlns:w16="http://schemas.microsoft.com/office/word/2018/wordml" xmlns:w16du="http://schemas.microsoft.com/office/word/2023/wordml/word16du" xmlns:w16sdtdh="http://schemas.microsoft.com/office/word/2020/wordml/sdtdatahash" xmlns:w16sdtfl="http://schemas.microsoft.com/office/word/2024/wordml/sdtformatlock" xmlns:w16se="http://schemas.microsoft.com/office/word/2015/wordml/symex" xmlns:wpg="http://schemas.microsoft.com/office/word/2010/wordprocessingGroup" xmlns:wpi="http://schemas.microsoft.com/office/word/2010/wordprocessingInk" xmlns:wne="http://schemas.microsoft.com/office/word/2006/wordml" xmlns:wps="http://schemas.microsoft.com/office/word/2010/wordprocessingShape" mc:Ignorable="w14 w15 w16se w16cid w16 w16cex w16sdtdh w16sdtfl w16du wp14">
+  <w:footnote w:type="separator" w:id="-1">
+    <w:p>
+      <w:pPr>
+        <w:spacing w:after="0" w:line="240" w:lineRule="auto"/>
+      </w:pPr>
+      <w:r>
+        <w:separator/>
+      </w:r>
+    </w:p>
+  </w:footnote>
+  <w:footnote w:type="continuationSeparator" w:id="0">
+    <w:p>
+      <w:pPr>
+        <w:spacing w:after="0" w:line="240" w:lineRule="auto"/>
+      </w:pPr>
+      <w:r>
+        <w:continuationSeparator/>
+      </w:r>
+    </w:p>
+  </w:footnote>
+</w:footnotes>
 </file>
 
 <file path=word/styles.xml><?xml version="1.0" encoding="utf-8"?>
@@ -5899,7 +8825,7 @@
   <w:style w:type="paragraph" w:default="1" w:styleId="Normal">
     <w:name w:val="Normal"/>
     <w:qFormat/>
-    <w:rsid w:val="00E7787A"/>
+    <w:rsid w:val="00907014"/>
   </w:style>
   <w:style w:type="paragraph" w:styleId="Heading1">
     <w:name w:val="heading 1"/>
@@ -6416,6 +9342,50 @@
       <w:spacing w:val="5"/>
     </w:rPr>
   </w:style>
+  <w:style w:type="paragraph" w:styleId="Header">
+    <w:name w:val="header"/>
+    <w:basedOn w:val="Normal"/>
+    <w:link w:val="HeaderChar"/>
+    <w:uiPriority w:val="99"/>
+    <w:unhideWhenUsed/>
+    <w:rsid w:val="00B208C2"/>
+    <w:pPr>
+      <w:tabs>
+        <w:tab w:val="center" w:pos="4680"/>
+        <w:tab w:val="right" w:pos="9360"/>
+      </w:tabs>
+      <w:spacing w:after="0" w:line="240" w:lineRule="auto"/>
+    </w:pPr>
+  </w:style>
+  <w:style w:type="character" w:customStyle="1" w:styleId="HeaderChar">
+    <w:name w:val="Header Char"/>
+    <w:basedOn w:val="DefaultParagraphFont"/>
+    <w:link w:val="Header"/>
+    <w:uiPriority w:val="99"/>
+    <w:rsid w:val="00B208C2"/>
+  </w:style>
+  <w:style w:type="paragraph" w:styleId="Footer">
+    <w:name w:val="footer"/>
+    <w:basedOn w:val="Normal"/>
+    <w:link w:val="FooterChar"/>
+    <w:uiPriority w:val="99"/>
+    <w:unhideWhenUsed/>
+    <w:rsid w:val="00B208C2"/>
+    <w:pPr>
+      <w:tabs>
+        <w:tab w:val="center" w:pos="4680"/>
+        <w:tab w:val="right" w:pos="9360"/>
+      </w:tabs>
+      <w:spacing w:after="0" w:line="240" w:lineRule="auto"/>
+    </w:pPr>
+  </w:style>
+  <w:style w:type="character" w:customStyle="1" w:styleId="FooterChar">
+    <w:name w:val="Footer Char"/>
+    <w:basedOn w:val="DefaultParagraphFont"/>
+    <w:link w:val="Footer"/>
+    <w:uiPriority w:val="99"/>
+    <w:rsid w:val="00B208C2"/>
+  </w:style>
 </w:styles>
 </file>
 

</xml_diff>